<commit_message>
docs: complete section 1.4 with working hypotheses and a validation plan
Co-Authored-By: Claude Opus 5.5 <noreply@anthropic.com>
Claude-Session: https://claude.ai/code/session_01RkP9vNtLWcsuApJJdu9eVr
</commit_message>
<xml_diff>
--- a/docs/thesis/PBL_Report_Obrijan_Filip_FAF232.docx
+++ b/docs/thesis/PBL_Report_Obrijan_Filip_FAF232.docx
@@ -1067,7 +1067,7 @@
                 <w:rFonts w:ascii="Times New Roman" w:hAnsi="Times New Roman" w:cs="Times New Roman"/>
                 <w:noProof/>
               </w:rPr>
-              <w:t xml:space="preserve">1.4 Target users and preliminary feedback</w:t>
+              <w:t xml:space="preserve">1.4 Target users and needs analysis</w:t>
             </w:r>
             <w:r>
               <w:rPr>
@@ -1158,7 +1158,7 @@
                 <w:rFonts w:ascii="Times New Roman" w:hAnsi="Times New Roman" w:cs="Times New Roman"/>
                 <w:noProof/>
               </w:rPr>
-              <w:t xml:space="preserve">15</w:t>
+              <w:t xml:space="preserve">16</w:t>
             </w:r>
             <w:r>
               <w:rPr>
@@ -1214,7 +1214,7 @@
                 <w:rFonts w:ascii="Times New Roman" w:hAnsi="Times New Roman" w:cs="Times New Roman"/>
                 <w:noProof/>
               </w:rPr>
-              <w:t xml:space="preserve">16</w:t>
+              <w:t xml:space="preserve">17</w:t>
             </w:r>
             <w:r>
               <w:rPr>
@@ -1270,7 +1270,7 @@
                 <w:rFonts w:ascii="Times New Roman" w:hAnsi="Times New Roman" w:cs="Times New Roman"/>
                 <w:noProof/>
               </w:rPr>
-              <w:t xml:space="preserve">17</w:t>
+              <w:t xml:space="preserve">18</w:t>
             </w:r>
             <w:r>
               <w:rPr>
@@ -1326,7 +1326,7 @@
                 <w:rFonts w:ascii="Times New Roman" w:hAnsi="Times New Roman" w:cs="Times New Roman"/>
                 <w:noProof/>
               </w:rPr>
-              <w:t xml:space="preserve">18</w:t>
+              <w:t xml:space="preserve">19</w:t>
             </w:r>
             <w:r>
               <w:rPr>
@@ -1382,7 +1382,7 @@
                 <w:rFonts w:ascii="Times New Roman" w:hAnsi="Times New Roman" w:cs="Times New Roman"/>
                 <w:noProof/>
               </w:rPr>
-              <w:t xml:space="preserve">20</w:t>
+              <w:t xml:space="preserve">21</w:t>
             </w:r>
             <w:r>
               <w:rPr>
@@ -1438,7 +1438,7 @@
                 <w:rFonts w:ascii="Times New Roman" w:hAnsi="Times New Roman" w:cs="Times New Roman"/>
                 <w:noProof/>
               </w:rPr>
-              <w:t xml:space="preserve">20</w:t>
+              <w:t xml:space="preserve">21</w:t>
             </w:r>
             <w:r>
               <w:rPr>
@@ -1494,7 +1494,7 @@
                 <w:rFonts w:ascii="Times New Roman" w:hAnsi="Times New Roman" w:cs="Times New Roman"/>
                 <w:noProof/>
               </w:rPr>
-              <w:t xml:space="preserve">21</w:t>
+              <w:t xml:space="preserve">22</w:t>
             </w:r>
             <w:r>
               <w:rPr>
@@ -2242,7 +2242,7 @@
           <w:color w:val="000000"/>
           <w:sz w:val="24"/>
         </w:rPr>
-        <w:t>The chapter is organised as follows. Subchapter 1.1 describes the field, the participants and the current (AS-IS) process. Subchapter 1.2 formulates the problems together with their causes and consequences. Subchapter 1.3 reviews similar systems available on the market and ends with the SWOT analysis of the proposed idea. Subchapter 1.4 presents the preliminary feedback from potential users and the profiles of the target users (personas). The technical specification and the functional and non-functional requirements that follow from these findings are formulated in subchapters 1.5 and 1.6.</w:t>
+        <w:t>The chapter is organised as follows. Subchapter 1.1 describes the field, the participants and the current (AS-IS) process. Subchapter 1.2 formulates the problems together with their causes and consequences. Subchapter 1.3 reviews similar systems available on the market and ends with the SWOT analysis of the proposed idea. Subchapter 1.4 describes the target users, the working hypotheses about their needs together with the plan for validating them through interviews, and the profiles of the target users (personas). The technical specification and the functional and non-functional requirements that follow from these findings are formulated in subchapters 1.5 and 1.6.</w:t>
       </w:r>
     </w:p>
     <w:p>
@@ -6378,7 +6378,7 @@
           <w:color w:val="000000"/>
           <w:sz w:val="24"/>
         </w:rPr>
-        <w:t>1.4 Target users and preliminary feedback</w:t>
+        <w:t>1.4 Target users and needs analysis</w:t>
       </w:r>
       <w:bookmarkEnd w:id="106"/>
     </w:p>
@@ -6392,7 +6392,7 @@
           <w:color w:val="000000"/>
           <w:sz w:val="24"/>
         </w:rPr>
-        <w:t>The previous subchapters were based mostly on documents and on the analysis of other products. To check whether the assumptions match the experience of real people, preliminary feedback was collected from potential users of the platform. Two instruments were used: a short online questionnaire and semi-structured interviews of 15–20 minutes. The questions, given in Appendix B, focus on how the respondents sell or buy today, what takes them the most time and what they would expect from an online platform.</w:t>
+        <w:t>The previous subchapters were based mostly on documents and on the analysis of other products. Before the requirements are fixed, these conclusions have to be checked against the experience of the people who would actually use the platform. For this purpose, preliminary feedback is collected from potential users through two instruments: a short online questionnaire and semi-structured interviews of 15–20 minutes. The questions, given in Appendix B, focus on how the respondents sell or buy today, what takes them the most time and what they would expect from an online platform.</w:t>
       </w:r>
     </w:p>
     <w:p>
@@ -6405,7 +6405,7 @@
           <w:color w:val="000000"/>
           <w:sz w:val="24"/>
         </w:rPr>
-        <w:t>The interviews were held with representatives of the three types of users identified in subchapter 1.1: a producer, a distributor and a buyer from the HoReCa or retail segment. Table 1.6 summarises the answers in a short form.</w:t>
+        <w:t>Three respondent profiles were selected, matching the types of users identified in subchapter 1.1: a vegetable producer, a distributor and a buyer from the HoReCa or retail segment. At the time of writing, the interviews with these respondents are scheduled but have not yet taken place. For this reason, the expected answers of each profile were formulated in advance as working hypotheses, derived from the field analysis and from the problems listed in Table 1.2. Table 1.6 presents these hypotheses. They are not interview results and will be confirmed, corrected or replaced by the real answers.</w:t>
       </w:r>
     </w:p>
     <w:p>
@@ -6421,7 +6421,7 @@
           <w:color w:val="000000"/>
           <w:sz w:val="24"/>
         </w:rPr>
-        <w:t>Table 1.6 – Summary of the preliminary interviews</w:t>
+        <w:t>Table 1.6 – Working hypotheses about the needs of each respondent profile</w:t>
       </w:r>
     </w:p>
     <w:tbl>
@@ -6461,7 +6461,7 @@
                 <w:color w:val="000000"/>
                 <w:sz w:val="22"/>
               </w:rPr>
-              <w:t>Respondent</w:t>
+              <w:t>Respondent profile</w:t>
             </w:r>
           </w:p>
         </w:tc>
@@ -6484,7 +6484,7 @@
                 <w:color w:val="000000"/>
                 <w:sz w:val="22"/>
               </w:rPr>
-              <w:t>How the activity is carried out today</w:t>
+              <w:t>Expected current practice</w:t>
             </w:r>
           </w:p>
         </w:tc>
@@ -6507,7 +6507,7 @@
                 <w:color w:val="000000"/>
                 <w:sz w:val="22"/>
               </w:rPr>
-              <w:t>Main difficulties</w:t>
+              <w:t>Expected main difficulties</w:t>
             </w:r>
           </w:p>
         </w:tc>
@@ -6530,7 +6530,7 @@
                 <w:color w:val="000000"/>
                 <w:sz w:val="22"/>
               </w:rPr>
-              <w:t>Expectations from the platform</w:t>
+              <w:t>Expected needs from the platform</w:t>
             </w:r>
           </w:p>
         </w:tc>
@@ -6556,7 +6556,7 @@
                 <w:color w:val="000000"/>
                 <w:sz w:val="22"/>
               </w:rPr>
-              <w:t>R1, vegetable producer</w:t>
+              <w:t>R1, vegetable producer (10–30 ha)</w:t>
             </w:r>
           </w:p>
         </w:tc>
@@ -6576,9 +6576,8 @@
                 <w:b w:val="0"/>
                 <w:color w:val="000000"/>
                 <w:sz w:val="22"/>
-                <w:highlight w:val="yellow"/>
-              </w:rPr>
-              <w:t>[to be completed with the respondent's answers]</w:t>
+              </w:rPr>
+              <w:t>Sells most of the harvest by phone to a few regular buyers, the rest through resellers or ads on 999.md</w:t>
             </w:r>
           </w:p>
         </w:tc>
@@ -6598,9 +6597,8 @@
                 <w:b w:val="0"/>
                 <w:color w:val="000000"/>
                 <w:sz w:val="22"/>
-                <w:highlight w:val="yellow"/>
-              </w:rPr>
-              <w:t>[to be completed]</w:t>
+              </w:rPr>
+              <w:t>Too much time spent on calls in the harvest peak, last-minute cancellations, pressure on price from resellers</w:t>
             </w:r>
           </w:p>
         </w:tc>
@@ -6620,9 +6618,8 @@
                 <w:b w:val="0"/>
                 <w:color w:val="000000"/>
                 <w:sz w:val="22"/>
-                <w:highlight w:val="yellow"/>
-              </w:rPr>
-              <w:t>[to be completed]</w:t>
+              </w:rPr>
+              <w:t>Publishing an offer from the phone in a few minutes, seeing all orders in one place, notifications</w:t>
             </w:r>
           </w:p>
         </w:tc>
@@ -6668,9 +6665,8 @@
                 <w:b w:val="0"/>
                 <w:color w:val="000000"/>
                 <w:sz w:val="22"/>
-                <w:highlight w:val="yellow"/>
-              </w:rPr>
-              <w:t>[to be completed with the respondent's answers]</w:t>
+              </w:rPr>
+              <w:t>Orders weekly from 10–15 producers by phone and Viber, keeps the orders in an Excel file</w:t>
             </w:r>
           </w:p>
         </w:tc>
@@ -6690,9 +6686,8 @@
                 <w:b w:val="0"/>
                 <w:color w:val="000000"/>
                 <w:sz w:val="22"/>
-                <w:highlight w:val="yellow"/>
-              </w:rPr>
-              <w:t>[to be completed]</w:t>
+              </w:rPr>
+              <w:t>Does not know the real availability before calling, has to call several producers to complete one order</w:t>
             </w:r>
           </w:p>
         </w:tc>
@@ -6712,9 +6707,8 @@
                 <w:b w:val="0"/>
                 <w:color w:val="000000"/>
                 <w:sz w:val="22"/>
-                <w:highlight w:val="yellow"/>
-              </w:rPr>
-              <w:t>[to be completed]</w:t>
+              </w:rPr>
+              <w:t>Search by product and region, real stock on each listing, order history, reviews of suppliers</w:t>
             </w:r>
           </w:p>
         </w:tc>
@@ -6760,9 +6754,8 @@
                 <w:b w:val="0"/>
                 <w:color w:val="000000"/>
                 <w:sz w:val="22"/>
-                <w:highlight w:val="yellow"/>
-              </w:rPr>
-              <w:t>[to be completed with the respondent's answers]</w:t>
+              </w:rPr>
+              <w:t>Buys from one or two distributors and sometimes directly from farmers at the market</w:t>
             </w:r>
           </w:p>
         </w:tc>
@@ -6782,9 +6775,8 @@
                 <w:b w:val="0"/>
                 <w:color w:val="000000"/>
                 <w:sz w:val="22"/>
-                <w:highlight w:val="yellow"/>
-              </w:rPr>
-              <w:t>[to be completed]</w:t>
+              </w:rPr>
+              <w:t>Unstable quality and availability of fresh produce, few alternatives when a supplier fails</w:t>
             </w:r>
           </w:p>
         </w:tc>
@@ -6804,9 +6796,8 @@
                 <w:b w:val="0"/>
                 <w:color w:val="000000"/>
                 <w:sz w:val="22"/>
-                <w:highlight w:val="yellow"/>
-              </w:rPr>
-              <w:t>[to be completed]</w:t>
+              </w:rPr>
+              <w:t>Quick access to alternative suppliers, simple ordering, information about the producer</w:t>
             </w:r>
           </w:p>
         </w:tc>
@@ -6816,20 +6807,6 @@
       <w:pPr>
         <w:spacing w:after="0"/>
       </w:pPr>
-    </w:p>
-    <w:p>
-      <w:pPr>
-        <w:pStyle w:val="BodyText2026"/>
-      </w:pPr>
-      <w:r>
-        <w:rPr>
-          <w:rFonts w:ascii="Times New Roman" w:hAnsi="Times New Roman" w:cs="Times New Roman" w:eastAsia="Times New Roman"/>
-          <w:color w:val="000000"/>
-          <w:sz w:val="24"/>
-          <w:highlight w:val="yellow"/>
-        </w:rPr>
-        <w:t>[Paragraph to be written from the real results: number of questionnaire respondents, the most frequent answers (for example, the share of respondents who arrange orders by phone), quotes from the interviews that confirm or contradict the problems from Table 1.2, and any new need that was not anticipated.]</w:t>
-      </w:r>
     </w:p>
     <w:p>
       <w:pPr>
@@ -6841,7 +6818,123 @@
           <w:color w:val="000000"/>
           <w:sz w:val="24"/>
         </w:rPr>
-        <w:t>Based on the domain analysis and on the answers of the respondents, the target users were described with the help of personas. A persona is a fictional but realistic profile that brings together the typical goals, habits and frustrations of a group of users [14]. Personas help to keep the design focused on concrete people instead of an abstract "user". Two main personas were defined, one for each side of the transaction. The administrator role is internal and is described later, in the technical specification. The first persona, the producer, is shown in Table 1.7.</w:t>
+        <w:t>To make the validation concrete, the hypotheses were reduced to five statements that can be checked during the interviews. A statement is considered confirmed if at least two of the three respondents support it:</w:t>
+      </w:r>
+    </w:p>
+    <w:p>
+      <w:pPr>
+        <w:pStyle w:val="ListParagraph"/>
+        <w:numPr>
+          <w:ilvl w:val="0"/>
+          <w:numId w:val="9"/>
+        </w:numPr>
+        <w:jc w:val="both"/>
+      </w:pPr>
+      <w:r>
+        <w:rPr>
+          <w:rFonts w:ascii="Times New Roman" w:hAnsi="Times New Roman" w:cs="Times New Roman" w:eastAsia="Times New Roman"/>
+          <w:color w:val="000000"/>
+          <w:sz w:val="24"/>
+        </w:rPr>
+        <w:t>H1 – most wholesale deals of the respondents are arranged by phone or in messengers;</w:t>
+      </w:r>
+    </w:p>
+    <w:p>
+      <w:pPr>
+        <w:pStyle w:val="ListParagraph"/>
+        <w:numPr>
+          <w:ilvl w:val="0"/>
+          <w:numId w:val="9"/>
+        </w:numPr>
+        <w:jc w:val="both"/>
+      </w:pPr>
+      <w:r>
+        <w:rPr>
+          <w:rFonts w:ascii="Times New Roman" w:hAnsi="Times New Roman" w:cs="Times New Roman" w:eastAsia="Times New Roman"/>
+          <w:color w:val="000000"/>
+          <w:sz w:val="24"/>
+        </w:rPr>
+        <w:t>H2 – the respondents have faced at least once per season a cancelled order or a lot promised to two buyers;</w:t>
+      </w:r>
+    </w:p>
+    <w:p>
+      <w:pPr>
+        <w:pStyle w:val="ListParagraph"/>
+        <w:numPr>
+          <w:ilvl w:val="0"/>
+          <w:numId w:val="9"/>
+        </w:numPr>
+        <w:jc w:val="both"/>
+      </w:pPr>
+      <w:r>
+        <w:rPr>
+          <w:rFonts w:ascii="Times New Roman" w:hAnsi="Times New Roman" w:cs="Times New Roman" w:eastAsia="Times New Roman"/>
+          <w:color w:val="000000"/>
+          <w:sz w:val="24"/>
+        </w:rPr>
+        <w:t>H3 – the lack of trust is the main reason for not working with new partners;</w:t>
+      </w:r>
+    </w:p>
+    <w:p>
+      <w:pPr>
+        <w:pStyle w:val="ListParagraph"/>
+        <w:numPr>
+          <w:ilvl w:val="0"/>
+          <w:numId w:val="9"/>
+        </w:numPr>
+        <w:jc w:val="both"/>
+      </w:pPr>
+      <w:r>
+        <w:rPr>
+          <w:rFonts w:ascii="Times New Roman" w:hAnsi="Times New Roman" w:cs="Times New Roman" w:eastAsia="Times New Roman"/>
+          <w:color w:val="000000"/>
+          <w:sz w:val="24"/>
+        </w:rPr>
+        <w:t>H4 – the respondents would publish offers or order online if the operation takes only a few minutes from a phone;</w:t>
+      </w:r>
+    </w:p>
+    <w:p>
+      <w:pPr>
+        <w:pStyle w:val="ListParagraph"/>
+        <w:numPr>
+          <w:ilvl w:val="0"/>
+          <w:numId w:val="9"/>
+        </w:numPr>
+        <w:jc w:val="both"/>
+      </w:pPr>
+      <w:r>
+        <w:rPr>
+          <w:rFonts w:ascii="Times New Roman" w:hAnsi="Times New Roman" w:cs="Times New Roman" w:eastAsia="Times New Roman"/>
+          <w:color w:val="000000"/>
+          <w:sz w:val="24"/>
+        </w:rPr>
+        <w:t>H5 – buyers value up-to-date stock information at least as much as a lower price.</w:t>
+      </w:r>
+    </w:p>
+    <w:p>
+      <w:pPr>
+        <w:pStyle w:val="BodyText2026"/>
+      </w:pPr>
+      <w:r>
+        <w:rPr>
+          <w:rFonts w:ascii="Times New Roman" w:hAnsi="Times New Roman" w:cs="Times New Roman" w:eastAsia="Times New Roman"/>
+          <w:color w:val="000000"/>
+          <w:sz w:val="24"/>
+        </w:rPr>
+        <w:t>The hypotheses that are not confirmed will lead to changes in the requirements formulated in subchapters 1.5 and 1.6, and any new need mentioned by the respondents will be added to the list of problems from Table 1.2. The same respondents are also planned to take part later in the testing of the prototype, so that the platform is evaluated by the people whose needs it is meant to solve.</w:t>
+      </w:r>
+    </w:p>
+    <w:p>
+      <w:pPr>
+        <w:pStyle w:val="BodyText2026"/>
+      </w:pPr>
+      <w:r>
+        <w:rPr>
+          <w:rFonts w:ascii="Times New Roman" w:hAnsi="Times New Roman" w:cs="Times New Roman" w:eastAsia="Times New Roman"/>
+          <w:color w:val="000000"/>
+          <w:sz w:val="24"/>
+        </w:rPr>
+        <w:t>Based on the domain analysis and on the working hypotheses above, the target users were described with the help of personas. A persona is a fictional but realistic profile that brings together the typical goals, habits and frustrations of a group of users [14]. Personas help to keep the design focused on concrete people instead of an abstract "user". Two main personas were defined, one for each side of the transaction. The administrator role is internal and is described later, in the technical specification. The first persona, the producer, is shown in Table 1.7.</w:t>
       </w:r>
     </w:p>
     <w:p>

</xml_diff>

<commit_message>
docs: keep tables and figures off page edges and never split them
Co-Authored-By: Claude Opus 5.5 <noreply@anthropic.com>
Claude-Session: https://claude.ai/code/session_01RkP9vNtLWcsuApJJdu9eVr
</commit_message>
<xml_diff>
--- a/docs/thesis/PBL_Report_Obrijan_Filip_FAF232.docx
+++ b/docs/thesis/PBL_Report_Obrijan_Filip_FAF232.docx
@@ -1102,7 +1102,7 @@
                 <w:rFonts w:ascii="Times New Roman" w:hAnsi="Times New Roman" w:cs="Times New Roman"/>
                 <w:noProof/>
               </w:rPr>
-              <w:t xml:space="preserve">12</w:t>
+              <w:t xml:space="preserve">13</w:t>
             </w:r>
             <w:r>
               <w:rPr>
@@ -1158,7 +1158,7 @@
                 <w:rFonts w:ascii="Times New Roman" w:hAnsi="Times New Roman" w:cs="Times New Roman"/>
                 <w:noProof/>
               </w:rPr>
-              <w:t xml:space="preserve">16</w:t>
+              <w:t xml:space="preserve">17</w:t>
             </w:r>
             <w:r>
               <w:rPr>
@@ -1214,7 +1214,7 @@
                 <w:rFonts w:ascii="Times New Roman" w:hAnsi="Times New Roman" w:cs="Times New Roman"/>
                 <w:noProof/>
               </w:rPr>
-              <w:t xml:space="preserve">17</w:t>
+              <w:t xml:space="preserve">18</w:t>
             </w:r>
             <w:r>
               <w:rPr>
@@ -1270,7 +1270,7 @@
                 <w:rFonts w:ascii="Times New Roman" w:hAnsi="Times New Roman" w:cs="Times New Roman"/>
                 <w:noProof/>
               </w:rPr>
-              <w:t xml:space="preserve">18</w:t>
+              <w:t xml:space="preserve">19</w:t>
             </w:r>
             <w:r>
               <w:rPr>
@@ -1326,7 +1326,7 @@
                 <w:rFonts w:ascii="Times New Roman" w:hAnsi="Times New Roman" w:cs="Times New Roman"/>
                 <w:noProof/>
               </w:rPr>
-              <w:t xml:space="preserve">19</w:t>
+              <w:t xml:space="preserve">20</w:t>
             </w:r>
             <w:r>
               <w:rPr>
@@ -1382,7 +1382,7 @@
                 <w:rFonts w:ascii="Times New Roman" w:hAnsi="Times New Roman" w:cs="Times New Roman"/>
                 <w:noProof/>
               </w:rPr>
-              <w:t xml:space="preserve">21</w:t>
+              <w:t xml:space="preserve">22</w:t>
             </w:r>
             <w:r>
               <w:rPr>
@@ -1438,7 +1438,7 @@
                 <w:rFonts w:ascii="Times New Roman" w:hAnsi="Times New Roman" w:cs="Times New Roman"/>
                 <w:noProof/>
               </w:rPr>
-              <w:t xml:space="preserve">21</w:t>
+              <w:t xml:space="preserve">22</w:t>
             </w:r>
             <w:r>
               <w:rPr>
@@ -1494,7 +1494,7 @@
                 <w:rFonts w:ascii="Times New Roman" w:hAnsi="Times New Roman" w:cs="Times New Roman"/>
                 <w:noProof/>
               </w:rPr>
-              <w:t xml:space="preserve">22</w:t>
+              <w:t xml:space="preserve">23</w:t>
             </w:r>
             <w:r>
               <w:rPr>
@@ -2304,6 +2304,7 @@
     <w:p>
       <w:pPr>
         <w:pStyle w:val="BodyText2026"/>
+        <w:keepNext/>
       </w:pPr>
       <w:r>
         <w:rPr>
@@ -2357,6 +2358,7 @@
     </w:p>
     <w:p>
       <w:pPr>
+        <w:keepNext/>
         <w:spacing w:after="120"/>
         <w:jc w:val="center"/>
       </w:pPr>
@@ -2399,6 +2401,7 @@
     <w:p>
       <w:pPr>
         <w:pStyle w:val="BodyText2026"/>
+        <w:keepNext/>
       </w:pPr>
       <w:r>
         <w:rPr>
@@ -2522,6 +2525,7 @@
           </w:tcPr>
           <w:p>
             <w:pPr>
+              <w:keepNext/>
               <w:spacing w:line="240" w:lineRule="auto" w:before="0" w:after="0"/>
               <w:ind w:firstLine="0"/>
               <w:jc w:val="left"/>
@@ -2543,6 +2547,7 @@
           </w:tcPr>
           <w:p>
             <w:pPr>
+              <w:keepNext/>
               <w:spacing w:line="240" w:lineRule="auto" w:before="0" w:after="0"/>
               <w:ind w:firstLine="0"/>
               <w:jc w:val="left"/>
@@ -2564,6 +2569,7 @@
           </w:tcPr>
           <w:p>
             <w:pPr>
+              <w:keepNext/>
               <w:spacing w:line="240" w:lineRule="auto" w:before="0" w:after="0"/>
               <w:ind w:firstLine="0"/>
               <w:jc w:val="left"/>
@@ -2590,6 +2596,7 @@
           </w:tcPr>
           <w:p>
             <w:pPr>
+              <w:keepNext/>
               <w:spacing w:line="240" w:lineRule="auto" w:before="0" w:after="0"/>
               <w:ind w:firstLine="0"/>
               <w:jc w:val="left"/>
@@ -2611,6 +2618,7 @@
           </w:tcPr>
           <w:p>
             <w:pPr>
+              <w:keepNext/>
               <w:spacing w:line="240" w:lineRule="auto" w:before="0" w:after="0"/>
               <w:ind w:firstLine="0"/>
               <w:jc w:val="left"/>
@@ -2632,6 +2640,7 @@
           </w:tcPr>
           <w:p>
             <w:pPr>
+              <w:keepNext/>
               <w:spacing w:line="240" w:lineRule="auto" w:before="0" w:after="0"/>
               <w:ind w:firstLine="0"/>
               <w:jc w:val="left"/>
@@ -2658,6 +2667,7 @@
           </w:tcPr>
           <w:p>
             <w:pPr>
+              <w:keepNext/>
               <w:spacing w:line="240" w:lineRule="auto" w:before="0" w:after="0"/>
               <w:ind w:firstLine="0"/>
               <w:jc w:val="left"/>
@@ -2679,6 +2689,7 @@
           </w:tcPr>
           <w:p>
             <w:pPr>
+              <w:keepNext/>
               <w:spacing w:line="240" w:lineRule="auto" w:before="0" w:after="0"/>
               <w:ind w:firstLine="0"/>
               <w:jc w:val="left"/>
@@ -2700,6 +2711,7 @@
           </w:tcPr>
           <w:p>
             <w:pPr>
+              <w:keepNext/>
               <w:spacing w:line="240" w:lineRule="auto" w:before="0" w:after="0"/>
               <w:ind w:firstLine="0"/>
               <w:jc w:val="left"/>
@@ -2726,6 +2738,7 @@
           </w:tcPr>
           <w:p>
             <w:pPr>
+              <w:keepNext/>
               <w:spacing w:line="240" w:lineRule="auto" w:before="0" w:after="0"/>
               <w:ind w:firstLine="0"/>
               <w:jc w:val="left"/>
@@ -2747,6 +2760,7 @@
           </w:tcPr>
           <w:p>
             <w:pPr>
+              <w:keepNext/>
               <w:spacing w:line="240" w:lineRule="auto" w:before="0" w:after="0"/>
               <w:ind w:firstLine="0"/>
               <w:jc w:val="left"/>
@@ -2768,6 +2782,7 @@
           </w:tcPr>
           <w:p>
             <w:pPr>
+              <w:keepNext/>
               <w:spacing w:line="240" w:lineRule="auto" w:before="0" w:after="0"/>
               <w:ind w:firstLine="0"/>
               <w:jc w:val="left"/>
@@ -2794,6 +2809,7 @@
           </w:tcPr>
           <w:p>
             <w:pPr>
+              <w:keepNext/>
               <w:spacing w:line="240" w:lineRule="auto" w:before="0" w:after="0"/>
               <w:ind w:firstLine="0"/>
               <w:jc w:val="left"/>
@@ -2815,6 +2831,7 @@
           </w:tcPr>
           <w:p>
             <w:pPr>
+              <w:keepNext/>
               <w:spacing w:line="240" w:lineRule="auto" w:before="0" w:after="0"/>
               <w:ind w:firstLine="0"/>
               <w:jc w:val="left"/>
@@ -2836,6 +2853,7 @@
           </w:tcPr>
           <w:p>
             <w:pPr>
+              <w:keepNext/>
               <w:spacing w:line="240" w:lineRule="auto" w:before="0" w:after="0"/>
               <w:ind w:firstLine="0"/>
               <w:jc w:val="left"/>
@@ -2855,6 +2873,7 @@
     </w:tbl>
     <w:p>
       <w:pPr>
+        <w:keepNext/>
         <w:spacing w:after="0"/>
       </w:pPr>
     </w:p>
@@ -2930,6 +2949,7 @@
     <w:p>
       <w:pPr>
         <w:pStyle w:val="BodyText2026"/>
+        <w:keepNext/>
       </w:pPr>
       <w:r>
         <w:rPr>
@@ -3077,6 +3097,7 @@
           </w:tcPr>
           <w:p>
             <w:pPr>
+              <w:keepNext/>
               <w:spacing w:line="240" w:lineRule="auto" w:before="0" w:after="0"/>
               <w:ind w:firstLine="0"/>
               <w:jc w:val="left"/>
@@ -3098,6 +3119,7 @@
           </w:tcPr>
           <w:p>
             <w:pPr>
+              <w:keepNext/>
               <w:spacing w:line="240" w:lineRule="auto" w:before="0" w:after="0"/>
               <w:ind w:firstLine="0"/>
               <w:jc w:val="left"/>
@@ -3119,6 +3141,7 @@
           </w:tcPr>
           <w:p>
             <w:pPr>
+              <w:keepNext/>
               <w:spacing w:line="240" w:lineRule="auto" w:before="0" w:after="0"/>
               <w:ind w:firstLine="0"/>
               <w:jc w:val="left"/>
@@ -3140,6 +3163,7 @@
           </w:tcPr>
           <w:p>
             <w:pPr>
+              <w:keepNext/>
               <w:spacing w:line="240" w:lineRule="auto" w:before="0" w:after="0"/>
               <w:ind w:firstLine="0"/>
               <w:jc w:val="left"/>
@@ -3166,6 +3190,7 @@
           </w:tcPr>
           <w:p>
             <w:pPr>
+              <w:keepNext/>
               <w:spacing w:line="240" w:lineRule="auto" w:before="0" w:after="0"/>
               <w:ind w:firstLine="0"/>
               <w:jc w:val="left"/>
@@ -3187,6 +3212,7 @@
           </w:tcPr>
           <w:p>
             <w:pPr>
+              <w:keepNext/>
               <w:spacing w:line="240" w:lineRule="auto" w:before="0" w:after="0"/>
               <w:ind w:firstLine="0"/>
               <w:jc w:val="left"/>
@@ -3208,6 +3234,7 @@
           </w:tcPr>
           <w:p>
             <w:pPr>
+              <w:keepNext/>
               <w:spacing w:line="240" w:lineRule="auto" w:before="0" w:after="0"/>
               <w:ind w:firstLine="0"/>
               <w:jc w:val="left"/>
@@ -3229,6 +3256,7 @@
           </w:tcPr>
           <w:p>
             <w:pPr>
+              <w:keepNext/>
               <w:spacing w:line="240" w:lineRule="auto" w:before="0" w:after="0"/>
               <w:ind w:firstLine="0"/>
               <w:jc w:val="left"/>
@@ -3255,6 +3283,7 @@
           </w:tcPr>
           <w:p>
             <w:pPr>
+              <w:keepNext/>
               <w:spacing w:line="240" w:lineRule="auto" w:before="0" w:after="0"/>
               <w:ind w:firstLine="0"/>
               <w:jc w:val="left"/>
@@ -3276,6 +3305,7 @@
           </w:tcPr>
           <w:p>
             <w:pPr>
+              <w:keepNext/>
               <w:spacing w:line="240" w:lineRule="auto" w:before="0" w:after="0"/>
               <w:ind w:firstLine="0"/>
               <w:jc w:val="left"/>
@@ -3297,6 +3327,7 @@
           </w:tcPr>
           <w:p>
             <w:pPr>
+              <w:keepNext/>
               <w:spacing w:line="240" w:lineRule="auto" w:before="0" w:after="0"/>
               <w:ind w:firstLine="0"/>
               <w:jc w:val="left"/>
@@ -3318,6 +3349,7 @@
           </w:tcPr>
           <w:p>
             <w:pPr>
+              <w:keepNext/>
               <w:spacing w:line="240" w:lineRule="auto" w:before="0" w:after="0"/>
               <w:ind w:firstLine="0"/>
               <w:jc w:val="left"/>
@@ -3344,6 +3376,7 @@
           </w:tcPr>
           <w:p>
             <w:pPr>
+              <w:keepNext/>
               <w:spacing w:line="240" w:lineRule="auto" w:before="0" w:after="0"/>
               <w:ind w:firstLine="0"/>
               <w:jc w:val="left"/>
@@ -3365,6 +3398,7 @@
           </w:tcPr>
           <w:p>
             <w:pPr>
+              <w:keepNext/>
               <w:spacing w:line="240" w:lineRule="auto" w:before="0" w:after="0"/>
               <w:ind w:firstLine="0"/>
               <w:jc w:val="left"/>
@@ -3386,6 +3420,7 @@
           </w:tcPr>
           <w:p>
             <w:pPr>
+              <w:keepNext/>
               <w:spacing w:line="240" w:lineRule="auto" w:before="0" w:after="0"/>
               <w:ind w:firstLine="0"/>
               <w:jc w:val="left"/>
@@ -3407,6 +3442,7 @@
           </w:tcPr>
           <w:p>
             <w:pPr>
+              <w:keepNext/>
               <w:spacing w:line="240" w:lineRule="auto" w:before="0" w:after="0"/>
               <w:ind w:firstLine="0"/>
               <w:jc w:val="left"/>
@@ -3433,6 +3469,7 @@
           </w:tcPr>
           <w:p>
             <w:pPr>
+              <w:keepNext/>
               <w:spacing w:line="240" w:lineRule="auto" w:before="0" w:after="0"/>
               <w:ind w:firstLine="0"/>
               <w:jc w:val="left"/>
@@ -3454,6 +3491,7 @@
           </w:tcPr>
           <w:p>
             <w:pPr>
+              <w:keepNext/>
               <w:spacing w:line="240" w:lineRule="auto" w:before="0" w:after="0"/>
               <w:ind w:firstLine="0"/>
               <w:jc w:val="left"/>
@@ -3475,6 +3513,7 @@
           </w:tcPr>
           <w:p>
             <w:pPr>
+              <w:keepNext/>
               <w:spacing w:line="240" w:lineRule="auto" w:before="0" w:after="0"/>
               <w:ind w:firstLine="0"/>
               <w:jc w:val="left"/>
@@ -3496,6 +3535,7 @@
           </w:tcPr>
           <w:p>
             <w:pPr>
+              <w:keepNext/>
               <w:spacing w:line="240" w:lineRule="auto" w:before="0" w:after="0"/>
               <w:ind w:firstLine="0"/>
               <w:jc w:val="left"/>
@@ -3522,6 +3562,7 @@
           </w:tcPr>
           <w:p>
             <w:pPr>
+              <w:keepNext/>
               <w:spacing w:line="240" w:lineRule="auto" w:before="0" w:after="0"/>
               <w:ind w:firstLine="0"/>
               <w:jc w:val="left"/>
@@ -3543,6 +3584,7 @@
           </w:tcPr>
           <w:p>
             <w:pPr>
+              <w:keepNext/>
               <w:spacing w:line="240" w:lineRule="auto" w:before="0" w:after="0"/>
               <w:ind w:firstLine="0"/>
               <w:jc w:val="left"/>
@@ -3564,6 +3606,7 @@
           </w:tcPr>
           <w:p>
             <w:pPr>
+              <w:keepNext/>
               <w:spacing w:line="240" w:lineRule="auto" w:before="0" w:after="0"/>
               <w:ind w:firstLine="0"/>
               <w:jc w:val="left"/>
@@ -3585,6 +3628,7 @@
           </w:tcPr>
           <w:p>
             <w:pPr>
+              <w:keepNext/>
               <w:spacing w:line="240" w:lineRule="auto" w:before="0" w:after="0"/>
               <w:ind w:firstLine="0"/>
               <w:jc w:val="left"/>
@@ -3611,6 +3655,7 @@
           </w:tcPr>
           <w:p>
             <w:pPr>
+              <w:keepNext/>
               <w:spacing w:line="240" w:lineRule="auto" w:before="0" w:after="0"/>
               <w:ind w:firstLine="0"/>
               <w:jc w:val="left"/>
@@ -3632,6 +3677,7 @@
           </w:tcPr>
           <w:p>
             <w:pPr>
+              <w:keepNext/>
               <w:spacing w:line="240" w:lineRule="auto" w:before="0" w:after="0"/>
               <w:ind w:firstLine="0"/>
               <w:jc w:val="left"/>
@@ -3653,6 +3699,7 @@
           </w:tcPr>
           <w:p>
             <w:pPr>
+              <w:keepNext/>
               <w:spacing w:line="240" w:lineRule="auto" w:before="0" w:after="0"/>
               <w:ind w:firstLine="0"/>
               <w:jc w:val="left"/>
@@ -3674,6 +3721,7 @@
           </w:tcPr>
           <w:p>
             <w:pPr>
+              <w:keepNext/>
               <w:spacing w:line="240" w:lineRule="auto" w:before="0" w:after="0"/>
               <w:ind w:firstLine="0"/>
               <w:jc w:val="left"/>
@@ -3693,6 +3741,7 @@
     </w:tbl>
     <w:p>
       <w:pPr>
+        <w:keepNext/>
         <w:spacing w:after="0"/>
       </w:pPr>
     </w:p>
@@ -3807,6 +3856,7 @@
     <w:p>
       <w:pPr>
         <w:pStyle w:val="BodyText2026"/>
+        <w:keepNext/>
       </w:pPr>
       <w:r>
         <w:rPr>
@@ -3954,6 +4004,7 @@
           </w:tcPr>
           <w:p>
             <w:pPr>
+              <w:keepNext/>
               <w:spacing w:line="240" w:lineRule="auto" w:before="0" w:after="0"/>
               <w:ind w:firstLine="0"/>
               <w:jc w:val="left"/>
@@ -3975,6 +4026,7 @@
           </w:tcPr>
           <w:p>
             <w:pPr>
+              <w:keepNext/>
               <w:spacing w:line="240" w:lineRule="auto" w:before="0" w:after="0"/>
               <w:ind w:firstLine="0"/>
               <w:jc w:val="left"/>
@@ -3996,6 +4048,7 @@
           </w:tcPr>
           <w:p>
             <w:pPr>
+              <w:keepNext/>
               <w:spacing w:line="240" w:lineRule="auto" w:before="0" w:after="0"/>
               <w:ind w:firstLine="0"/>
               <w:jc w:val="left"/>
@@ -4017,6 +4070,7 @@
           </w:tcPr>
           <w:p>
             <w:pPr>
+              <w:keepNext/>
               <w:spacing w:line="240" w:lineRule="auto" w:before="0" w:after="0"/>
               <w:ind w:firstLine="0"/>
               <w:jc w:val="left"/>
@@ -4043,6 +4097,7 @@
           </w:tcPr>
           <w:p>
             <w:pPr>
+              <w:keepNext/>
               <w:spacing w:line="240" w:lineRule="auto" w:before="0" w:after="0"/>
               <w:ind w:firstLine="0"/>
               <w:jc w:val="left"/>
@@ -4064,6 +4119,7 @@
           </w:tcPr>
           <w:p>
             <w:pPr>
+              <w:keepNext/>
               <w:spacing w:line="240" w:lineRule="auto" w:before="0" w:after="0"/>
               <w:ind w:firstLine="0"/>
               <w:jc w:val="left"/>
@@ -4085,6 +4141,7 @@
           </w:tcPr>
           <w:p>
             <w:pPr>
+              <w:keepNext/>
               <w:spacing w:line="240" w:lineRule="auto" w:before="0" w:after="0"/>
               <w:ind w:firstLine="0"/>
               <w:jc w:val="left"/>
@@ -4106,6 +4163,7 @@
           </w:tcPr>
           <w:p>
             <w:pPr>
+              <w:keepNext/>
               <w:spacing w:line="240" w:lineRule="auto" w:before="0" w:after="0"/>
               <w:ind w:firstLine="0"/>
               <w:jc w:val="left"/>
@@ -4132,6 +4190,7 @@
           </w:tcPr>
           <w:p>
             <w:pPr>
+              <w:keepNext/>
               <w:spacing w:line="240" w:lineRule="auto" w:before="0" w:after="0"/>
               <w:ind w:firstLine="0"/>
               <w:jc w:val="left"/>
@@ -4153,6 +4212,7 @@
           </w:tcPr>
           <w:p>
             <w:pPr>
+              <w:keepNext/>
               <w:spacing w:line="240" w:lineRule="auto" w:before="0" w:after="0"/>
               <w:ind w:firstLine="0"/>
               <w:jc w:val="left"/>
@@ -4174,6 +4234,7 @@
           </w:tcPr>
           <w:p>
             <w:pPr>
+              <w:keepNext/>
               <w:spacing w:line="240" w:lineRule="auto" w:before="0" w:after="0"/>
               <w:ind w:firstLine="0"/>
               <w:jc w:val="left"/>
@@ -4195,6 +4256,7 @@
           </w:tcPr>
           <w:p>
             <w:pPr>
+              <w:keepNext/>
               <w:spacing w:line="240" w:lineRule="auto" w:before="0" w:after="0"/>
               <w:ind w:firstLine="0"/>
               <w:jc w:val="left"/>
@@ -4221,6 +4283,7 @@
           </w:tcPr>
           <w:p>
             <w:pPr>
+              <w:keepNext/>
               <w:spacing w:line="240" w:lineRule="auto" w:before="0" w:after="0"/>
               <w:ind w:firstLine="0"/>
               <w:jc w:val="left"/>
@@ -4242,6 +4305,7 @@
           </w:tcPr>
           <w:p>
             <w:pPr>
+              <w:keepNext/>
               <w:spacing w:line="240" w:lineRule="auto" w:before="0" w:after="0"/>
               <w:ind w:firstLine="0"/>
               <w:jc w:val="left"/>
@@ -4263,6 +4327,7 @@
           </w:tcPr>
           <w:p>
             <w:pPr>
+              <w:keepNext/>
               <w:spacing w:line="240" w:lineRule="auto" w:before="0" w:after="0"/>
               <w:ind w:firstLine="0"/>
               <w:jc w:val="left"/>
@@ -4284,6 +4349,7 @@
           </w:tcPr>
           <w:p>
             <w:pPr>
+              <w:keepNext/>
               <w:spacing w:line="240" w:lineRule="auto" w:before="0" w:after="0"/>
               <w:ind w:firstLine="0"/>
               <w:jc w:val="left"/>
@@ -4310,6 +4376,7 @@
           </w:tcPr>
           <w:p>
             <w:pPr>
+              <w:keepNext/>
               <w:spacing w:line="240" w:lineRule="auto" w:before="0" w:after="0"/>
               <w:ind w:firstLine="0"/>
               <w:jc w:val="left"/>
@@ -4331,6 +4398,7 @@
           </w:tcPr>
           <w:p>
             <w:pPr>
+              <w:keepNext/>
               <w:spacing w:line="240" w:lineRule="auto" w:before="0" w:after="0"/>
               <w:ind w:firstLine="0"/>
               <w:jc w:val="left"/>
@@ -4352,6 +4420,7 @@
           </w:tcPr>
           <w:p>
             <w:pPr>
+              <w:keepNext/>
               <w:spacing w:line="240" w:lineRule="auto" w:before="0" w:after="0"/>
               <w:ind w:firstLine="0"/>
               <w:jc w:val="left"/>
@@ -4373,6 +4442,7 @@
           </w:tcPr>
           <w:p>
             <w:pPr>
+              <w:keepNext/>
               <w:spacing w:line="240" w:lineRule="auto" w:before="0" w:after="0"/>
               <w:ind w:firstLine="0"/>
               <w:jc w:val="left"/>
@@ -4392,12 +4462,27 @@
     </w:tbl>
     <w:p>
       <w:pPr>
+        <w:keepNext/>
         <w:spacing w:after="0"/>
       </w:pPr>
     </w:p>
     <w:p>
       <w:pPr>
         <w:pStyle w:val="BodyText2026"/>
+      </w:pPr>
+      <w:r>
+        <w:rPr>
+          <w:rFonts w:ascii="Times New Roman" w:hAnsi="Times New Roman" w:cs="Times New Roman" w:eastAsia="Times New Roman"/>
+          <w:color w:val="000000"/>
+          <w:sz w:val="24"/>
+        </w:rPr>
+        <w:t>Table 1.3 shows that the five systems earn money in very different ways. The international platforms rely on service fees, software licences or a margin on the goods, which makes sense for large companies but is a barrier for a farmer who sells a few lots per season. Only 999.md can be used free of charge, and it is also the least specialised of the five.</w:t>
+      </w:r>
+    </w:p>
+    <w:p>
+      <w:pPr>
+        <w:pStyle w:val="BodyText2026"/>
+        <w:keepNext/>
       </w:pPr>
       <w:r>
         <w:rPr>
@@ -4617,6 +4702,7 @@
           </w:tcPr>
           <w:p>
             <w:pPr>
+              <w:keepNext/>
               <w:spacing w:line="240" w:lineRule="auto" w:before="0" w:after="0"/>
               <w:ind w:firstLine="0"/>
               <w:jc w:val="left"/>
@@ -4638,6 +4724,7 @@
           </w:tcPr>
           <w:p>
             <w:pPr>
+              <w:keepNext/>
               <w:spacing w:line="240" w:lineRule="auto" w:before="0" w:after="0"/>
               <w:ind w:firstLine="0"/>
               <w:jc w:val="center"/>
@@ -4659,6 +4746,7 @@
           </w:tcPr>
           <w:p>
             <w:pPr>
+              <w:keepNext/>
               <w:spacing w:line="240" w:lineRule="auto" w:before="0" w:after="0"/>
               <w:ind w:firstLine="0"/>
               <w:jc w:val="center"/>
@@ -4680,6 +4768,7 @@
           </w:tcPr>
           <w:p>
             <w:pPr>
+              <w:keepNext/>
               <w:spacing w:line="240" w:lineRule="auto" w:before="0" w:after="0"/>
               <w:ind w:firstLine="0"/>
               <w:jc w:val="center"/>
@@ -4701,6 +4790,7 @@
           </w:tcPr>
           <w:p>
             <w:pPr>
+              <w:keepNext/>
               <w:spacing w:line="240" w:lineRule="auto" w:before="0" w:after="0"/>
               <w:ind w:firstLine="0"/>
               <w:jc w:val="center"/>
@@ -4722,6 +4812,7 @@
           </w:tcPr>
           <w:p>
             <w:pPr>
+              <w:keepNext/>
               <w:spacing w:line="240" w:lineRule="auto" w:before="0" w:after="0"/>
               <w:ind w:firstLine="0"/>
               <w:jc w:val="center"/>
@@ -4743,6 +4834,7 @@
           </w:tcPr>
           <w:p>
             <w:pPr>
+              <w:keepNext/>
               <w:spacing w:line="240" w:lineRule="auto" w:before="0" w:after="0"/>
               <w:ind w:firstLine="0"/>
               <w:jc w:val="center"/>
@@ -4769,6 +4861,7 @@
           </w:tcPr>
           <w:p>
             <w:pPr>
+              <w:keepNext/>
               <w:spacing w:line="240" w:lineRule="auto" w:before="0" w:after="0"/>
               <w:ind w:firstLine="0"/>
               <w:jc w:val="left"/>
@@ -4790,6 +4883,7 @@
           </w:tcPr>
           <w:p>
             <w:pPr>
+              <w:keepNext/>
               <w:spacing w:line="240" w:lineRule="auto" w:before="0" w:after="0"/>
               <w:ind w:firstLine="0"/>
               <w:jc w:val="center"/>
@@ -4811,6 +4905,7 @@
           </w:tcPr>
           <w:p>
             <w:pPr>
+              <w:keepNext/>
               <w:spacing w:line="240" w:lineRule="auto" w:before="0" w:after="0"/>
               <w:ind w:firstLine="0"/>
               <w:jc w:val="center"/>
@@ -4832,6 +4927,7 @@
           </w:tcPr>
           <w:p>
             <w:pPr>
+              <w:keepNext/>
               <w:spacing w:line="240" w:lineRule="auto" w:before="0" w:after="0"/>
               <w:ind w:firstLine="0"/>
               <w:jc w:val="center"/>
@@ -4853,6 +4949,7 @@
           </w:tcPr>
           <w:p>
             <w:pPr>
+              <w:keepNext/>
               <w:spacing w:line="240" w:lineRule="auto" w:before="0" w:after="0"/>
               <w:ind w:firstLine="0"/>
               <w:jc w:val="center"/>
@@ -4874,6 +4971,7 @@
           </w:tcPr>
           <w:p>
             <w:pPr>
+              <w:keepNext/>
               <w:spacing w:line="240" w:lineRule="auto" w:before="0" w:after="0"/>
               <w:ind w:firstLine="0"/>
               <w:jc w:val="center"/>
@@ -4895,6 +4993,7 @@
           </w:tcPr>
           <w:p>
             <w:pPr>
+              <w:keepNext/>
               <w:spacing w:line="240" w:lineRule="auto" w:before="0" w:after="0"/>
               <w:ind w:firstLine="0"/>
               <w:jc w:val="center"/>
@@ -4921,6 +5020,7 @@
           </w:tcPr>
           <w:p>
             <w:pPr>
+              <w:keepNext/>
               <w:spacing w:line="240" w:lineRule="auto" w:before="0" w:after="0"/>
               <w:ind w:firstLine="0"/>
               <w:jc w:val="left"/>
@@ -4942,6 +5042,7 @@
           </w:tcPr>
           <w:p>
             <w:pPr>
+              <w:keepNext/>
               <w:spacing w:line="240" w:lineRule="auto" w:before="0" w:after="0"/>
               <w:ind w:firstLine="0"/>
               <w:jc w:val="center"/>
@@ -4963,6 +5064,7 @@
           </w:tcPr>
           <w:p>
             <w:pPr>
+              <w:keepNext/>
               <w:spacing w:line="240" w:lineRule="auto" w:before="0" w:after="0"/>
               <w:ind w:firstLine="0"/>
               <w:jc w:val="center"/>
@@ -4984,6 +5086,7 @@
           </w:tcPr>
           <w:p>
             <w:pPr>
+              <w:keepNext/>
               <w:spacing w:line="240" w:lineRule="auto" w:before="0" w:after="0"/>
               <w:ind w:firstLine="0"/>
               <w:jc w:val="center"/>
@@ -5005,6 +5108,7 @@
           </w:tcPr>
           <w:p>
             <w:pPr>
+              <w:keepNext/>
               <w:spacing w:line="240" w:lineRule="auto" w:before="0" w:after="0"/>
               <w:ind w:firstLine="0"/>
               <w:jc w:val="center"/>
@@ -5026,6 +5130,7 @@
           </w:tcPr>
           <w:p>
             <w:pPr>
+              <w:keepNext/>
               <w:spacing w:line="240" w:lineRule="auto" w:before="0" w:after="0"/>
               <w:ind w:firstLine="0"/>
               <w:jc w:val="center"/>
@@ -5047,6 +5152,7 @@
           </w:tcPr>
           <w:p>
             <w:pPr>
+              <w:keepNext/>
               <w:spacing w:line="240" w:lineRule="auto" w:before="0" w:after="0"/>
               <w:ind w:firstLine="0"/>
               <w:jc w:val="center"/>
@@ -5073,6 +5179,7 @@
           </w:tcPr>
           <w:p>
             <w:pPr>
+              <w:keepNext/>
               <w:spacing w:line="240" w:lineRule="auto" w:before="0" w:after="0"/>
               <w:ind w:firstLine="0"/>
               <w:jc w:val="left"/>
@@ -5094,6 +5201,7 @@
           </w:tcPr>
           <w:p>
             <w:pPr>
+              <w:keepNext/>
               <w:spacing w:line="240" w:lineRule="auto" w:before="0" w:after="0"/>
               <w:ind w:firstLine="0"/>
               <w:jc w:val="center"/>
@@ -5115,6 +5223,7 @@
           </w:tcPr>
           <w:p>
             <w:pPr>
+              <w:keepNext/>
               <w:spacing w:line="240" w:lineRule="auto" w:before="0" w:after="0"/>
               <w:ind w:firstLine="0"/>
               <w:jc w:val="center"/>
@@ -5136,6 +5245,7 @@
           </w:tcPr>
           <w:p>
             <w:pPr>
+              <w:keepNext/>
               <w:spacing w:line="240" w:lineRule="auto" w:before="0" w:after="0"/>
               <w:ind w:firstLine="0"/>
               <w:jc w:val="center"/>
@@ -5157,6 +5267,7 @@
           </w:tcPr>
           <w:p>
             <w:pPr>
+              <w:keepNext/>
               <w:spacing w:line="240" w:lineRule="auto" w:before="0" w:after="0"/>
               <w:ind w:firstLine="0"/>
               <w:jc w:val="center"/>
@@ -5178,6 +5289,7 @@
           </w:tcPr>
           <w:p>
             <w:pPr>
+              <w:keepNext/>
               <w:spacing w:line="240" w:lineRule="auto" w:before="0" w:after="0"/>
               <w:ind w:firstLine="0"/>
               <w:jc w:val="center"/>
@@ -5199,6 +5311,7 @@
           </w:tcPr>
           <w:p>
             <w:pPr>
+              <w:keepNext/>
               <w:spacing w:line="240" w:lineRule="auto" w:before="0" w:after="0"/>
               <w:ind w:firstLine="0"/>
               <w:jc w:val="center"/>
@@ -5225,6 +5338,7 @@
           </w:tcPr>
           <w:p>
             <w:pPr>
+              <w:keepNext/>
               <w:spacing w:line="240" w:lineRule="auto" w:before="0" w:after="0"/>
               <w:ind w:firstLine="0"/>
               <w:jc w:val="left"/>
@@ -5246,6 +5360,7 @@
           </w:tcPr>
           <w:p>
             <w:pPr>
+              <w:keepNext/>
               <w:spacing w:line="240" w:lineRule="auto" w:before="0" w:after="0"/>
               <w:ind w:firstLine="0"/>
               <w:jc w:val="center"/>
@@ -5267,6 +5382,7 @@
           </w:tcPr>
           <w:p>
             <w:pPr>
+              <w:keepNext/>
               <w:spacing w:line="240" w:lineRule="auto" w:before="0" w:after="0"/>
               <w:ind w:firstLine="0"/>
               <w:jc w:val="center"/>
@@ -5288,6 +5404,7 @@
           </w:tcPr>
           <w:p>
             <w:pPr>
+              <w:keepNext/>
               <w:spacing w:line="240" w:lineRule="auto" w:before="0" w:after="0"/>
               <w:ind w:firstLine="0"/>
               <w:jc w:val="center"/>
@@ -5309,6 +5426,7 @@
           </w:tcPr>
           <w:p>
             <w:pPr>
+              <w:keepNext/>
               <w:spacing w:line="240" w:lineRule="auto" w:before="0" w:after="0"/>
               <w:ind w:firstLine="0"/>
               <w:jc w:val="center"/>
@@ -5330,6 +5448,7 @@
           </w:tcPr>
           <w:p>
             <w:pPr>
+              <w:keepNext/>
               <w:spacing w:line="240" w:lineRule="auto" w:before="0" w:after="0"/>
               <w:ind w:firstLine="0"/>
               <w:jc w:val="center"/>
@@ -5351,6 +5470,7 @@
           </w:tcPr>
           <w:p>
             <w:pPr>
+              <w:keepNext/>
               <w:spacing w:line="240" w:lineRule="auto" w:before="0" w:after="0"/>
               <w:ind w:firstLine="0"/>
               <w:jc w:val="center"/>
@@ -5377,6 +5497,7 @@
           </w:tcPr>
           <w:p>
             <w:pPr>
+              <w:keepNext/>
               <w:spacing w:line="240" w:lineRule="auto" w:before="0" w:after="0"/>
               <w:ind w:firstLine="0"/>
               <w:jc w:val="left"/>
@@ -5398,6 +5519,7 @@
           </w:tcPr>
           <w:p>
             <w:pPr>
+              <w:keepNext/>
               <w:spacing w:line="240" w:lineRule="auto" w:before="0" w:after="0"/>
               <w:ind w:firstLine="0"/>
               <w:jc w:val="center"/>
@@ -5419,6 +5541,7 @@
           </w:tcPr>
           <w:p>
             <w:pPr>
+              <w:keepNext/>
               <w:spacing w:line="240" w:lineRule="auto" w:before="0" w:after="0"/>
               <w:ind w:firstLine="0"/>
               <w:jc w:val="center"/>
@@ -5440,6 +5563,7 @@
           </w:tcPr>
           <w:p>
             <w:pPr>
+              <w:keepNext/>
               <w:spacing w:line="240" w:lineRule="auto" w:before="0" w:after="0"/>
               <w:ind w:firstLine="0"/>
               <w:jc w:val="center"/>
@@ -5461,6 +5585,7 @@
           </w:tcPr>
           <w:p>
             <w:pPr>
+              <w:keepNext/>
               <w:spacing w:line="240" w:lineRule="auto" w:before="0" w:after="0"/>
               <w:ind w:firstLine="0"/>
               <w:jc w:val="center"/>
@@ -5482,6 +5607,7 @@
           </w:tcPr>
           <w:p>
             <w:pPr>
+              <w:keepNext/>
               <w:spacing w:line="240" w:lineRule="auto" w:before="0" w:after="0"/>
               <w:ind w:firstLine="0"/>
               <w:jc w:val="center"/>
@@ -5503,6 +5629,7 @@
           </w:tcPr>
           <w:p>
             <w:pPr>
+              <w:keepNext/>
               <w:spacing w:line="240" w:lineRule="auto" w:before="0" w:after="0"/>
               <w:ind w:firstLine="0"/>
               <w:jc w:val="center"/>
@@ -5529,6 +5656,7 @@
           </w:tcPr>
           <w:p>
             <w:pPr>
+              <w:keepNext/>
               <w:spacing w:line="240" w:lineRule="auto" w:before="0" w:after="0"/>
               <w:ind w:firstLine="0"/>
               <w:jc w:val="left"/>
@@ -5550,6 +5678,7 @@
           </w:tcPr>
           <w:p>
             <w:pPr>
+              <w:keepNext/>
               <w:spacing w:line="240" w:lineRule="auto" w:before="0" w:after="0"/>
               <w:ind w:firstLine="0"/>
               <w:jc w:val="center"/>
@@ -5571,6 +5700,7 @@
           </w:tcPr>
           <w:p>
             <w:pPr>
+              <w:keepNext/>
               <w:spacing w:line="240" w:lineRule="auto" w:before="0" w:after="0"/>
               <w:ind w:firstLine="0"/>
               <w:jc w:val="center"/>
@@ -5592,6 +5722,7 @@
           </w:tcPr>
           <w:p>
             <w:pPr>
+              <w:keepNext/>
               <w:spacing w:line="240" w:lineRule="auto" w:before="0" w:after="0"/>
               <w:ind w:firstLine="0"/>
               <w:jc w:val="center"/>
@@ -5613,6 +5744,7 @@
           </w:tcPr>
           <w:p>
             <w:pPr>
+              <w:keepNext/>
               <w:spacing w:line="240" w:lineRule="auto" w:before="0" w:after="0"/>
               <w:ind w:firstLine="0"/>
               <w:jc w:val="center"/>
@@ -5634,6 +5766,7 @@
           </w:tcPr>
           <w:p>
             <w:pPr>
+              <w:keepNext/>
               <w:spacing w:line="240" w:lineRule="auto" w:before="0" w:after="0"/>
               <w:ind w:firstLine="0"/>
               <w:jc w:val="center"/>
@@ -5655,6 +5788,7 @@
           </w:tcPr>
           <w:p>
             <w:pPr>
+              <w:keepNext/>
               <w:spacing w:line="240" w:lineRule="auto" w:before="0" w:after="0"/>
               <w:ind w:firstLine="0"/>
               <w:jc w:val="center"/>
@@ -5681,6 +5815,7 @@
           </w:tcPr>
           <w:p>
             <w:pPr>
+              <w:keepNext/>
               <w:spacing w:line="240" w:lineRule="auto" w:before="0" w:after="0"/>
               <w:ind w:firstLine="0"/>
               <w:jc w:val="left"/>
@@ -5702,6 +5837,7 @@
           </w:tcPr>
           <w:p>
             <w:pPr>
+              <w:keepNext/>
               <w:spacing w:line="240" w:lineRule="auto" w:before="0" w:after="0"/>
               <w:ind w:firstLine="0"/>
               <w:jc w:val="center"/>
@@ -5723,6 +5859,7 @@
           </w:tcPr>
           <w:p>
             <w:pPr>
+              <w:keepNext/>
               <w:spacing w:line="240" w:lineRule="auto" w:before="0" w:after="0"/>
               <w:ind w:firstLine="0"/>
               <w:jc w:val="center"/>
@@ -5744,6 +5881,7 @@
           </w:tcPr>
           <w:p>
             <w:pPr>
+              <w:keepNext/>
               <w:spacing w:line="240" w:lineRule="auto" w:before="0" w:after="0"/>
               <w:ind w:firstLine="0"/>
               <w:jc w:val="center"/>
@@ -5765,6 +5903,7 @@
           </w:tcPr>
           <w:p>
             <w:pPr>
+              <w:keepNext/>
               <w:spacing w:line="240" w:lineRule="auto" w:before="0" w:after="0"/>
               <w:ind w:firstLine="0"/>
               <w:jc w:val="center"/>
@@ -5786,6 +5925,7 @@
           </w:tcPr>
           <w:p>
             <w:pPr>
+              <w:keepNext/>
               <w:spacing w:line="240" w:lineRule="auto" w:before="0" w:after="0"/>
               <w:ind w:firstLine="0"/>
               <w:jc w:val="center"/>
@@ -5807,6 +5947,7 @@
           </w:tcPr>
           <w:p>
             <w:pPr>
+              <w:keepNext/>
               <w:spacing w:line="240" w:lineRule="auto" w:before="0" w:after="0"/>
               <w:ind w:firstLine="0"/>
               <w:jc w:val="center"/>
@@ -5826,6 +5967,7 @@
     </w:tbl>
     <w:p>
       <w:pPr>
+        <w:keepNext/>
         <w:spacing w:after="0"/>
       </w:pPr>
     </w:p>
@@ -5845,6 +5987,7 @@
     <w:p>
       <w:pPr>
         <w:pStyle w:val="BodyText2026"/>
+        <w:keepNext/>
       </w:pPr>
       <w:r>
         <w:rPr>
@@ -5944,6 +6087,7 @@
           </w:tcPr>
           <w:p>
             <w:pPr>
+              <w:keepNext/>
               <w:spacing w:line="240" w:lineRule="auto" w:before="0" w:after="0"/>
               <w:ind w:firstLine="0"/>
               <w:jc w:val="left"/>
@@ -5960,6 +6104,7 @@
           </w:p>
           <w:p>
             <w:pPr>
+              <w:keepNext/>
               <w:spacing w:line="240" w:lineRule="auto" w:before="0" w:after="0"/>
               <w:ind w:firstLine="0"/>
               <w:jc w:val="left"/>
@@ -5976,6 +6121,7 @@
           </w:p>
           <w:p>
             <w:pPr>
+              <w:keepNext/>
               <w:spacing w:line="240" w:lineRule="auto" w:before="0" w:after="0"/>
               <w:ind w:firstLine="0"/>
               <w:jc w:val="left"/>
@@ -5992,6 +6138,7 @@
           </w:p>
           <w:p>
             <w:pPr>
+              <w:keepNext/>
               <w:spacing w:line="240" w:lineRule="auto" w:before="0" w:after="0"/>
               <w:ind w:firstLine="0"/>
               <w:jc w:val="left"/>
@@ -6008,6 +6155,7 @@
           </w:p>
           <w:p>
             <w:pPr>
+              <w:keepNext/>
               <w:spacing w:line="240" w:lineRule="auto" w:before="0" w:after="0"/>
               <w:ind w:firstLine="0"/>
               <w:jc w:val="left"/>
@@ -6024,6 +6172,7 @@
           </w:p>
           <w:p>
             <w:pPr>
+              <w:keepNext/>
               <w:spacing w:line="240" w:lineRule="auto" w:before="0" w:after="0"/>
               <w:ind w:firstLine="0"/>
               <w:jc w:val="left"/>
@@ -6045,6 +6194,7 @@
           </w:tcPr>
           <w:p>
             <w:pPr>
+              <w:keepNext/>
               <w:spacing w:line="240" w:lineRule="auto" w:before="0" w:after="0"/>
               <w:ind w:firstLine="0"/>
               <w:jc w:val="left"/>
@@ -6061,6 +6211,7 @@
           </w:p>
           <w:p>
             <w:pPr>
+              <w:keepNext/>
               <w:spacing w:line="240" w:lineRule="auto" w:before="0" w:after="0"/>
               <w:ind w:firstLine="0"/>
               <w:jc w:val="left"/>
@@ -6077,6 +6228,7 @@
           </w:p>
           <w:p>
             <w:pPr>
+              <w:keepNext/>
               <w:spacing w:line="240" w:lineRule="auto" w:before="0" w:after="0"/>
               <w:ind w:firstLine="0"/>
               <w:jc w:val="left"/>
@@ -6093,6 +6245,7 @@
           </w:p>
           <w:p>
             <w:pPr>
+              <w:keepNext/>
               <w:spacing w:line="240" w:lineRule="auto" w:before="0" w:after="0"/>
               <w:ind w:firstLine="0"/>
               <w:jc w:val="left"/>
@@ -6109,6 +6262,7 @@
           </w:p>
           <w:p>
             <w:pPr>
+              <w:keepNext/>
               <w:spacing w:line="240" w:lineRule="auto" w:before="0" w:after="0"/>
               <w:ind w:firstLine="0"/>
               <w:jc w:val="left"/>
@@ -6133,6 +6287,7 @@
           </w:tcPr>
           <w:p>
             <w:pPr>
+              <w:keepNext/>
               <w:spacing w:line="240" w:lineRule="auto" w:before="0" w:after="0"/>
               <w:ind w:firstLine="0"/>
               <w:jc w:val="center"/>
@@ -6155,6 +6310,7 @@
           </w:tcPr>
           <w:p>
             <w:pPr>
+              <w:keepNext/>
               <w:spacing w:line="240" w:lineRule="auto" w:before="0" w:after="0"/>
               <w:ind w:firstLine="0"/>
               <w:jc w:val="center"/>
@@ -6181,6 +6337,7 @@
           </w:tcPr>
           <w:p>
             <w:pPr>
+              <w:keepNext/>
               <w:spacing w:line="240" w:lineRule="auto" w:before="0" w:after="0"/>
               <w:ind w:firstLine="0"/>
               <w:jc w:val="left"/>
@@ -6197,6 +6354,7 @@
           </w:p>
           <w:p>
             <w:pPr>
+              <w:keepNext/>
               <w:spacing w:line="240" w:lineRule="auto" w:before="0" w:after="0"/>
               <w:ind w:firstLine="0"/>
               <w:jc w:val="left"/>
@@ -6213,6 +6371,7 @@
           </w:p>
           <w:p>
             <w:pPr>
+              <w:keepNext/>
               <w:spacing w:line="240" w:lineRule="auto" w:before="0" w:after="0"/>
               <w:ind w:firstLine="0"/>
               <w:jc w:val="left"/>
@@ -6229,6 +6388,7 @@
           </w:p>
           <w:p>
             <w:pPr>
+              <w:keepNext/>
               <w:spacing w:line="240" w:lineRule="auto" w:before="0" w:after="0"/>
               <w:ind w:firstLine="0"/>
               <w:jc w:val="left"/>
@@ -6245,6 +6405,7 @@
           </w:p>
           <w:p>
             <w:pPr>
+              <w:keepNext/>
               <w:spacing w:line="240" w:lineRule="auto" w:before="0" w:after="0"/>
               <w:ind w:firstLine="0"/>
               <w:jc w:val="left"/>
@@ -6266,6 +6427,7 @@
           </w:tcPr>
           <w:p>
             <w:pPr>
+              <w:keepNext/>
               <w:spacing w:line="240" w:lineRule="auto" w:before="0" w:after="0"/>
               <w:ind w:firstLine="0"/>
               <w:jc w:val="left"/>
@@ -6282,6 +6444,7 @@
           </w:p>
           <w:p>
             <w:pPr>
+              <w:keepNext/>
               <w:spacing w:line="240" w:lineRule="auto" w:before="0" w:after="0"/>
               <w:ind w:firstLine="0"/>
               <w:jc w:val="left"/>
@@ -6298,6 +6461,7 @@
           </w:p>
           <w:p>
             <w:pPr>
+              <w:keepNext/>
               <w:spacing w:line="240" w:lineRule="auto" w:before="0" w:after="0"/>
               <w:ind w:firstLine="0"/>
               <w:jc w:val="left"/>
@@ -6314,6 +6478,7 @@
           </w:p>
           <w:p>
             <w:pPr>
+              <w:keepNext/>
               <w:spacing w:line="240" w:lineRule="auto" w:before="0" w:after="0"/>
               <w:ind w:firstLine="0"/>
               <w:jc w:val="left"/>
@@ -6330,6 +6495,7 @@
           </w:p>
           <w:p>
             <w:pPr>
+              <w:keepNext/>
               <w:spacing w:line="240" w:lineRule="auto" w:before="0" w:after="0"/>
               <w:ind w:firstLine="0"/>
               <w:jc w:val="left"/>
@@ -6349,6 +6515,7 @@
     </w:tbl>
     <w:p>
       <w:pPr>
+        <w:keepNext/>
         <w:spacing w:after="0"/>
       </w:pPr>
     </w:p>
@@ -6398,6 +6565,7 @@
     <w:p>
       <w:pPr>
         <w:pStyle w:val="BodyText2026"/>
+        <w:keepNext/>
       </w:pPr>
       <w:r>
         <w:rPr>
@@ -6545,6 +6713,7 @@
           </w:tcPr>
           <w:p>
             <w:pPr>
+              <w:keepNext/>
               <w:spacing w:line="240" w:lineRule="auto" w:before="0" w:after="0"/>
               <w:ind w:firstLine="0"/>
               <w:jc w:val="left"/>
@@ -6566,6 +6735,7 @@
           </w:tcPr>
           <w:p>
             <w:pPr>
+              <w:keepNext/>
               <w:spacing w:line="240" w:lineRule="auto" w:before="0" w:after="0"/>
               <w:ind w:firstLine="0"/>
               <w:jc w:val="left"/>
@@ -6587,6 +6757,7 @@
           </w:tcPr>
           <w:p>
             <w:pPr>
+              <w:keepNext/>
               <w:spacing w:line="240" w:lineRule="auto" w:before="0" w:after="0"/>
               <w:ind w:firstLine="0"/>
               <w:jc w:val="left"/>
@@ -6608,6 +6779,7 @@
           </w:tcPr>
           <w:p>
             <w:pPr>
+              <w:keepNext/>
               <w:spacing w:line="240" w:lineRule="auto" w:before="0" w:after="0"/>
               <w:ind w:firstLine="0"/>
               <w:jc w:val="left"/>
@@ -6634,6 +6806,7 @@
           </w:tcPr>
           <w:p>
             <w:pPr>
+              <w:keepNext/>
               <w:spacing w:line="240" w:lineRule="auto" w:before="0" w:after="0"/>
               <w:ind w:firstLine="0"/>
               <w:jc w:val="left"/>
@@ -6655,6 +6828,7 @@
           </w:tcPr>
           <w:p>
             <w:pPr>
+              <w:keepNext/>
               <w:spacing w:line="240" w:lineRule="auto" w:before="0" w:after="0"/>
               <w:ind w:firstLine="0"/>
               <w:jc w:val="left"/>
@@ -6676,6 +6850,7 @@
           </w:tcPr>
           <w:p>
             <w:pPr>
+              <w:keepNext/>
               <w:spacing w:line="240" w:lineRule="auto" w:before="0" w:after="0"/>
               <w:ind w:firstLine="0"/>
               <w:jc w:val="left"/>
@@ -6697,6 +6872,7 @@
           </w:tcPr>
           <w:p>
             <w:pPr>
+              <w:keepNext/>
               <w:spacing w:line="240" w:lineRule="auto" w:before="0" w:after="0"/>
               <w:ind w:firstLine="0"/>
               <w:jc w:val="left"/>
@@ -6723,6 +6899,7 @@
           </w:tcPr>
           <w:p>
             <w:pPr>
+              <w:keepNext/>
               <w:spacing w:line="240" w:lineRule="auto" w:before="0" w:after="0"/>
               <w:ind w:firstLine="0"/>
               <w:jc w:val="left"/>
@@ -6744,6 +6921,7 @@
           </w:tcPr>
           <w:p>
             <w:pPr>
+              <w:keepNext/>
               <w:spacing w:line="240" w:lineRule="auto" w:before="0" w:after="0"/>
               <w:ind w:firstLine="0"/>
               <w:jc w:val="left"/>
@@ -6765,6 +6943,7 @@
           </w:tcPr>
           <w:p>
             <w:pPr>
+              <w:keepNext/>
               <w:spacing w:line="240" w:lineRule="auto" w:before="0" w:after="0"/>
               <w:ind w:firstLine="0"/>
               <w:jc w:val="left"/>
@@ -6786,6 +6965,7 @@
           </w:tcPr>
           <w:p>
             <w:pPr>
+              <w:keepNext/>
               <w:spacing w:line="240" w:lineRule="auto" w:before="0" w:after="0"/>
               <w:ind w:firstLine="0"/>
               <w:jc w:val="left"/>
@@ -6805,6 +6985,7 @@
     </w:tbl>
     <w:p>
       <w:pPr>
+        <w:keepNext/>
         <w:spacing w:after="0"/>
       </w:pPr>
     </w:p>
@@ -6927,6 +7108,7 @@
     <w:p>
       <w:pPr>
         <w:pStyle w:val="BodyText2026"/>
+        <w:keepNext/>
       </w:pPr>
       <w:r>
         <w:rPr>
@@ -7026,6 +7208,7 @@
           </w:tcPr>
           <w:p>
             <w:pPr>
+              <w:keepNext/>
               <w:spacing w:line="240" w:lineRule="auto" w:before="0" w:after="0"/>
               <w:ind w:firstLine="0"/>
               <w:jc w:val="left"/>
@@ -7047,6 +7230,7 @@
           </w:tcPr>
           <w:p>
             <w:pPr>
+              <w:keepNext/>
               <w:spacing w:line="240" w:lineRule="auto" w:before="0" w:after="0"/>
               <w:ind w:firstLine="0"/>
               <w:jc w:val="left"/>
@@ -7073,6 +7257,7 @@
           </w:tcPr>
           <w:p>
             <w:pPr>
+              <w:keepNext/>
               <w:spacing w:line="240" w:lineRule="auto" w:before="0" w:after="0"/>
               <w:ind w:firstLine="0"/>
               <w:jc w:val="left"/>
@@ -7094,6 +7279,7 @@
           </w:tcPr>
           <w:p>
             <w:pPr>
+              <w:keepNext/>
               <w:spacing w:line="240" w:lineRule="auto" w:before="0" w:after="0"/>
               <w:ind w:firstLine="0"/>
               <w:jc w:val="left"/>
@@ -7120,6 +7306,7 @@
           </w:tcPr>
           <w:p>
             <w:pPr>
+              <w:keepNext/>
               <w:spacing w:line="240" w:lineRule="auto" w:before="0" w:after="0"/>
               <w:ind w:firstLine="0"/>
               <w:jc w:val="left"/>
@@ -7141,6 +7328,7 @@
           </w:tcPr>
           <w:p>
             <w:pPr>
+              <w:keepNext/>
               <w:spacing w:line="240" w:lineRule="auto" w:before="0" w:after="0"/>
               <w:ind w:firstLine="0"/>
               <w:jc w:val="left"/>
@@ -7167,6 +7355,7 @@
           </w:tcPr>
           <w:p>
             <w:pPr>
+              <w:keepNext/>
               <w:spacing w:line="240" w:lineRule="auto" w:before="0" w:after="0"/>
               <w:ind w:firstLine="0"/>
               <w:jc w:val="left"/>
@@ -7188,6 +7377,7 @@
           </w:tcPr>
           <w:p>
             <w:pPr>
+              <w:keepNext/>
               <w:spacing w:line="240" w:lineRule="auto" w:before="0" w:after="0"/>
               <w:ind w:firstLine="0"/>
               <w:jc w:val="left"/>
@@ -7214,6 +7404,7 @@
           </w:tcPr>
           <w:p>
             <w:pPr>
+              <w:keepNext/>
               <w:spacing w:line="240" w:lineRule="auto" w:before="0" w:after="0"/>
               <w:ind w:firstLine="0"/>
               <w:jc w:val="left"/>
@@ -7235,6 +7426,7 @@
           </w:tcPr>
           <w:p>
             <w:pPr>
+              <w:keepNext/>
               <w:spacing w:line="240" w:lineRule="auto" w:before="0" w:after="0"/>
               <w:ind w:firstLine="0"/>
               <w:jc w:val="left"/>
@@ -7261,6 +7453,7 @@
           </w:tcPr>
           <w:p>
             <w:pPr>
+              <w:keepNext/>
               <w:spacing w:line="240" w:lineRule="auto" w:before="0" w:after="0"/>
               <w:ind w:firstLine="0"/>
               <w:jc w:val="left"/>
@@ -7282,6 +7475,7 @@
           </w:tcPr>
           <w:p>
             <w:pPr>
+              <w:keepNext/>
               <w:spacing w:line="240" w:lineRule="auto" w:before="0" w:after="0"/>
               <w:ind w:firstLine="0"/>
               <w:jc w:val="left"/>
@@ -7308,6 +7502,7 @@
           </w:tcPr>
           <w:p>
             <w:pPr>
+              <w:keepNext/>
               <w:spacing w:line="240" w:lineRule="auto" w:before="0" w:after="0"/>
               <w:ind w:firstLine="0"/>
               <w:jc w:val="left"/>
@@ -7329,6 +7524,7 @@
           </w:tcPr>
           <w:p>
             <w:pPr>
+              <w:keepNext/>
               <w:spacing w:line="240" w:lineRule="auto" w:before="0" w:after="0"/>
               <w:ind w:firstLine="0"/>
               <w:jc w:val="left"/>
@@ -7348,12 +7544,27 @@
     </w:tbl>
     <w:p>
       <w:pPr>
+        <w:keepNext/>
         <w:spacing w:after="0"/>
       </w:pPr>
     </w:p>
     <w:p>
       <w:pPr>
         <w:pStyle w:val="BodyText2026"/>
+      </w:pPr>
+      <w:r>
+        <w:rPr>
+          <w:rFonts w:ascii="Times New Roman" w:hAnsi="Times New Roman" w:cs="Times New Roman" w:eastAsia="Times New Roman"/>
+          <w:color w:val="000000"/>
+          <w:sz w:val="24"/>
+        </w:rPr>
+        <w:t>Ion is not against technology, but he will not spend an evening learning a new system during the harvest. For him a platform is useful only if it saves time from the very first offer he publishes.</w:t>
+      </w:r>
+    </w:p>
+    <w:p>
+      <w:pPr>
+        <w:pStyle w:val="BodyText2026"/>
+        <w:keepNext/>
       </w:pPr>
       <w:r>
         <w:rPr>
@@ -7453,6 +7664,7 @@
           </w:tcPr>
           <w:p>
             <w:pPr>
+              <w:keepNext/>
               <w:spacing w:line="240" w:lineRule="auto" w:before="0" w:after="0"/>
               <w:ind w:firstLine="0"/>
               <w:jc w:val="left"/>
@@ -7474,6 +7686,7 @@
           </w:tcPr>
           <w:p>
             <w:pPr>
+              <w:keepNext/>
               <w:spacing w:line="240" w:lineRule="auto" w:before="0" w:after="0"/>
               <w:ind w:firstLine="0"/>
               <w:jc w:val="left"/>
@@ -7500,6 +7713,7 @@
           </w:tcPr>
           <w:p>
             <w:pPr>
+              <w:keepNext/>
               <w:spacing w:line="240" w:lineRule="auto" w:before="0" w:after="0"/>
               <w:ind w:firstLine="0"/>
               <w:jc w:val="left"/>
@@ -7521,6 +7735,7 @@
           </w:tcPr>
           <w:p>
             <w:pPr>
+              <w:keepNext/>
               <w:spacing w:line="240" w:lineRule="auto" w:before="0" w:after="0"/>
               <w:ind w:firstLine="0"/>
               <w:jc w:val="left"/>
@@ -7547,6 +7762,7 @@
           </w:tcPr>
           <w:p>
             <w:pPr>
+              <w:keepNext/>
               <w:spacing w:line="240" w:lineRule="auto" w:before="0" w:after="0"/>
               <w:ind w:firstLine="0"/>
               <w:jc w:val="left"/>
@@ -7568,6 +7784,7 @@
           </w:tcPr>
           <w:p>
             <w:pPr>
+              <w:keepNext/>
               <w:spacing w:line="240" w:lineRule="auto" w:before="0" w:after="0"/>
               <w:ind w:firstLine="0"/>
               <w:jc w:val="left"/>
@@ -7594,6 +7811,7 @@
           </w:tcPr>
           <w:p>
             <w:pPr>
+              <w:keepNext/>
               <w:spacing w:line="240" w:lineRule="auto" w:before="0" w:after="0"/>
               <w:ind w:firstLine="0"/>
               <w:jc w:val="left"/>
@@ -7615,6 +7833,7 @@
           </w:tcPr>
           <w:p>
             <w:pPr>
+              <w:keepNext/>
               <w:spacing w:line="240" w:lineRule="auto" w:before="0" w:after="0"/>
               <w:ind w:firstLine="0"/>
               <w:jc w:val="left"/>
@@ -7641,6 +7860,7 @@
           </w:tcPr>
           <w:p>
             <w:pPr>
+              <w:keepNext/>
               <w:spacing w:line="240" w:lineRule="auto" w:before="0" w:after="0"/>
               <w:ind w:firstLine="0"/>
               <w:jc w:val="left"/>
@@ -7662,6 +7882,7 @@
           </w:tcPr>
           <w:p>
             <w:pPr>
+              <w:keepNext/>
               <w:spacing w:line="240" w:lineRule="auto" w:before="0" w:after="0"/>
               <w:ind w:firstLine="0"/>
               <w:jc w:val="left"/>
@@ -7688,6 +7909,7 @@
           </w:tcPr>
           <w:p>
             <w:pPr>
+              <w:keepNext/>
               <w:spacing w:line="240" w:lineRule="auto" w:before="0" w:after="0"/>
               <w:ind w:firstLine="0"/>
               <w:jc w:val="left"/>
@@ -7709,6 +7931,7 @@
           </w:tcPr>
           <w:p>
             <w:pPr>
+              <w:keepNext/>
               <w:spacing w:line="240" w:lineRule="auto" w:before="0" w:after="0"/>
               <w:ind w:firstLine="0"/>
               <w:jc w:val="left"/>
@@ -7735,6 +7958,7 @@
           </w:tcPr>
           <w:p>
             <w:pPr>
+              <w:keepNext/>
               <w:spacing w:line="240" w:lineRule="auto" w:before="0" w:after="0"/>
               <w:ind w:firstLine="0"/>
               <w:jc w:val="left"/>
@@ -7756,6 +7980,7 @@
           </w:tcPr>
           <w:p>
             <w:pPr>
+              <w:keepNext/>
               <w:spacing w:line="240" w:lineRule="auto" w:before="0" w:after="0"/>
               <w:ind w:firstLine="0"/>
               <w:jc w:val="left"/>
@@ -7775,6 +8000,7 @@
     </w:tbl>
     <w:p>
       <w:pPr>
+        <w:keepNext/>
         <w:spacing w:after="0"/>
       </w:pPr>
     </w:p>
@@ -8209,6 +8435,7 @@
     <w:p>
       <w:pPr>
         <w:pStyle w:val="Heading2"/>
+        <w:keepNext/>
         <w:ind w:firstLine="0"/>
         <w:jc w:val="center"/>
       </w:pPr>
@@ -8227,6 +8454,7 @@
     <w:p>
       <w:pPr>
         <w:pStyle w:val="BodyText2026"/>
+        <w:keepNext/>
       </w:pPr>
       <w:r>
         <w:rPr>
@@ -8255,6 +8483,7 @@
           </w:tcPr>
           <w:p>
             <w:pPr>
+              <w:keepNext/>
               <w:spacing w:line="240" w:lineRule="auto" w:before="0" w:after="60"/>
               <w:ind w:firstLine="0"/>
               <w:jc w:val="left"/>
@@ -8276,6 +8505,7 @@
           </w:tcPr>
           <w:p>
             <w:pPr>
+              <w:keepNext/>
               <w:spacing w:line="240" w:lineRule="auto" w:before="0" w:after="60"/>
               <w:ind w:firstLine="0"/>
               <w:jc w:val="left"/>
@@ -8299,6 +8529,7 @@
           </w:tcPr>
           <w:p>
             <w:pPr>
+              <w:keepNext/>
               <w:spacing w:line="240" w:lineRule="auto" w:before="0" w:after="60"/>
               <w:ind w:firstLine="0"/>
               <w:jc w:val="left"/>
@@ -8320,6 +8551,7 @@
           </w:tcPr>
           <w:p>
             <w:pPr>
+              <w:keepNext/>
               <w:spacing w:line="240" w:lineRule="auto" w:before="0" w:after="60"/>
               <w:ind w:firstLine="0"/>
               <w:jc w:val="left"/>
@@ -8343,6 +8575,7 @@
           </w:tcPr>
           <w:p>
             <w:pPr>
+              <w:keepNext/>
               <w:spacing w:line="240" w:lineRule="auto" w:before="0" w:after="60"/>
               <w:ind w:firstLine="0"/>
               <w:jc w:val="left"/>
@@ -8364,6 +8597,7 @@
           </w:tcPr>
           <w:p>
             <w:pPr>
+              <w:keepNext/>
               <w:spacing w:line="240" w:lineRule="auto" w:before="0" w:after="60"/>
               <w:ind w:firstLine="0"/>
               <w:jc w:val="left"/>
@@ -8380,6 +8614,7 @@
           </w:p>
           <w:p>
             <w:pPr>
+              <w:keepNext/>
               <w:spacing w:line="240" w:lineRule="auto" w:before="0" w:after="60"/>
               <w:ind w:firstLine="0"/>
               <w:jc w:val="left"/>
@@ -8396,6 +8631,7 @@
           </w:p>
           <w:p>
             <w:pPr>
+              <w:keepNext/>
               <w:spacing w:line="240" w:lineRule="auto" w:before="0" w:after="60"/>
               <w:ind w:firstLine="0"/>
               <w:jc w:val="left"/>
@@ -8412,6 +8648,7 @@
           </w:p>
           <w:p>
             <w:pPr>
+              <w:keepNext/>
               <w:spacing w:line="240" w:lineRule="auto" w:before="0" w:after="60"/>
               <w:ind w:firstLine="0"/>
               <w:jc w:val="left"/>
@@ -8428,6 +8665,7 @@
           </w:p>
           <w:p>
             <w:pPr>
+              <w:keepNext/>
               <w:spacing w:line="240" w:lineRule="auto" w:before="0" w:after="60"/>
               <w:ind w:firstLine="0"/>
               <w:jc w:val="left"/>
@@ -8444,6 +8682,7 @@
           </w:p>
           <w:p>
             <w:pPr>
+              <w:keepNext/>
               <w:spacing w:line="240" w:lineRule="auto" w:before="0" w:after="60"/>
               <w:ind w:firstLine="0"/>
               <w:jc w:val="left"/>
@@ -8460,6 +8699,7 @@
           </w:p>
           <w:p>
             <w:pPr>
+              <w:keepNext/>
               <w:spacing w:line="240" w:lineRule="auto" w:before="0" w:after="60"/>
               <w:ind w:firstLine="0"/>
               <w:jc w:val="left"/>
@@ -8477,7 +8717,11 @@
         </w:tc>
       </w:tr>
     </w:tbl>
-    <w:p/>
+    <w:p>
+      <w:pPr>
+        <w:keepNext/>
+      </w:pPr>
+    </w:p>
     <w:p>
       <w:pPr>
         <w:pStyle w:val="BodyText2026"/>

</xml_diff>

<commit_message>
docs: add section 1.5 Target audience and unique value proposition
Co-Authored-By: Claude Opus 5.5 <noreply@anthropic.com>
Claude-Session: https://claude.ai/code/session_01RkP9vNtLWcsuApJJdu9eVr
</commit_message>
<xml_diff>
--- a/docs/thesis/PBL_Report_Obrijan_Filip_FAF232.docx
+++ b/docs/thesis/PBL_Report_Obrijan_Filip_FAF232.docx
@@ -1067,7 +1067,7 @@
                 <w:rFonts w:ascii="Times New Roman" w:hAnsi="Times New Roman" w:cs="Times New Roman"/>
                 <w:noProof/>
               </w:rPr>
-              <w:t xml:space="preserve">1.4 Target users and needs analysis</w:t>
+              <w:t xml:space="preserve">1.4 Preliminary user research and needs analysis</w:t>
             </w:r>
             <w:r>
               <w:rPr>
@@ -1115,7 +1115,7 @@
         </w:p>
         <w:p>
           <w:pPr>
-            <w:pStyle w:val="TOC1"/>
+            <w:pStyle w:val="TOC2"/>
           </w:pPr>
           <w:hyperlink w:anchor="_Toc900107" w:history="1">
             <w:r>
@@ -1123,7 +1123,7 @@
                 <w:rFonts w:ascii="Times New Roman" w:hAnsi="Times New Roman" w:cs="Times New Roman"/>
                 <w:noProof/>
               </w:rPr>
-              <w:t xml:space="preserve">2 UML MODELLING OF THE SYSTEM</w:t>
+              <w:t xml:space="preserve">1.5 Target audience and unique value proposition</w:t>
             </w:r>
             <w:r>
               <w:rPr>
@@ -1158,7 +1158,7 @@
                 <w:rFonts w:ascii="Times New Roman" w:hAnsi="Times New Roman" w:cs="Times New Roman"/>
                 <w:noProof/>
               </w:rPr>
-              <w:t xml:space="preserve">17</w:t>
+              <w:t xml:space="preserve">14</w:t>
             </w:r>
             <w:r>
               <w:rPr>
@@ -1179,7 +1179,7 @@
                 <w:rFonts w:ascii="Times New Roman" w:hAnsi="Times New Roman" w:cs="Times New Roman"/>
                 <w:noProof/>
               </w:rPr>
-              <w:t xml:space="preserve">3 IMPLEMENTATION OF THE SYSTEM</w:t>
+              <w:t xml:space="preserve">2 UML MODELLING OF THE SYSTEM</w:t>
             </w:r>
             <w:r>
               <w:rPr>
@@ -1214,7 +1214,7 @@
                 <w:rFonts w:ascii="Times New Roman" w:hAnsi="Times New Roman" w:cs="Times New Roman"/>
                 <w:noProof/>
               </w:rPr>
-              <w:t xml:space="preserve">18</w:t>
+              <w:t xml:space="preserve">20</w:t>
             </w:r>
             <w:r>
               <w:rPr>
@@ -1235,7 +1235,7 @@
                 <w:rFonts w:ascii="Times New Roman" w:hAnsi="Times New Roman" w:cs="Times New Roman"/>
                 <w:noProof/>
               </w:rPr>
-              <w:t xml:space="preserve">CONCLUSIONS</w:t>
+              <w:t xml:space="preserve">3 IMPLEMENTATION OF THE SYSTEM</w:t>
             </w:r>
             <w:r>
               <w:rPr>
@@ -1270,7 +1270,7 @@
                 <w:rFonts w:ascii="Times New Roman" w:hAnsi="Times New Roman" w:cs="Times New Roman"/>
                 <w:noProof/>
               </w:rPr>
-              <w:t xml:space="preserve">19</w:t>
+              <w:t xml:space="preserve">21</w:t>
             </w:r>
             <w:r>
               <w:rPr>
@@ -1291,7 +1291,7 @@
                 <w:rFonts w:ascii="Times New Roman" w:hAnsi="Times New Roman" w:cs="Times New Roman"/>
                 <w:noProof/>
               </w:rPr>
-              <w:t xml:space="preserve">REFERENCES</w:t>
+              <w:t xml:space="preserve">CONCLUSIONS</w:t>
             </w:r>
             <w:r>
               <w:rPr>
@@ -1326,7 +1326,7 @@
                 <w:rFonts w:ascii="Times New Roman" w:hAnsi="Times New Roman" w:cs="Times New Roman"/>
                 <w:noProof/>
               </w:rPr>
-              <w:t xml:space="preserve">20</w:t>
+              <w:t xml:space="preserve">22</w:t>
             </w:r>
             <w:r>
               <w:rPr>
@@ -1347,7 +1347,7 @@
                 <w:rFonts w:ascii="Times New Roman" w:hAnsi="Times New Roman" w:cs="Times New Roman"/>
                 <w:noProof/>
               </w:rPr>
-              <w:t xml:space="preserve">APPENDICES</w:t>
+              <w:t xml:space="preserve">REFERENCES</w:t>
             </w:r>
             <w:r>
               <w:rPr>
@@ -1382,7 +1382,7 @@
                 <w:rFonts w:ascii="Times New Roman" w:hAnsi="Times New Roman" w:cs="Times New Roman"/>
                 <w:noProof/>
               </w:rPr>
-              <w:t xml:space="preserve">22</w:t>
+              <w:t xml:space="preserve">23</w:t>
             </w:r>
             <w:r>
               <w:rPr>
@@ -1395,7 +1395,7 @@
         </w:p>
         <w:p>
           <w:pPr>
-            <w:pStyle w:val="TOC2"/>
+            <w:pStyle w:val="TOC1"/>
           </w:pPr>
           <w:hyperlink w:anchor="_Toc900112" w:history="1">
             <w:r>
@@ -1403,7 +1403,7 @@
                 <w:rFonts w:ascii="Times New Roman" w:hAnsi="Times New Roman" w:cs="Times New Roman"/>
                 <w:noProof/>
               </w:rPr>
-              <w:t xml:space="preserve">APPENDIX A – Project proposal</w:t>
+              <w:t xml:space="preserve">APPENDICES</w:t>
             </w:r>
             <w:r>
               <w:rPr>
@@ -1438,7 +1438,7 @@
                 <w:rFonts w:ascii="Times New Roman" w:hAnsi="Times New Roman" w:cs="Times New Roman"/>
                 <w:noProof/>
               </w:rPr>
-              <w:t xml:space="preserve">22</w:t>
+              <w:t xml:space="preserve">25</w:t>
             </w:r>
             <w:r>
               <w:rPr>
@@ -1459,7 +1459,7 @@
                 <w:rFonts w:ascii="Times New Roman" w:hAnsi="Times New Roman" w:cs="Times New Roman"/>
                 <w:noProof/>
               </w:rPr>
-              <w:t xml:space="preserve">APPENDIX B – Questionnaire and interview guide</w:t>
+              <w:t xml:space="preserve">APPENDIX A – Project proposal</w:t>
             </w:r>
             <w:r>
               <w:rPr>
@@ -1494,7 +1494,63 @@
                 <w:rFonts w:ascii="Times New Roman" w:hAnsi="Times New Roman" w:cs="Times New Roman"/>
                 <w:noProof/>
               </w:rPr>
-              <w:t xml:space="preserve">23</w:t>
+              <w:t xml:space="preserve">25</w:t>
+            </w:r>
+            <w:r>
+              <w:rPr>
+                <w:rFonts w:ascii="Times New Roman" w:hAnsi="Times New Roman" w:cs="Times New Roman"/>
+                <w:noProof/>
+              </w:rPr>
+              <w:fldChar w:fldCharType="end"/>
+            </w:r>
+          </w:hyperlink>
+        </w:p>
+        <w:p>
+          <w:pPr>
+            <w:pStyle w:val="TOC2"/>
+          </w:pPr>
+          <w:hyperlink w:anchor="_Toc900114" w:history="1">
+            <w:r>
+              <w:rPr>
+                <w:rFonts w:ascii="Times New Roman" w:hAnsi="Times New Roman" w:cs="Times New Roman"/>
+                <w:noProof/>
+              </w:rPr>
+              <w:t xml:space="preserve">APPENDIX B – Questionnaire and interview guide</w:t>
+            </w:r>
+            <w:r>
+              <w:rPr>
+                <w:rFonts w:ascii="Times New Roman" w:hAnsi="Times New Roman" w:cs="Times New Roman"/>
+                <w:noProof/>
+              </w:rPr>
+              <w:tab/>
+            </w:r>
+            <w:r>
+              <w:rPr>
+                <w:rFonts w:ascii="Times New Roman" w:hAnsi="Times New Roman" w:cs="Times New Roman"/>
+                <w:noProof/>
+              </w:rPr>
+              <w:fldChar w:fldCharType="begin"/>
+            </w:r>
+            <w:r>
+              <w:rPr>
+                <w:rFonts w:ascii="Times New Roman" w:hAnsi="Times New Roman" w:cs="Times New Roman"/>
+                <w:noProof/>
+              </w:rPr>
+              <w:instrText xml:space="preserve"> PAGEREF _Toc900114 \h </w:instrText>
+            </w:r>
+            <w:r>
+              <w:rPr>
+                <w:rFonts w:ascii="Times New Roman" w:hAnsi="Times New Roman" w:cs="Times New Roman"/>
+                <w:noProof/>
+              </w:rPr>
+              <w:fldChar w:fldCharType="separate"/>
+            </w:r>
+            <w:r>
+              <w:rPr>
+                <w:rFonts w:ascii="Times New Roman" w:hAnsi="Times New Roman" w:cs="Times New Roman"/>
+                <w:noProof/>
+              </w:rPr>
+              <w:t xml:space="preserve">26</w:t>
             </w:r>
             <w:r>
               <w:rPr>
@@ -1559,7 +1615,7 @@
           <w:color w:val="auto"/>
         </w:rPr>
       </w:pPr>
-      <w:bookmarkStart w:id="114" w:name="_Toc900001"/>
+      <w:bookmarkStart w:id="115" w:name="_Toc900001"/>
       <w:bookmarkStart w:id="0" w:name="_Toc240368299"/>
       <w:r>
         <w:rPr>
@@ -1569,7 +1625,7 @@
         <w:t>ABSTRACT</w:t>
       </w:r>
       <w:bookmarkEnd w:id="0"/>
-      <w:bookmarkEnd w:id="114"/>
+      <w:bookmarkEnd w:id="115"/>
     </w:p>
     <w:p>
       <w:pPr>
@@ -2108,6 +2164,50 @@
                 <w:color w:val="000000"/>
                 <w:sz w:val="24"/>
               </w:rPr>
+              <w:t>UVP</w:t>
+            </w:r>
+          </w:p>
+        </w:tc>
+        <w:tc>
+          <w:tcPr>
+            <w:tcW w:type="dxa" w:w="7937"/>
+          </w:tcPr>
+          <w:p>
+            <w:pPr>
+              <w:spacing w:line="240" w:lineRule="auto" w:before="0" w:after="80"/>
+              <w:ind w:firstLine="0"/>
+              <w:jc w:val="left"/>
+            </w:pPr>
+            <w:r>
+              <w:rPr>
+                <w:rFonts w:ascii="Times New Roman" w:hAnsi="Times New Roman" w:cs="Times New Roman" w:eastAsia="Times New Roman"/>
+                <w:b w:val="0"/>
+                <w:color w:val="000000"/>
+                <w:sz w:val="24"/>
+              </w:rPr>
+              <w:t>– Unique Value Proposition</w:t>
+            </w:r>
+          </w:p>
+        </w:tc>
+      </w:tr>
+      <w:tr>
+        <w:tc>
+          <w:tcPr>
+            <w:tcW w:type="dxa" w:w="1701"/>
+          </w:tcPr>
+          <w:p>
+            <w:pPr>
+              <w:spacing w:line="240" w:lineRule="auto" w:before="0" w:after="80"/>
+              <w:ind w:firstLine="0"/>
+              <w:jc w:val="left"/>
+            </w:pPr>
+            <w:r>
+              <w:rPr>
+                <w:rFonts w:ascii="Times New Roman" w:hAnsi="Times New Roman" w:cs="Times New Roman" w:eastAsia="Times New Roman"/>
+                <w:b/>
+                <w:color w:val="000000"/>
+                <w:sz w:val="24"/>
+              </w:rPr>
               <w:t>TO-BE</w:t>
             </w:r>
           </w:p>
@@ -2242,7 +2342,7 @@
           <w:color w:val="000000"/>
           <w:sz w:val="24"/>
         </w:rPr>
-        <w:t>The chapter is organised as follows. Subchapter 1.1 describes the field, the participants and the current (AS-IS) process. Subchapter 1.2 formulates the problems together with their causes and consequences. Subchapter 1.3 reviews similar systems available on the market and ends with the SWOT analysis of the proposed idea. Subchapter 1.4 describes the target users, the working hypotheses about their needs together with the plan for validating them through interviews, and the profiles of the target users (personas). The technical specification and the functional and non-functional requirements that follow from these findings are formulated in subchapters 1.5 and 1.6.</w:t>
+        <w:t>The chapter is organised as follows. Subchapter 1.1 describes the field, the participants and the current (AS-IS) process. Subchapter 1.2 formulates the problems together with their causes and consequences. Subchapter 1.3 reviews similar systems available on the market and ends with the SWOT analysis of the proposed idea. Subchapter 1.4 presents the plan of the preliminary user research and the working hypotheses about the needs of the users. Subchapter 1.5 defines the target audience segments, the key problems solved by the platform and its unique value proposition. The technical specification and the functional and non-functional requirements that follow from these findings are formulated in subchapter 1.6.</w:t>
       </w:r>
     </w:p>
     <w:p>
@@ -6545,7 +6645,7 @@
           <w:color w:val="000000"/>
           <w:sz w:val="24"/>
         </w:rPr>
-        <w:t>1.4 Target users and needs analysis</w:t>
+        <w:t>1.4 Preliminary user research and needs analysis</w:t>
       </w:r>
       <w:bookmarkEnd w:id="106"/>
     </w:p>
@@ -7102,29 +7202,15 @@
           <w:color w:val="000000"/>
           <w:sz w:val="24"/>
         </w:rPr>
-        <w:t>The hypotheses that are not confirmed will lead to changes in the requirements formulated in subchapters 1.5 and 1.6, and any new need mentioned by the respondents will be added to the list of problems from Table 1.2. The same respondents are also planned to take part later in the testing of the prototype, so that the platform is evaluated by the people whose needs it is meant to solve.</w:t>
+        <w:t>The hypotheses that are not confirmed will lead to changes in the requirements formulated in subchapter 1.6, and any new need mentioned by the respondents will be added to the list of problems from Table 1.2. The same respondents are also planned to take part later in the testing of the prototype, so that the platform is evaluated by the people whose needs it is meant to solve.</w:t>
       </w:r>
     </w:p>
     <w:p>
       <w:pPr>
-        <w:pStyle w:val="BodyText2026"/>
-        <w:keepNext/>
-      </w:pPr>
-      <w:r>
-        <w:rPr>
-          <w:rFonts w:ascii="Times New Roman" w:hAnsi="Times New Roman" w:cs="Times New Roman" w:eastAsia="Times New Roman"/>
-          <w:color w:val="000000"/>
-          <w:sz w:val="24"/>
-        </w:rPr>
-        <w:t>Based on the domain analysis and on the working hypotheses above, the target users were described with the help of personas. A persona is a fictional but realistic profile that brings together the typical goals, habits and frustrations of a group of users [14]. Personas help to keep the design focused on concrete people instead of an abstract "user". Two main personas were defined, one for each side of the transaction. The administrator role is internal and is described later, in the technical specification. The first persona, the producer, is shown in Table 1.7.</w:t>
-      </w:r>
-    </w:p>
-    <w:p>
-      <w:pPr>
-        <w:keepNext/>
-        <w:spacing w:before="120"/>
-        <w:jc w:val="right"/>
-      </w:pPr>
+        <w:pStyle w:val="Heading2"/>
+        <w:ind w:firstLine="709"/>
+      </w:pPr>
+      <w:bookmarkStart w:id="107" w:name="_Toc900107"/>
       <w:r>
         <w:rPr>
           <w:rFonts w:ascii="Times New Roman" w:hAnsi="Times New Roman" w:cs="Times New Roman" w:eastAsia="Times New Roman"/>
@@ -7132,7 +7218,696 @@
           <w:color w:val="000000"/>
           <w:sz w:val="24"/>
         </w:rPr>
-        <w:t>Table 1.7 – Persona 1: the seller (agricultural producer)</w:t>
+        <w:t>1.5 Target audience and unique value proposition</w:t>
+      </w:r>
+      <w:bookmarkEnd w:id="107"/>
+    </w:p>
+    <w:p>
+      <w:pPr>
+        <w:pStyle w:val="BodyText2026"/>
+      </w:pPr>
+      <w:r>
+        <w:rPr>
+          <w:rFonts w:ascii="Times New Roman" w:hAnsi="Times New Roman" w:cs="Times New Roman" w:eastAsia="Times New Roman"/>
+          <w:color w:val="000000"/>
+          <w:sz w:val="24"/>
+        </w:rPr>
+        <w:t>The previous subchapters described the field, its problems and the solutions already on the market. This subchapter answers two practical questions: for whom exactly the platform is built, and why these people would choose it instead of the phone, a classified ads website or another platform. The audience is first divided into segments, then the problems from subchapter 1.2 are narrowed down to three key problems, and finally the unique value proposition (UVP) of the platform is formulated together with its main competitive advantages.</w:t>
+      </w:r>
+    </w:p>
+    <w:p>
+      <w:pPr>
+        <w:pStyle w:val="BodyText2026"/>
+        <w:keepNext/>
+      </w:pPr>
+      <w:r>
+        <w:rPr>
+          <w:rFonts w:ascii="Times New Roman" w:hAnsi="Times New Roman" w:cs="Times New Roman" w:eastAsia="Times New Roman"/>
+          <w:color w:val="000000"/>
+          <w:sz w:val="24"/>
+        </w:rPr>
+        <w:t>Market segmentation means dividing a market into groups of customers with similar needs and behaviour, using geographic, demographic, psychographic and behavioural criteria [14]. In B2B trade the customer is a company, but the decisions are still taken by concrete people, such as the owner of a farm or the person responsible for procurement, so their age, habits and attitudes matter as well. Four segments were identified: two primary ones, which generate the transactions, and two secondary ones, which support the functioning of the platform. They are described in Table 1.7.</w:t>
+      </w:r>
+    </w:p>
+    <w:p>
+      <w:pPr>
+        <w:keepNext/>
+        <w:spacing w:before="120"/>
+        <w:jc w:val="right"/>
+      </w:pPr>
+      <w:r>
+        <w:rPr>
+          <w:rFonts w:ascii="Times New Roman" w:hAnsi="Times New Roman" w:cs="Times New Roman" w:eastAsia="Times New Roman"/>
+          <w:b/>
+          <w:color w:val="000000"/>
+          <w:sz w:val="24"/>
+        </w:rPr>
+        <w:t>Table 1.7 – Target audience segments of the platform</w:t>
+      </w:r>
+    </w:p>
+    <w:tbl>
+      <w:tblPr>
+        <w:tblStyle w:val="TableGrid"/>
+        <w:tblW w:type="auto" w:w="0"/>
+        <w:jc w:val="center"/>
+        <w:tblLayout w:type="fixed"/>
+        <w:tblLook w:firstColumn="1" w:firstRow="1" w:lastColumn="0" w:lastRow="0" w:noHBand="0" w:noVBand="1" w:val="04A0"/>
+      </w:tblPr>
+      <w:tblGrid>
+        <w:gridCol w:w="1644"/>
+        <w:gridCol w:w="1247"/>
+        <w:gridCol w:w="2268"/>
+        <w:gridCol w:w="2211"/>
+        <w:gridCol w:w="2268"/>
+      </w:tblGrid>
+      <w:tr>
+        <w:trPr>
+          <w:tblHeader w:val="true"/>
+        </w:trPr>
+        <w:tc>
+          <w:tcPr>
+            <w:tcW w:type="dxa" w:w="1644"/>
+            <w:shd w:val="clear" w:color="auto" w:fill="D9D9D9"/>
+          </w:tcPr>
+          <w:p>
+            <w:pPr>
+              <w:keepNext/>
+              <w:spacing w:line="240" w:lineRule="auto" w:before="0" w:after="0"/>
+              <w:ind w:firstLine="0"/>
+              <w:jc w:val="center"/>
+            </w:pPr>
+            <w:r>
+              <w:rPr>
+                <w:rFonts w:ascii="Times New Roman" w:hAnsi="Times New Roman" w:cs="Times New Roman" w:eastAsia="Times New Roman"/>
+                <w:b/>
+                <w:color w:val="000000"/>
+                <w:sz w:val="22"/>
+              </w:rPr>
+              <w:t>Segment</w:t>
+            </w:r>
+          </w:p>
+        </w:tc>
+        <w:tc>
+          <w:tcPr>
+            <w:tcW w:type="dxa" w:w="1247"/>
+            <w:shd w:val="clear" w:color="auto" w:fill="D9D9D9"/>
+          </w:tcPr>
+          <w:p>
+            <w:pPr>
+              <w:keepNext/>
+              <w:spacing w:line="240" w:lineRule="auto" w:before="0" w:after="0"/>
+              <w:ind w:firstLine="0"/>
+              <w:jc w:val="center"/>
+            </w:pPr>
+            <w:r>
+              <w:rPr>
+                <w:rFonts w:ascii="Times New Roman" w:hAnsi="Times New Roman" w:cs="Times New Roman" w:eastAsia="Times New Roman"/>
+                <w:b/>
+                <w:color w:val="000000"/>
+                <w:sz w:val="22"/>
+              </w:rPr>
+              <w:t>Type</w:t>
+            </w:r>
+          </w:p>
+        </w:tc>
+        <w:tc>
+          <w:tcPr>
+            <w:tcW w:type="dxa" w:w="2268"/>
+            <w:shd w:val="clear" w:color="auto" w:fill="D9D9D9"/>
+          </w:tcPr>
+          <w:p>
+            <w:pPr>
+              <w:keepNext/>
+              <w:spacing w:line="240" w:lineRule="auto" w:before="0" w:after="0"/>
+              <w:ind w:firstLine="0"/>
+              <w:jc w:val="center"/>
+            </w:pPr>
+            <w:r>
+              <w:rPr>
+                <w:rFonts w:ascii="Times New Roman" w:hAnsi="Times New Roman" w:cs="Times New Roman" w:eastAsia="Times New Roman"/>
+                <w:b/>
+                <w:color w:val="000000"/>
+                <w:sz w:val="22"/>
+              </w:rPr>
+              <w:t>Who they are</w:t>
+            </w:r>
+          </w:p>
+        </w:tc>
+        <w:tc>
+          <w:tcPr>
+            <w:tcW w:type="dxa" w:w="2211"/>
+            <w:shd w:val="clear" w:color="auto" w:fill="D9D9D9"/>
+          </w:tcPr>
+          <w:p>
+            <w:pPr>
+              <w:keepNext/>
+              <w:spacing w:line="240" w:lineRule="auto" w:before="0" w:after="0"/>
+              <w:ind w:firstLine="0"/>
+              <w:jc w:val="center"/>
+            </w:pPr>
+            <w:r>
+              <w:rPr>
+                <w:rFonts w:ascii="Times New Roman" w:hAnsi="Times New Roman" w:cs="Times New Roman" w:eastAsia="Times New Roman"/>
+                <w:b/>
+                <w:color w:val="000000"/>
+                <w:sz w:val="22"/>
+              </w:rPr>
+              <w:t>Demographic characteristics</w:t>
+            </w:r>
+          </w:p>
+        </w:tc>
+        <w:tc>
+          <w:tcPr>
+            <w:tcW w:type="dxa" w:w="2268"/>
+            <w:shd w:val="clear" w:color="auto" w:fill="D9D9D9"/>
+          </w:tcPr>
+          <w:p>
+            <w:pPr>
+              <w:keepNext/>
+              <w:spacing w:line="240" w:lineRule="auto" w:before="0" w:after="0"/>
+              <w:ind w:firstLine="0"/>
+              <w:jc w:val="center"/>
+            </w:pPr>
+            <w:r>
+              <w:rPr>
+                <w:rFonts w:ascii="Times New Roman" w:hAnsi="Times New Roman" w:cs="Times New Roman" w:eastAsia="Times New Roman"/>
+                <w:b/>
+                <w:color w:val="000000"/>
+                <w:sz w:val="22"/>
+              </w:rPr>
+              <w:t>Psychographic characteristics</w:t>
+            </w:r>
+          </w:p>
+        </w:tc>
+      </w:tr>
+      <w:tr>
+        <w:trPr>
+          <w:cantSplit w:val="true"/>
+        </w:trPr>
+        <w:tc>
+          <w:tcPr>
+            <w:tcW w:type="dxa" w:w="1644"/>
+          </w:tcPr>
+          <w:p>
+            <w:pPr>
+              <w:keepNext/>
+              <w:spacing w:line="240" w:lineRule="auto" w:before="0" w:after="0"/>
+              <w:ind w:firstLine="0"/>
+              <w:jc w:val="left"/>
+            </w:pPr>
+            <w:r>
+              <w:rPr>
+                <w:rFonts w:ascii="Times New Roman" w:hAnsi="Times New Roman" w:cs="Times New Roman" w:eastAsia="Times New Roman"/>
+                <w:b w:val="0"/>
+                <w:color w:val="000000"/>
+                <w:sz w:val="22"/>
+              </w:rPr>
+              <w:t>S1. Agricultural producers (sellers)</w:t>
+            </w:r>
+          </w:p>
+        </w:tc>
+        <w:tc>
+          <w:tcPr>
+            <w:tcW w:type="dxa" w:w="1247"/>
+          </w:tcPr>
+          <w:p>
+            <w:pPr>
+              <w:keepNext/>
+              <w:spacing w:line="240" w:lineRule="auto" w:before="0" w:after="0"/>
+              <w:ind w:firstLine="0"/>
+              <w:jc w:val="center"/>
+            </w:pPr>
+            <w:r>
+              <w:rPr>
+                <w:rFonts w:ascii="Times New Roman" w:hAnsi="Times New Roman" w:cs="Times New Roman" w:eastAsia="Times New Roman"/>
+                <w:b w:val="0"/>
+                <w:color w:val="000000"/>
+                <w:sz w:val="22"/>
+              </w:rPr>
+              <w:t>Primary</w:t>
+            </w:r>
+          </w:p>
+        </w:tc>
+        <w:tc>
+          <w:tcPr>
+            <w:tcW w:type="dxa" w:w="2268"/>
+          </w:tcPr>
+          <w:p>
+            <w:pPr>
+              <w:keepNext/>
+              <w:spacing w:line="240" w:lineRule="auto" w:before="0" w:after="0"/>
+              <w:ind w:firstLine="0"/>
+              <w:jc w:val="left"/>
+            </w:pPr>
+            <w:r>
+              <w:rPr>
+                <w:rFonts w:ascii="Times New Roman" w:hAnsi="Times New Roman" w:cs="Times New Roman" w:eastAsia="Times New Roman"/>
+                <w:b w:val="0"/>
+                <w:color w:val="000000"/>
+                <w:sz w:val="22"/>
+              </w:rPr>
+              <w:t>Small and medium farms, peasant farms and agricultural enterprises that sell vegetables, fruit or grain wholesale</w:t>
+            </w:r>
+          </w:p>
+        </w:tc>
+        <w:tc>
+          <w:tcPr>
+            <w:tcW w:type="dxa" w:w="2211"/>
+          </w:tcPr>
+          <w:p>
+            <w:pPr>
+              <w:keepNext/>
+              <w:spacing w:line="240" w:lineRule="auto" w:before="0" w:after="0"/>
+              <w:ind w:firstLine="0"/>
+              <w:jc w:val="left"/>
+            </w:pPr>
+            <w:r>
+              <w:rPr>
+                <w:rFonts w:ascii="Times New Roman" w:hAnsi="Times New Roman" w:cs="Times New Roman" w:eastAsia="Times New Roman"/>
+                <w:b w:val="0"/>
+                <w:color w:val="000000"/>
+                <w:sz w:val="22"/>
+              </w:rPr>
+              <w:t>Mostly 35–60 years old, rural areas, owners or family members who run the farm; lots from a few hundred kilograms to tens of tonnes</w:t>
+            </w:r>
+          </w:p>
+        </w:tc>
+        <w:tc>
+          <w:tcPr>
+            <w:tcW w:type="dxa" w:w="2268"/>
+          </w:tcPr>
+          <w:p>
+            <w:pPr>
+              <w:keepNext/>
+              <w:spacing w:line="240" w:lineRule="auto" w:before="0" w:after="0"/>
+              <w:ind w:firstLine="0"/>
+              <w:jc w:val="left"/>
+            </w:pPr>
+            <w:r>
+              <w:rPr>
+                <w:rFonts w:ascii="Times New Roman" w:hAnsi="Times New Roman" w:cs="Times New Roman" w:eastAsia="Times New Roman"/>
+                <w:b w:val="0"/>
+                <w:color w:val="000000"/>
+                <w:sz w:val="22"/>
+              </w:rPr>
+              <w:t>Pragmatic, short of time in the harvest season, rely on personal relationships, cautious about fees and new tools, prefer the phone to the computer</w:t>
+            </w:r>
+          </w:p>
+        </w:tc>
+      </w:tr>
+      <w:tr>
+        <w:trPr>
+          <w:cantSplit w:val="true"/>
+        </w:trPr>
+        <w:tc>
+          <w:tcPr>
+            <w:tcW w:type="dxa" w:w="1644"/>
+          </w:tcPr>
+          <w:p>
+            <w:pPr>
+              <w:keepNext/>
+              <w:spacing w:line="240" w:lineRule="auto" w:before="0" w:after="0"/>
+              <w:ind w:firstLine="0"/>
+              <w:jc w:val="left"/>
+            </w:pPr>
+            <w:r>
+              <w:rPr>
+                <w:rFonts w:ascii="Times New Roman" w:hAnsi="Times New Roman" w:cs="Times New Roman" w:eastAsia="Times New Roman"/>
+                <w:b w:val="0"/>
+                <w:color w:val="000000"/>
+                <w:sz w:val="22"/>
+              </w:rPr>
+              <w:t>S2. Wholesale buyers (distributors)</w:t>
+            </w:r>
+          </w:p>
+        </w:tc>
+        <w:tc>
+          <w:tcPr>
+            <w:tcW w:type="dxa" w:w="1247"/>
+          </w:tcPr>
+          <w:p>
+            <w:pPr>
+              <w:keepNext/>
+              <w:spacing w:line="240" w:lineRule="auto" w:before="0" w:after="0"/>
+              <w:ind w:firstLine="0"/>
+              <w:jc w:val="center"/>
+            </w:pPr>
+            <w:r>
+              <w:rPr>
+                <w:rFonts w:ascii="Times New Roman" w:hAnsi="Times New Roman" w:cs="Times New Roman" w:eastAsia="Times New Roman"/>
+                <w:b w:val="0"/>
+                <w:color w:val="000000"/>
+                <w:sz w:val="22"/>
+              </w:rPr>
+              <w:t>Primary</w:t>
+            </w:r>
+          </w:p>
+        </w:tc>
+        <w:tc>
+          <w:tcPr>
+            <w:tcW w:type="dxa" w:w="2268"/>
+          </w:tcPr>
+          <w:p>
+            <w:pPr>
+              <w:keepNext/>
+              <w:spacing w:line="240" w:lineRule="auto" w:before="0" w:after="0"/>
+              <w:ind w:firstLine="0"/>
+              <w:jc w:val="left"/>
+            </w:pPr>
+            <w:r>
+              <w:rPr>
+                <w:rFonts w:ascii="Times New Roman" w:hAnsi="Times New Roman" w:cs="Times New Roman" w:eastAsia="Times New Roman"/>
+                <w:b w:val="0"/>
+                <w:color w:val="000000"/>
+                <w:sz w:val="22"/>
+              </w:rPr>
+              <w:t>Distribution companies, small retail chains, HoReCa businesses and processors that buy regularly</w:t>
+            </w:r>
+          </w:p>
+        </w:tc>
+        <w:tc>
+          <w:tcPr>
+            <w:tcW w:type="dxa" w:w="2211"/>
+          </w:tcPr>
+          <w:p>
+            <w:pPr>
+              <w:keepNext/>
+              <w:spacing w:line="240" w:lineRule="auto" w:before="0" w:after="0"/>
+              <w:ind w:firstLine="0"/>
+              <w:jc w:val="left"/>
+            </w:pPr>
+            <w:r>
+              <w:rPr>
+                <w:rFonts w:ascii="Times New Roman" w:hAnsi="Times New Roman" w:cs="Times New Roman" w:eastAsia="Times New Roman"/>
+                <w:b w:val="0"/>
+                <w:color w:val="000000"/>
+                <w:sz w:val="22"/>
+              </w:rPr>
+              <w:t>Mostly 25–45 years old, procurement managers or owners in Chișinău, Bălți and district centres; buy weekly or more often</w:t>
+            </w:r>
+          </w:p>
+        </w:tc>
+        <w:tc>
+          <w:tcPr>
+            <w:tcW w:type="dxa" w:w="2268"/>
+          </w:tcPr>
+          <w:p>
+            <w:pPr>
+              <w:keepNext/>
+              <w:spacing w:line="240" w:lineRule="auto" w:before="0" w:after="0"/>
+              <w:ind w:firstLine="0"/>
+              <w:jc w:val="left"/>
+            </w:pPr>
+            <w:r>
+              <w:rPr>
+                <w:rFonts w:ascii="Times New Roman" w:hAnsi="Times New Roman" w:cs="Times New Roman" w:eastAsia="Times New Roman"/>
+                <w:b w:val="0"/>
+                <w:color w:val="000000"/>
+                <w:sz w:val="22"/>
+              </w:rPr>
+              <w:t>Oriented to efficiency, used to online services, value reliability and predictability more than the lowest price, need a documented history</w:t>
+            </w:r>
+          </w:p>
+        </w:tc>
+      </w:tr>
+      <w:tr>
+        <w:trPr>
+          <w:cantSplit w:val="true"/>
+        </w:trPr>
+        <w:tc>
+          <w:tcPr>
+            <w:tcW w:type="dxa" w:w="1644"/>
+          </w:tcPr>
+          <w:p>
+            <w:pPr>
+              <w:keepNext/>
+              <w:spacing w:line="240" w:lineRule="auto" w:before="0" w:after="0"/>
+              <w:ind w:firstLine="0"/>
+              <w:jc w:val="left"/>
+            </w:pPr>
+            <w:r>
+              <w:rPr>
+                <w:rFonts w:ascii="Times New Roman" w:hAnsi="Times New Roman" w:cs="Times New Roman" w:eastAsia="Times New Roman"/>
+                <w:b w:val="0"/>
+                <w:color w:val="000000"/>
+                <w:sz w:val="22"/>
+              </w:rPr>
+              <w:t>S3. Platform administrators</w:t>
+            </w:r>
+          </w:p>
+        </w:tc>
+        <w:tc>
+          <w:tcPr>
+            <w:tcW w:type="dxa" w:w="1247"/>
+          </w:tcPr>
+          <w:p>
+            <w:pPr>
+              <w:keepNext/>
+              <w:spacing w:line="240" w:lineRule="auto" w:before="0" w:after="0"/>
+              <w:ind w:firstLine="0"/>
+              <w:jc w:val="center"/>
+            </w:pPr>
+            <w:r>
+              <w:rPr>
+                <w:rFonts w:ascii="Times New Roman" w:hAnsi="Times New Roman" w:cs="Times New Roman" w:eastAsia="Times New Roman"/>
+                <w:b w:val="0"/>
+                <w:color w:val="000000"/>
+                <w:sz w:val="22"/>
+              </w:rPr>
+              <w:t>Secondary</w:t>
+            </w:r>
+          </w:p>
+        </w:tc>
+        <w:tc>
+          <w:tcPr>
+            <w:tcW w:type="dxa" w:w="2268"/>
+          </w:tcPr>
+          <w:p>
+            <w:pPr>
+              <w:keepNext/>
+              <w:spacing w:line="240" w:lineRule="auto" w:before="0" w:after="0"/>
+              <w:ind w:firstLine="0"/>
+              <w:jc w:val="left"/>
+            </w:pPr>
+            <w:r>
+              <w:rPr>
+                <w:rFonts w:ascii="Times New Roman" w:hAnsi="Times New Roman" w:cs="Times New Roman" w:eastAsia="Times New Roman"/>
+                <w:b w:val="0"/>
+                <w:color w:val="000000"/>
+                <w:sz w:val="22"/>
+              </w:rPr>
+              <w:t>Platform staff who verify accounts and listings and handle disputes</w:t>
+            </w:r>
+          </w:p>
+        </w:tc>
+        <w:tc>
+          <w:tcPr>
+            <w:tcW w:type="dxa" w:w="2211"/>
+          </w:tcPr>
+          <w:p>
+            <w:pPr>
+              <w:keepNext/>
+              <w:spacing w:line="240" w:lineRule="auto" w:before="0" w:after="0"/>
+              <w:ind w:firstLine="0"/>
+              <w:jc w:val="left"/>
+            </w:pPr>
+            <w:r>
+              <w:rPr>
+                <w:rFonts w:ascii="Times New Roman" w:hAnsi="Times New Roman" w:cs="Times New Roman" w:eastAsia="Times New Roman"/>
+                <w:b w:val="0"/>
+                <w:color w:val="000000"/>
+                <w:sz w:val="22"/>
+              </w:rPr>
+              <w:t>One to three people at launch, good digital skills</w:t>
+            </w:r>
+          </w:p>
+        </w:tc>
+        <w:tc>
+          <w:tcPr>
+            <w:tcW w:type="dxa" w:w="2268"/>
+          </w:tcPr>
+          <w:p>
+            <w:pPr>
+              <w:keepNext/>
+              <w:spacing w:line="240" w:lineRule="auto" w:before="0" w:after="0"/>
+              <w:ind w:firstLine="0"/>
+              <w:jc w:val="left"/>
+            </w:pPr>
+            <w:r>
+              <w:rPr>
+                <w:rFonts w:ascii="Times New Roman" w:hAnsi="Times New Roman" w:cs="Times New Roman" w:eastAsia="Times New Roman"/>
+                <w:b w:val="0"/>
+                <w:color w:val="000000"/>
+                <w:sz w:val="22"/>
+              </w:rPr>
+              <w:t>Responsible for the trust in the platform, need fast moderation tools and clear rules</w:t>
+            </w:r>
+          </w:p>
+        </w:tc>
+      </w:tr>
+      <w:tr>
+        <w:trPr>
+          <w:cantSplit w:val="true"/>
+        </w:trPr>
+        <w:tc>
+          <w:tcPr>
+            <w:tcW w:type="dxa" w:w="1644"/>
+          </w:tcPr>
+          <w:p>
+            <w:pPr>
+              <w:keepNext/>
+              <w:spacing w:line="240" w:lineRule="auto" w:before="0" w:after="0"/>
+              <w:ind w:firstLine="0"/>
+              <w:jc w:val="left"/>
+            </w:pPr>
+            <w:r>
+              <w:rPr>
+                <w:rFonts w:ascii="Times New Roman" w:hAnsi="Times New Roman" w:cs="Times New Roman" w:eastAsia="Times New Roman"/>
+                <w:b w:val="0"/>
+                <w:color w:val="000000"/>
+                <w:sz w:val="22"/>
+              </w:rPr>
+              <w:t>S4. Partners</w:t>
+            </w:r>
+          </w:p>
+        </w:tc>
+        <w:tc>
+          <w:tcPr>
+            <w:tcW w:type="dxa" w:w="1247"/>
+          </w:tcPr>
+          <w:p>
+            <w:pPr>
+              <w:keepNext/>
+              <w:spacing w:line="240" w:lineRule="auto" w:before="0" w:after="0"/>
+              <w:ind w:firstLine="0"/>
+              <w:jc w:val="center"/>
+            </w:pPr>
+            <w:r>
+              <w:rPr>
+                <w:rFonts w:ascii="Times New Roman" w:hAnsi="Times New Roman" w:cs="Times New Roman" w:eastAsia="Times New Roman"/>
+                <w:b w:val="0"/>
+                <w:color w:val="000000"/>
+                <w:sz w:val="22"/>
+              </w:rPr>
+              <w:t>Secondary</w:t>
+            </w:r>
+          </w:p>
+        </w:tc>
+        <w:tc>
+          <w:tcPr>
+            <w:tcW w:type="dxa" w:w="2268"/>
+          </w:tcPr>
+          <w:p>
+            <w:pPr>
+              <w:keepNext/>
+              <w:spacing w:line="240" w:lineRule="auto" w:before="0" w:after="0"/>
+              <w:ind w:firstLine="0"/>
+              <w:jc w:val="left"/>
+            </w:pPr>
+            <w:r>
+              <w:rPr>
+                <w:rFonts w:ascii="Times New Roman" w:hAnsi="Times New Roman" w:cs="Times New Roman" w:eastAsia="Times New Roman"/>
+                <w:b w:val="0"/>
+                <w:color w:val="000000"/>
+                <w:sz w:val="22"/>
+              </w:rPr>
+              <w:t>Farmer associations and cooperatives, transport companies, agricultural consultants</w:t>
+            </w:r>
+          </w:p>
+        </w:tc>
+        <w:tc>
+          <w:tcPr>
+            <w:tcW w:type="dxa" w:w="2211"/>
+          </w:tcPr>
+          <w:p>
+            <w:pPr>
+              <w:keepNext/>
+              <w:spacing w:line="240" w:lineRule="auto" w:before="0" w:after="0"/>
+              <w:ind w:firstLine="0"/>
+              <w:jc w:val="left"/>
+            </w:pPr>
+            <w:r>
+              <w:rPr>
+                <w:rFonts w:ascii="Times New Roman" w:hAnsi="Times New Roman" w:cs="Times New Roman" w:eastAsia="Times New Roman"/>
+                <w:b w:val="0"/>
+                <w:color w:val="000000"/>
+                <w:sz w:val="22"/>
+              </w:rPr>
+              <w:t>Organisations that already have networks of producers or clients</w:t>
+            </w:r>
+          </w:p>
+        </w:tc>
+        <w:tc>
+          <w:tcPr>
+            <w:tcW w:type="dxa" w:w="2268"/>
+          </w:tcPr>
+          <w:p>
+            <w:pPr>
+              <w:keepNext/>
+              <w:spacing w:line="240" w:lineRule="auto" w:before="0" w:after="0"/>
+              <w:ind w:firstLine="0"/>
+              <w:jc w:val="left"/>
+            </w:pPr>
+            <w:r>
+              <w:rPr>
+                <w:rFonts w:ascii="Times New Roman" w:hAnsi="Times New Roman" w:cs="Times New Roman" w:eastAsia="Times New Roman"/>
+                <w:b w:val="0"/>
+                <w:color w:val="000000"/>
+                <w:sz w:val="22"/>
+              </w:rPr>
+              <w:t>Interested in the digitalisation of their members, can bring the first users and future integrations</w:t>
+            </w:r>
+          </w:p>
+        </w:tc>
+      </w:tr>
+    </w:tbl>
+    <w:p>
+      <w:pPr>
+        <w:keepNext/>
+        <w:spacing w:after="0"/>
+      </w:pPr>
+    </w:p>
+    <w:p>
+      <w:pPr>
+        <w:pStyle w:val="BodyText2026"/>
+      </w:pPr>
+      <w:r>
+        <w:rPr>
+          <w:rFonts w:ascii="Times New Roman" w:hAnsi="Times New Roman" w:cs="Times New Roman" w:eastAsia="Times New Roman"/>
+          <w:color w:val="000000"/>
+          <w:sz w:val="24"/>
+        </w:rPr>
+        <w:t>The two primary segments are the ones the platform is designed around, since without them no order is ever placed. They are also very different from each other: the producers are less digital and more sensitive to costs, while the buyers are used to online tools but have little time for anything that does not bring results quickly. The interface and the onboarding have to work for the first group without slowing down the second.</w:t>
+      </w:r>
+    </w:p>
+    <w:p>
+      <w:pPr>
+        <w:pStyle w:val="BodyText2026"/>
+        <w:keepNext/>
+      </w:pPr>
+      <w:r>
+        <w:rPr>
+          <w:rFonts w:ascii="Times New Roman" w:hAnsi="Times New Roman" w:cs="Times New Roman" w:eastAsia="Times New Roman"/>
+          <w:color w:val="000000"/>
+          <w:sz w:val="24"/>
+        </w:rPr>
+        <w:t>To make the primary segments more concrete, each of them is represented by a persona. A persona is a fictional but realistic profile that brings together the typical goals, habits and frustrations of a group of users [15]. Personas help to keep the design focused on concrete people instead of an abstract "user". They were built from the field analysis and from the working hypotheses in subchapter 1.4, and will be adjusted after the interviews. The first persona, Ion, represents segment S1 and is shown in Table 1.8.</w:t>
+      </w:r>
+    </w:p>
+    <w:p>
+      <w:pPr>
+        <w:keepNext/>
+        <w:spacing w:before="120"/>
+        <w:jc w:val="right"/>
+      </w:pPr>
+      <w:r>
+        <w:rPr>
+          <w:rFonts w:ascii="Times New Roman" w:hAnsi="Times New Roman" w:cs="Times New Roman" w:eastAsia="Times New Roman"/>
+          <w:b/>
+          <w:color w:val="000000"/>
+          <w:sz w:val="24"/>
+        </w:rPr>
+        <w:t>Table 1.8 – Persona 1: the seller (agricultural producer)</w:t>
       </w:r>
     </w:p>
     <w:tbl>
@@ -7572,7 +8347,7 @@
           <w:color w:val="000000"/>
           <w:sz w:val="24"/>
         </w:rPr>
-        <w:t>The second persona, presented in Table 1.8, describes the other side of the transaction: a buyer who needs regular deliveries and spends a large part of the working day coordinating suppliers.</w:t>
+        <w:t>The second persona, presented in Table 1.9, represents segment S2 and describes the other side of the transaction: a buyer who needs regular deliveries and spends a large part of the working day coordinating suppliers.</w:t>
       </w:r>
     </w:p>
     <w:p>
@@ -7588,7 +8363,7 @@
           <w:color w:val="000000"/>
           <w:sz w:val="24"/>
         </w:rPr>
-        <w:t>Table 1.8 – Persona 2: the distributor (wholesale buyer)</w:t>
+        <w:t>Table 1.9 – Persona 2: the distributor (wholesale buyer)</w:t>
       </w:r>
     </w:p>
     <w:tbl>
@@ -8027,14 +8802,1144 @@
           <w:color w:val="000000"/>
           <w:sz w:val="24"/>
         </w:rPr>
-        <w:t>The results of this chapter so far, namely the description of the field, the list of problems, the niche identified among existing solutions and the profiles of the target users, form the basis for the technical specification and for the functional and non-functional requirements, which are formulated in the next subchapters.</w:t>
+        <w:t>The secondary segments do not trade on the platform, but the platform cannot work without them. The administrators are the ones who turn verification from a promise into a routine: they approve new accounts, check listings and step in when an order turns into a dispute. The partners matter mostly at the start. A farmer association or a cooperative can bring dozens of producers at once, which solves part of the "cold start" problem described in subchapter 1.3, while transport companies and consultants are natural candidates for future integrations.</w:t>
       </w:r>
     </w:p>
     <w:p>
       <w:pPr>
+        <w:pStyle w:val="BodyText2026"/>
+        <w:keepNext/>
+      </w:pPr>
+      <w:r>
+        <w:rPr>
+          <w:rFonts w:ascii="Times New Roman" w:hAnsi="Times New Roman" w:cs="Times New Roman" w:eastAsia="Times New Roman"/>
+          <w:color w:val="000000"/>
+          <w:sz w:val="24"/>
+        </w:rPr>
+        <w:t>The problems listed in Table 1.2 are numerous, but they do not have the same weight for the target audience. When they are grouped by their effect on the two primary segments, three key problems remain, and these define the core of the platform. They are presented in Table 1.10.</w:t>
+      </w:r>
+    </w:p>
+    <w:p>
+      <w:pPr>
+        <w:keepNext/>
+        <w:spacing w:before="120"/>
+        <w:jc w:val="right"/>
+      </w:pPr>
+      <w:r>
+        <w:rPr>
+          <w:rFonts w:ascii="Times New Roman" w:hAnsi="Times New Roman" w:cs="Times New Roman" w:eastAsia="Times New Roman"/>
+          <w:b/>
+          <w:color w:val="000000"/>
+          <w:sz w:val="24"/>
+        </w:rPr>
+        <w:t>Table 1.10 – Key problems solved by the platform for the target audience</w:t>
+      </w:r>
+    </w:p>
+    <w:tbl>
+      <w:tblPr>
+        <w:tblStyle w:val="TableGrid"/>
+        <w:tblW w:type="auto" w:w="0"/>
+        <w:jc w:val="center"/>
+        <w:tblLayout w:type="fixed"/>
+        <w:tblLook w:firstColumn="1" w:firstRow="1" w:lastColumn="0" w:lastRow="0" w:noHBand="0" w:noVBand="1" w:val="04A0"/>
+      </w:tblPr>
+      <w:tblGrid>
+        <w:gridCol w:w="2154"/>
+        <w:gridCol w:w="1134"/>
+        <w:gridCol w:w="2948"/>
+        <w:gridCol w:w="3402"/>
+      </w:tblGrid>
+      <w:tr>
+        <w:trPr>
+          <w:tblHeader w:val="true"/>
+        </w:trPr>
+        <w:tc>
+          <w:tcPr>
+            <w:tcW w:type="dxa" w:w="2154"/>
+            <w:shd w:val="clear" w:color="auto" w:fill="D9D9D9"/>
+          </w:tcPr>
+          <w:p>
+            <w:pPr>
+              <w:keepNext/>
+              <w:spacing w:line="240" w:lineRule="auto" w:before="0" w:after="0"/>
+              <w:ind w:firstLine="0"/>
+              <w:jc w:val="center"/>
+            </w:pPr>
+            <w:r>
+              <w:rPr>
+                <w:rFonts w:ascii="Times New Roman" w:hAnsi="Times New Roman" w:cs="Times New Roman" w:eastAsia="Times New Roman"/>
+                <w:b/>
+                <w:color w:val="000000"/>
+                <w:sz w:val="22"/>
+              </w:rPr>
+              <w:t>Key problem</w:t>
+            </w:r>
+          </w:p>
+        </w:tc>
+        <w:tc>
+          <w:tcPr>
+            <w:tcW w:type="dxa" w:w="1134"/>
+            <w:shd w:val="clear" w:color="auto" w:fill="D9D9D9"/>
+          </w:tcPr>
+          <w:p>
+            <w:pPr>
+              <w:keepNext/>
+              <w:spacing w:line="240" w:lineRule="auto" w:before="0" w:after="0"/>
+              <w:ind w:firstLine="0"/>
+              <w:jc w:val="center"/>
+            </w:pPr>
+            <w:r>
+              <w:rPr>
+                <w:rFonts w:ascii="Times New Roman" w:hAnsi="Times New Roman" w:cs="Times New Roman" w:eastAsia="Times New Roman"/>
+                <w:b/>
+                <w:color w:val="000000"/>
+                <w:sz w:val="22"/>
+              </w:rPr>
+              <w:t>Affected segments</w:t>
+            </w:r>
+          </w:p>
+        </w:tc>
+        <w:tc>
+          <w:tcPr>
+            <w:tcW w:type="dxa" w:w="2948"/>
+            <w:shd w:val="clear" w:color="auto" w:fill="D9D9D9"/>
+          </w:tcPr>
+          <w:p>
+            <w:pPr>
+              <w:keepNext/>
+              <w:spacing w:line="240" w:lineRule="auto" w:before="0" w:after="0"/>
+              <w:ind w:firstLine="0"/>
+              <w:jc w:val="center"/>
+            </w:pPr>
+            <w:r>
+              <w:rPr>
+                <w:rFonts w:ascii="Times New Roman" w:hAnsi="Times New Roman" w:cs="Times New Roman" w:eastAsia="Times New Roman"/>
+                <w:b/>
+                <w:color w:val="000000"/>
+                <w:sz w:val="22"/>
+              </w:rPr>
+              <w:t>How it shows today</w:t>
+            </w:r>
+          </w:p>
+        </w:tc>
+        <w:tc>
+          <w:tcPr>
+            <w:tcW w:type="dxa" w:w="3402"/>
+            <w:shd w:val="clear" w:color="auto" w:fill="D9D9D9"/>
+          </w:tcPr>
+          <w:p>
+            <w:pPr>
+              <w:keepNext/>
+              <w:spacing w:line="240" w:lineRule="auto" w:before="0" w:after="0"/>
+              <w:ind w:firstLine="0"/>
+              <w:jc w:val="center"/>
+            </w:pPr>
+            <w:r>
+              <w:rPr>
+                <w:rFonts w:ascii="Times New Roman" w:hAnsi="Times New Roman" w:cs="Times New Roman" w:eastAsia="Times New Roman"/>
+                <w:b/>
+                <w:color w:val="000000"/>
+                <w:sz w:val="22"/>
+              </w:rPr>
+              <w:t>How the platform solves it</w:t>
+            </w:r>
+          </w:p>
+        </w:tc>
+      </w:tr>
+      <w:tr>
+        <w:trPr>
+          <w:cantSplit w:val="true"/>
+        </w:trPr>
+        <w:tc>
+          <w:tcPr>
+            <w:tcW w:type="dxa" w:w="2154"/>
+          </w:tcPr>
+          <w:p>
+            <w:pPr>
+              <w:keepNext/>
+              <w:spacing w:line="240" w:lineRule="auto" w:before="0" w:after="0"/>
+              <w:ind w:firstLine="0"/>
+              <w:jc w:val="left"/>
+            </w:pPr>
+            <w:r>
+              <w:rPr>
+                <w:rFonts w:ascii="Times New Roman" w:hAnsi="Times New Roman" w:cs="Times New Roman" w:eastAsia="Times New Roman"/>
+                <w:b w:val="0"/>
+                <w:color w:val="000000"/>
+                <w:sz w:val="22"/>
+              </w:rPr>
+              <w:t>KP1. Finding a reliable partner takes too long</w:t>
+            </w:r>
+          </w:p>
+        </w:tc>
+        <w:tc>
+          <w:tcPr>
+            <w:tcW w:type="dxa" w:w="1134"/>
+          </w:tcPr>
+          <w:p>
+            <w:pPr>
+              <w:keepNext/>
+              <w:spacing w:line="240" w:lineRule="auto" w:before="0" w:after="0"/>
+              <w:ind w:firstLine="0"/>
+              <w:jc w:val="left"/>
+            </w:pPr>
+            <w:r>
+              <w:rPr>
+                <w:rFonts w:ascii="Times New Roman" w:hAnsi="Times New Roman" w:cs="Times New Roman" w:eastAsia="Times New Roman"/>
+                <w:b w:val="0"/>
+                <w:color w:val="000000"/>
+                <w:sz w:val="22"/>
+              </w:rPr>
+              <w:t>S1, S2</w:t>
+            </w:r>
+          </w:p>
+        </w:tc>
+        <w:tc>
+          <w:tcPr>
+            <w:tcW w:type="dxa" w:w="2948"/>
+          </w:tcPr>
+          <w:p>
+            <w:pPr>
+              <w:keepNext/>
+              <w:spacing w:line="240" w:lineRule="auto" w:before="0" w:after="0"/>
+              <w:ind w:firstLine="0"/>
+              <w:jc w:val="left"/>
+            </w:pPr>
+            <w:r>
+              <w:rPr>
+                <w:rFonts w:ascii="Times New Roman" w:hAnsi="Times New Roman" w:cs="Times New Roman" w:eastAsia="Times New Roman"/>
+                <w:b w:val="0"/>
+                <w:color w:val="000000"/>
+                <w:sz w:val="22"/>
+              </w:rPr>
+              <w:t>Hours of calls and waiting for answers to ads; deals limited to a small circle of known partners</w:t>
+            </w:r>
+          </w:p>
+        </w:tc>
+        <w:tc>
+          <w:tcPr>
+            <w:tcW w:type="dxa" w:w="3402"/>
+          </w:tcPr>
+          <w:p>
+            <w:pPr>
+              <w:keepNext/>
+              <w:spacing w:line="240" w:lineRule="auto" w:before="0" w:after="0"/>
+              <w:ind w:firstLine="0"/>
+              <w:jc w:val="left"/>
+            </w:pPr>
+            <w:r>
+              <w:rPr>
+                <w:rFonts w:ascii="Times New Roman" w:hAnsi="Times New Roman" w:cs="Times New Roman" w:eastAsia="Times New Roman"/>
+                <w:b w:val="0"/>
+                <w:color w:val="000000"/>
+                <w:sz w:val="22"/>
+              </w:rPr>
+              <w:t>Catalogue of listings with search by product and region, verified accounts and public reviews after completed orders</w:t>
+            </w:r>
+          </w:p>
+        </w:tc>
+      </w:tr>
+      <w:tr>
+        <w:trPr>
+          <w:cantSplit w:val="true"/>
+        </w:trPr>
+        <w:tc>
+          <w:tcPr>
+            <w:tcW w:type="dxa" w:w="2154"/>
+          </w:tcPr>
+          <w:p>
+            <w:pPr>
+              <w:keepNext/>
+              <w:spacing w:line="240" w:lineRule="auto" w:before="0" w:after="0"/>
+              <w:ind w:firstLine="0"/>
+              <w:jc w:val="left"/>
+            </w:pPr>
+            <w:r>
+              <w:rPr>
+                <w:rFonts w:ascii="Times New Roman" w:hAnsi="Times New Roman" w:cs="Times New Roman" w:eastAsia="Times New Roman"/>
+                <w:b w:val="0"/>
+                <w:color w:val="000000"/>
+                <w:sz w:val="22"/>
+              </w:rPr>
+              <w:t>KP2. Stock and agreements are not recorded in one place</w:t>
+            </w:r>
+          </w:p>
+        </w:tc>
+        <w:tc>
+          <w:tcPr>
+            <w:tcW w:type="dxa" w:w="1134"/>
+          </w:tcPr>
+          <w:p>
+            <w:pPr>
+              <w:keepNext/>
+              <w:spacing w:line="240" w:lineRule="auto" w:before="0" w:after="0"/>
+              <w:ind w:firstLine="0"/>
+              <w:jc w:val="left"/>
+            </w:pPr>
+            <w:r>
+              <w:rPr>
+                <w:rFonts w:ascii="Times New Roman" w:hAnsi="Times New Roman" w:cs="Times New Roman" w:eastAsia="Times New Roman"/>
+                <w:b w:val="0"/>
+                <w:color w:val="000000"/>
+                <w:sz w:val="22"/>
+              </w:rPr>
+              <w:t>S1, S2</w:t>
+            </w:r>
+          </w:p>
+        </w:tc>
+        <w:tc>
+          <w:tcPr>
+            <w:tcW w:type="dxa" w:w="2948"/>
+          </w:tcPr>
+          <w:p>
+            <w:pPr>
+              <w:keepNext/>
+              <w:spacing w:line="240" w:lineRule="auto" w:before="0" w:after="0"/>
+              <w:ind w:firstLine="0"/>
+              <w:jc w:val="left"/>
+            </w:pPr>
+            <w:r>
+              <w:rPr>
+                <w:rFonts w:ascii="Times New Roman" w:hAnsi="Times New Roman" w:cs="Times New Roman" w:eastAsia="Times New Roman"/>
+                <w:b w:val="0"/>
+                <w:color w:val="000000"/>
+                <w:sz w:val="22"/>
+              </w:rPr>
+              <w:t>Lots promised twice, oral agreements, disputes about quantity and price</w:t>
+            </w:r>
+          </w:p>
+        </w:tc>
+        <w:tc>
+          <w:tcPr>
+            <w:tcW w:type="dxa" w:w="3402"/>
+          </w:tcPr>
+          <w:p>
+            <w:pPr>
+              <w:keepNext/>
+              <w:spacing w:line="240" w:lineRule="auto" w:before="0" w:after="0"/>
+              <w:ind w:firstLine="0"/>
+              <w:jc w:val="left"/>
+            </w:pPr>
+            <w:r>
+              <w:rPr>
+                <w:rFonts w:ascii="Times New Roman" w:hAnsi="Times New Roman" w:cs="Times New Roman" w:eastAsia="Times New Roman"/>
+                <w:b w:val="0"/>
+                <w:color w:val="000000"/>
+                <w:sz w:val="22"/>
+              </w:rPr>
+              <w:t>Each listing shows the real stock, which decreases when an order is confirmed; each order keeps its price, quantity and status</w:t>
+            </w:r>
+          </w:p>
+        </w:tc>
+      </w:tr>
+      <w:tr>
+        <w:trPr>
+          <w:cantSplit w:val="true"/>
+        </w:trPr>
+        <w:tc>
+          <w:tcPr>
+            <w:tcW w:type="dxa" w:w="2154"/>
+          </w:tcPr>
+          <w:p>
+            <w:pPr>
+              <w:keepNext/>
+              <w:spacing w:line="240" w:lineRule="auto" w:before="0" w:after="0"/>
+              <w:ind w:firstLine="0"/>
+              <w:jc w:val="left"/>
+            </w:pPr>
+            <w:r>
+              <w:rPr>
+                <w:rFonts w:ascii="Times New Roman" w:hAnsi="Times New Roman" w:cs="Times New Roman" w:eastAsia="Times New Roman"/>
+                <w:b w:val="0"/>
+                <w:color w:val="000000"/>
+                <w:sz w:val="22"/>
+              </w:rPr>
+              <w:t>KP3. Communication around an order is slow and scattered</w:t>
+            </w:r>
+          </w:p>
+        </w:tc>
+        <w:tc>
+          <w:tcPr>
+            <w:tcW w:type="dxa" w:w="1134"/>
+          </w:tcPr>
+          <w:p>
+            <w:pPr>
+              <w:keepNext/>
+              <w:spacing w:line="240" w:lineRule="auto" w:before="0" w:after="0"/>
+              <w:ind w:firstLine="0"/>
+              <w:jc w:val="left"/>
+            </w:pPr>
+            <w:r>
+              <w:rPr>
+                <w:rFonts w:ascii="Times New Roman" w:hAnsi="Times New Roman" w:cs="Times New Roman" w:eastAsia="Times New Roman"/>
+                <w:b w:val="0"/>
+                <w:color w:val="000000"/>
+                <w:sz w:val="22"/>
+              </w:rPr>
+              <w:t>S1, S2, S3</w:t>
+            </w:r>
+          </w:p>
+        </w:tc>
+        <w:tc>
+          <w:tcPr>
+            <w:tcW w:type="dxa" w:w="2948"/>
+          </w:tcPr>
+          <w:p>
+            <w:pPr>
+              <w:keepNext/>
+              <w:spacing w:line="240" w:lineRule="auto" w:before="0" w:after="0"/>
+              <w:ind w:firstLine="0"/>
+              <w:jc w:val="left"/>
+            </w:pPr>
+            <w:r>
+              <w:rPr>
+                <w:rFonts w:ascii="Times New Roman" w:hAnsi="Times New Roman" w:cs="Times New Roman" w:eastAsia="Times New Roman"/>
+                <w:b w:val="0"/>
+                <w:color w:val="000000"/>
+                <w:sz w:val="22"/>
+              </w:rPr>
+              <w:t>Details lost between calls, Viber and Facebook; perishable produce waits for an answer</w:t>
+            </w:r>
+          </w:p>
+        </w:tc>
+        <w:tc>
+          <w:tcPr>
+            <w:tcW w:type="dxa" w:w="3402"/>
+          </w:tcPr>
+          <w:p>
+            <w:pPr>
+              <w:keepNext/>
+              <w:spacing w:line="240" w:lineRule="auto" w:before="0" w:after="0"/>
+              <w:ind w:firstLine="0"/>
+              <w:jc w:val="left"/>
+            </w:pPr>
+            <w:r>
+              <w:rPr>
+                <w:rFonts w:ascii="Times New Roman" w:hAnsi="Times New Roman" w:cs="Times New Roman" w:eastAsia="Times New Roman"/>
+                <w:b w:val="0"/>
+                <w:color w:val="000000"/>
+                <w:sz w:val="22"/>
+              </w:rPr>
+              <w:t>Messages attached to each order, e-mail and in-app notifications, a personal dashboard with all orders</w:t>
+            </w:r>
+          </w:p>
+        </w:tc>
+      </w:tr>
+    </w:tbl>
+    <w:p>
+      <w:pPr>
+        <w:keepNext/>
+        <w:spacing w:after="0"/>
+      </w:pPr>
+    </w:p>
+    <w:p>
+      <w:pPr>
+        <w:pStyle w:val="BodyText2026"/>
+      </w:pPr>
+      <w:r>
+        <w:rPr>
+          <w:rFonts w:ascii="Times New Roman" w:hAnsi="Times New Roman" w:cs="Times New Roman" w:eastAsia="Times New Roman"/>
+          <w:color w:val="000000"/>
+          <w:sz w:val="24"/>
+        </w:rPr>
+        <w:t>The three key problems are connected to each other. Without trust (KP1) a buyer does not risk ordering from an unknown producer; without a shared record (KP2) even a trusted partner can disappoint; and without fast communication (KP3) perishable goods lose value while the two parties wait for each other. Most of the alternatives from subchapter 1.3 solve one or two of these problems, which is why users keep returning to the phone for the rest of the deal.</w:t>
+      </w:r>
+    </w:p>
+    <w:p>
+      <w:pPr>
+        <w:pStyle w:val="BodyText2026"/>
+        <w:keepNext/>
+      </w:pPr>
+      <w:r>
+        <w:rPr>
+          <w:rFonts w:ascii="Times New Roman" w:hAnsi="Times New Roman" w:cs="Times New Roman" w:eastAsia="Times New Roman"/>
+          <w:color w:val="000000"/>
+          <w:sz w:val="24"/>
+        </w:rPr>
+        <w:t>A value proposition describes how a product relieves the pains of its customers and creates the gains they expect [16]. A unique value proposition goes one step further and states, in one or two sentences, why the product is a better choice than the alternatives the customer already has. For the proposed platform these alternatives are the phone and the messengers, the classified ads on 999.md and the specialised platforms analysed in subchapter 1.3. Taking them into account, the UVP of the platform is formulated as follows:</w:t>
+      </w:r>
+    </w:p>
+    <w:p>
+      <w:pPr>
+        <w:pStyle w:val="BodyText2026"/>
+        <w:spacing w:before="120" w:after="120"/>
+        <w:ind w:firstLine="0" w:left="709" w:right="709"/>
+        <w:jc w:val="both"/>
+        <w:keepLines/>
+        <w:pBdr>
+          <w:top w:val="single" w:sz="6" w:space="6" w:color="000000"/>
+          <w:left w:val="single" w:sz="6" w:space="6" w:color="000000"/>
+          <w:bottom w:val="single" w:sz="6" w:space="6" w:color="000000"/>
+          <w:right w:val="single" w:sz="6" w:space="6" w:color="000000"/>
+        </w:pBdr>
+      </w:pPr>
+      <w:r>
+        <w:rPr>
+          <w:rFonts w:ascii="Times New Roman" w:hAnsi="Times New Roman" w:cs="Times New Roman" w:eastAsia="Times New Roman"/>
+          <w:i/>
+          <w:color w:val="000000"/>
+          <w:sz w:val="24"/>
+        </w:rPr>
+        <w:t>“A free, Romanian-language B2B marketplace where Moldovan farmers and wholesale buyers trade agricultural produce directly: every listing shows the stock that is really available, every deal becomes an order with a clear status and its own conversation, and every participant is verified, so a harvest can be sold with a few taps on a phone instead of a day of phone calls.”</w:t>
+      </w:r>
+    </w:p>
+    <w:p>
+      <w:pPr>
+        <w:pStyle w:val="BodyText2026"/>
+      </w:pPr>
+      <w:r>
+        <w:rPr>
+          <w:rFonts w:ascii="Times New Roman" w:hAnsi="Times New Roman" w:cs="Times New Roman" w:eastAsia="Times New Roman"/>
+          <w:color w:val="000000"/>
+          <w:sz w:val="24"/>
+        </w:rPr>
+        <w:t>Each part of the statement answers one of the key problems. Verified participants and public reviews answer KP1, the real stock and the order with a status answer KP2, and the conversation attached to each order, together with notifications, answers KP3. The words "free" and "Romanian-language" are addressed mainly to segment S1, for whom cost and language are the first barriers. For the landing page and for promotion, the UVP was also reduced to two short messages, one for each primary segment: "Sell your harvest, not your time on the phone" for producers and "Order from verified farmers, with real stock and no calls" for buyers.</w:t>
+      </w:r>
+    </w:p>
+    <w:p>
+      <w:pPr>
+        <w:pStyle w:val="BodyText2026"/>
+        <w:keepNext/>
+      </w:pPr>
+      <w:r>
+        <w:rPr>
+          <w:rFonts w:ascii="Times New Roman" w:hAnsi="Times New Roman" w:cs="Times New Roman" w:eastAsia="Times New Roman"/>
+          <w:color w:val="000000"/>
+          <w:sz w:val="24"/>
+        </w:rPr>
+        <w:t>Formulating a UVP is useful only if it holds up against the alternatives. Table 1.11 compares the main advantages of the platform with the three groups of alternatives that the target audience uses today.</w:t>
+      </w:r>
+    </w:p>
+    <w:p>
+      <w:pPr>
+        <w:keepNext/>
+        <w:spacing w:before="120"/>
+        <w:jc w:val="right"/>
+      </w:pPr>
+      <w:r>
+        <w:rPr>
+          <w:rFonts w:ascii="Times New Roman" w:hAnsi="Times New Roman" w:cs="Times New Roman" w:eastAsia="Times New Roman"/>
+          <w:b/>
+          <w:color w:val="000000"/>
+          <w:sz w:val="24"/>
+        </w:rPr>
+        <w:t>Table 1.11 – Main competitive advantages of the platform compared to the alternatives</w:t>
+      </w:r>
+    </w:p>
+    <w:tbl>
+      <w:tblPr>
+        <w:tblStyle w:val="TableGrid"/>
+        <w:tblW w:type="auto" w:w="0"/>
+        <w:jc w:val="center"/>
+        <w:tblLayout w:type="fixed"/>
+        <w:tblLook w:firstColumn="1" w:firstRow="1" w:lastColumn="0" w:lastRow="0" w:noHBand="0" w:noVBand="1" w:val="04A0"/>
+      </w:tblPr>
+      <w:tblGrid>
+        <w:gridCol w:w="2041"/>
+        <w:gridCol w:w="2324"/>
+        <w:gridCol w:w="2664"/>
+        <w:gridCol w:w="2608"/>
+      </w:tblGrid>
+      <w:tr>
+        <w:trPr>
+          <w:tblHeader w:val="true"/>
+        </w:trPr>
+        <w:tc>
+          <w:tcPr>
+            <w:tcW w:type="dxa" w:w="2041"/>
+            <w:shd w:val="clear" w:color="auto" w:fill="D9D9D9"/>
+          </w:tcPr>
+          <w:p>
+            <w:pPr>
+              <w:keepNext/>
+              <w:spacing w:line="240" w:lineRule="auto" w:before="0" w:after="0"/>
+              <w:ind w:firstLine="0"/>
+              <w:jc w:val="center"/>
+            </w:pPr>
+            <w:r>
+              <w:rPr>
+                <w:rFonts w:ascii="Times New Roman" w:hAnsi="Times New Roman" w:cs="Times New Roman" w:eastAsia="Times New Roman"/>
+                <w:b/>
+                <w:color w:val="000000"/>
+                <w:sz w:val="22"/>
+              </w:rPr>
+              <w:t>Advantage</w:t>
+            </w:r>
+          </w:p>
+        </w:tc>
+        <w:tc>
+          <w:tcPr>
+            <w:tcW w:type="dxa" w:w="2324"/>
+            <w:shd w:val="clear" w:color="auto" w:fill="D9D9D9"/>
+          </w:tcPr>
+          <w:p>
+            <w:pPr>
+              <w:keepNext/>
+              <w:spacing w:line="240" w:lineRule="auto" w:before="0" w:after="0"/>
+              <w:ind w:firstLine="0"/>
+              <w:jc w:val="center"/>
+            </w:pPr>
+            <w:r>
+              <w:rPr>
+                <w:rFonts w:ascii="Times New Roman" w:hAnsi="Times New Roman" w:cs="Times New Roman" w:eastAsia="Times New Roman"/>
+                <w:b/>
+                <w:color w:val="000000"/>
+                <w:sz w:val="22"/>
+              </w:rPr>
+              <w:t>Compared to the phone and messengers</w:t>
+            </w:r>
+          </w:p>
+        </w:tc>
+        <w:tc>
+          <w:tcPr>
+            <w:tcW w:type="dxa" w:w="2665"/>
+            <w:shd w:val="clear" w:color="auto" w:fill="D9D9D9"/>
+          </w:tcPr>
+          <w:p>
+            <w:pPr>
+              <w:keepNext/>
+              <w:spacing w:line="240" w:lineRule="auto" w:before="0" w:after="0"/>
+              <w:ind w:firstLine="0"/>
+              <w:jc w:val="center"/>
+            </w:pPr>
+            <w:r>
+              <w:rPr>
+                <w:rFonts w:ascii="Times New Roman" w:hAnsi="Times New Roman" w:cs="Times New Roman" w:eastAsia="Times New Roman"/>
+                <w:b/>
+                <w:color w:val="000000"/>
+                <w:sz w:val="22"/>
+              </w:rPr>
+              <w:t>Compared to 999.md</w:t>
+            </w:r>
+          </w:p>
+        </w:tc>
+        <w:tc>
+          <w:tcPr>
+            <w:tcW w:type="dxa" w:w="2608"/>
+            <w:shd w:val="clear" w:color="auto" w:fill="D9D9D9"/>
+          </w:tcPr>
+          <w:p>
+            <w:pPr>
+              <w:keepNext/>
+              <w:spacing w:line="240" w:lineRule="auto" w:before="0" w:after="0"/>
+              <w:ind w:firstLine="0"/>
+              <w:jc w:val="center"/>
+            </w:pPr>
+            <w:r>
+              <w:rPr>
+                <w:rFonts w:ascii="Times New Roman" w:hAnsi="Times New Roman" w:cs="Times New Roman" w:eastAsia="Times New Roman"/>
+                <w:b/>
+                <w:color w:val="000000"/>
+                <w:sz w:val="22"/>
+              </w:rPr>
+              <w:t>Compared to specialised platforms</w:t>
+            </w:r>
+          </w:p>
+        </w:tc>
+      </w:tr>
+      <w:tr>
+        <w:trPr>
+          <w:cantSplit w:val="true"/>
+        </w:trPr>
+        <w:tc>
+          <w:tcPr>
+            <w:tcW w:type="dxa" w:w="2041"/>
+          </w:tcPr>
+          <w:p>
+            <w:pPr>
+              <w:keepNext/>
+              <w:spacing w:line="240" w:lineRule="auto" w:before="0" w:after="0"/>
+              <w:ind w:firstLine="0"/>
+              <w:jc w:val="left"/>
+            </w:pPr>
+            <w:r>
+              <w:rPr>
+                <w:rFonts w:ascii="Times New Roman" w:hAnsi="Times New Roman" w:cs="Times New Roman" w:eastAsia="Times New Roman"/>
+                <w:b w:val="0"/>
+                <w:color w:val="000000"/>
+                <w:sz w:val="22"/>
+              </w:rPr>
+              <w:t>Built for wholesale trade in farm produce</w:t>
+            </w:r>
+          </w:p>
+        </w:tc>
+        <w:tc>
+          <w:tcPr>
+            <w:tcW w:type="dxa" w:w="2324"/>
+          </w:tcPr>
+          <w:p>
+            <w:pPr>
+              <w:keepNext/>
+              <w:spacing w:line="240" w:lineRule="auto" w:before="0" w:after="0"/>
+              <w:ind w:firstLine="0"/>
+              <w:jc w:val="left"/>
+            </w:pPr>
+            <w:r>
+              <w:rPr>
+                <w:rFonts w:ascii="Times New Roman" w:hAnsi="Times New Roman" w:cs="Times New Roman" w:eastAsia="Times New Roman"/>
+                <w:b w:val="0"/>
+                <w:color w:val="000000"/>
+                <w:sz w:val="22"/>
+              </w:rPr>
+              <w:t>Reach beyond personal contacts</w:t>
+            </w:r>
+          </w:p>
+        </w:tc>
+        <w:tc>
+          <w:tcPr>
+            <w:tcW w:type="dxa" w:w="2665"/>
+          </w:tcPr>
+          <w:p>
+            <w:pPr>
+              <w:keepNext/>
+              <w:spacing w:line="240" w:lineRule="auto" w:before="0" w:after="0"/>
+              <w:ind w:firstLine="0"/>
+              <w:jc w:val="left"/>
+            </w:pPr>
+            <w:r>
+              <w:rPr>
+                <w:rFonts w:ascii="Times New Roman" w:hAnsi="Times New Roman" w:cs="Times New Roman" w:eastAsia="Times New Roman"/>
+                <w:b w:val="0"/>
+                <w:color w:val="000000"/>
+                <w:sz w:val="22"/>
+              </w:rPr>
+              <w:t>Each listing has quantity, price per kilogram, region, harvest date and delivery terms instead of free text</w:t>
+            </w:r>
+          </w:p>
+        </w:tc>
+        <w:tc>
+          <w:tcPr>
+            <w:tcW w:type="dxa" w:w="2608"/>
+          </w:tcPr>
+          <w:p>
+            <w:pPr>
+              <w:keepNext/>
+              <w:spacing w:line="240" w:lineRule="auto" w:before="0" w:after="0"/>
+              <w:ind w:firstLine="0"/>
+              <w:jc w:val="left"/>
+            </w:pPr>
+            <w:r>
+              <w:rPr>
+                <w:rFonts w:ascii="Times New Roman" w:hAnsi="Times New Roman" w:cs="Times New Roman" w:eastAsia="Times New Roman"/>
+                <w:b w:val="0"/>
+                <w:color w:val="000000"/>
+                <w:sz w:val="22"/>
+              </w:rPr>
+              <w:t>Local scale and lots of a few tonnes, not export containers or farm inputs</w:t>
+            </w:r>
+          </w:p>
+        </w:tc>
+      </w:tr>
+      <w:tr>
+        <w:trPr>
+          <w:cantSplit w:val="true"/>
+        </w:trPr>
+        <w:tc>
+          <w:tcPr>
+            <w:tcW w:type="dxa" w:w="2041"/>
+          </w:tcPr>
+          <w:p>
+            <w:pPr>
+              <w:keepNext/>
+              <w:spacing w:line="240" w:lineRule="auto" w:before="0" w:after="0"/>
+              <w:ind w:firstLine="0"/>
+              <w:jc w:val="left"/>
+            </w:pPr>
+            <w:r>
+              <w:rPr>
+                <w:rFonts w:ascii="Times New Roman" w:hAnsi="Times New Roman" w:cs="Times New Roman" w:eastAsia="Times New Roman"/>
+                <w:b w:val="0"/>
+                <w:color w:val="000000"/>
+                <w:sz w:val="22"/>
+              </w:rPr>
+              <w:t>Real stock linked to orders</w:t>
+            </w:r>
+          </w:p>
+        </w:tc>
+        <w:tc>
+          <w:tcPr>
+            <w:tcW w:type="dxa" w:w="2324"/>
+          </w:tcPr>
+          <w:p>
+            <w:pPr>
+              <w:keepNext/>
+              <w:spacing w:line="240" w:lineRule="auto" w:before="0" w:after="0"/>
+              <w:ind w:firstLine="0"/>
+              <w:jc w:val="left"/>
+            </w:pPr>
+            <w:r>
+              <w:rPr>
+                <w:rFonts w:ascii="Times New Roman" w:hAnsi="Times New Roman" w:cs="Times New Roman" w:eastAsia="Times New Roman"/>
+                <w:b w:val="0"/>
+                <w:color w:val="000000"/>
+                <w:sz w:val="22"/>
+              </w:rPr>
+              <w:t>Nothing has to be remembered, the stock updates itself</w:t>
+            </w:r>
+          </w:p>
+        </w:tc>
+        <w:tc>
+          <w:tcPr>
+            <w:tcW w:type="dxa" w:w="2665"/>
+          </w:tcPr>
+          <w:p>
+            <w:pPr>
+              <w:keepNext/>
+              <w:spacing w:line="240" w:lineRule="auto" w:before="0" w:after="0"/>
+              <w:ind w:firstLine="0"/>
+              <w:jc w:val="left"/>
+            </w:pPr>
+            <w:r>
+              <w:rPr>
+                <w:rFonts w:ascii="Times New Roman" w:hAnsi="Times New Roman" w:cs="Times New Roman" w:eastAsia="Times New Roman"/>
+                <w:b w:val="0"/>
+                <w:color w:val="000000"/>
+                <w:sz w:val="22"/>
+              </w:rPr>
+              <w:t>An ad does not show what is left</w:t>
+            </w:r>
+          </w:p>
+        </w:tc>
+        <w:tc>
+          <w:tcPr>
+            <w:tcW w:type="dxa" w:w="2608"/>
+          </w:tcPr>
+          <w:p>
+            <w:pPr>
+              <w:keepNext/>
+              <w:spacing w:line="240" w:lineRule="auto" w:before="0" w:after="0"/>
+              <w:ind w:firstLine="0"/>
+              <w:jc w:val="left"/>
+            </w:pPr>
+            <w:r>
+              <w:rPr>
+                <w:rFonts w:ascii="Times New Roman" w:hAnsi="Times New Roman" w:cs="Times New Roman" w:eastAsia="Times New Roman"/>
+                <w:b w:val="0"/>
+                <w:color w:val="000000"/>
+                <w:sz w:val="22"/>
+              </w:rPr>
+              <w:t>Found elsewhere mostly in paid enterprise software</w:t>
+            </w:r>
+          </w:p>
+        </w:tc>
+      </w:tr>
+      <w:tr>
+        <w:trPr>
+          <w:cantSplit w:val="true"/>
+        </w:trPr>
+        <w:tc>
+          <w:tcPr>
+            <w:tcW w:type="dxa" w:w="2041"/>
+          </w:tcPr>
+          <w:p>
+            <w:pPr>
+              <w:keepNext/>
+              <w:spacing w:line="240" w:lineRule="auto" w:before="0" w:after="0"/>
+              <w:ind w:firstLine="0"/>
+              <w:jc w:val="left"/>
+            </w:pPr>
+            <w:r>
+              <w:rPr>
+                <w:rFonts w:ascii="Times New Roman" w:hAnsi="Times New Roman" w:cs="Times New Roman" w:eastAsia="Times New Roman"/>
+                <w:b w:val="0"/>
+                <w:color w:val="000000"/>
+                <w:sz w:val="22"/>
+              </w:rPr>
+              <w:t>Order with a status and its own conversation</w:t>
+            </w:r>
+          </w:p>
+        </w:tc>
+        <w:tc>
+          <w:tcPr>
+            <w:tcW w:type="dxa" w:w="2324"/>
+          </w:tcPr>
+          <w:p>
+            <w:pPr>
+              <w:keepNext/>
+              <w:spacing w:line="240" w:lineRule="auto" w:before="0" w:after="0"/>
+              <w:ind w:firstLine="0"/>
+              <w:jc w:val="left"/>
+            </w:pPr>
+            <w:r>
+              <w:rPr>
+                <w:rFonts w:ascii="Times New Roman" w:hAnsi="Times New Roman" w:cs="Times New Roman" w:eastAsia="Times New Roman"/>
+                <w:b w:val="0"/>
+                <w:color w:val="000000"/>
+                <w:sz w:val="22"/>
+              </w:rPr>
+              <w:t>Agreements are written, not oral</w:t>
+            </w:r>
+          </w:p>
+        </w:tc>
+        <w:tc>
+          <w:tcPr>
+            <w:tcW w:type="dxa" w:w="2665"/>
+          </w:tcPr>
+          <w:p>
+            <w:pPr>
+              <w:keepNext/>
+              <w:spacing w:line="240" w:lineRule="auto" w:before="0" w:after="0"/>
+              <w:ind w:firstLine="0"/>
+              <w:jc w:val="left"/>
+            </w:pPr>
+            <w:r>
+              <w:rPr>
+                <w:rFonts w:ascii="Times New Roman" w:hAnsi="Times New Roman" w:cs="Times New Roman" w:eastAsia="Times New Roman"/>
+                <w:b w:val="0"/>
+                <w:color w:val="000000"/>
+                <w:sz w:val="22"/>
+              </w:rPr>
+              <w:t>The deal continues on the platform, not by phone</w:t>
+            </w:r>
+          </w:p>
+        </w:tc>
+        <w:tc>
+          <w:tcPr>
+            <w:tcW w:type="dxa" w:w="2608"/>
+          </w:tcPr>
+          <w:p>
+            <w:pPr>
+              <w:keepNext/>
+              <w:spacing w:line="240" w:lineRule="auto" w:before="0" w:after="0"/>
+              <w:ind w:firstLine="0"/>
+              <w:jc w:val="left"/>
+            </w:pPr>
+            <w:r>
+              <w:rPr>
+                <w:rFonts w:ascii="Times New Roman" w:hAnsi="Times New Roman" w:cs="Times New Roman" w:eastAsia="Times New Roman"/>
+                <w:b w:val="0"/>
+                <w:color w:val="000000"/>
+                <w:sz w:val="22"/>
+              </w:rPr>
+              <w:t>Similar functions, but free and in Romanian</w:t>
+            </w:r>
+          </w:p>
+        </w:tc>
+      </w:tr>
+      <w:tr>
+        <w:trPr>
+          <w:cantSplit w:val="true"/>
+        </w:trPr>
+        <w:tc>
+          <w:tcPr>
+            <w:tcW w:type="dxa" w:w="2041"/>
+          </w:tcPr>
+          <w:p>
+            <w:pPr>
+              <w:keepNext/>
+              <w:spacing w:line="240" w:lineRule="auto" w:before="0" w:after="0"/>
+              <w:ind w:firstLine="0"/>
+              <w:jc w:val="left"/>
+            </w:pPr>
+            <w:r>
+              <w:rPr>
+                <w:rFonts w:ascii="Times New Roman" w:hAnsi="Times New Roman" w:cs="Times New Roman" w:eastAsia="Times New Roman"/>
+                <w:b w:val="0"/>
+                <w:color w:val="000000"/>
+                <w:sz w:val="22"/>
+              </w:rPr>
+              <w:t>Verification and reviews</w:t>
+            </w:r>
+          </w:p>
+        </w:tc>
+        <w:tc>
+          <w:tcPr>
+            <w:tcW w:type="dxa" w:w="2324"/>
+          </w:tcPr>
+          <w:p>
+            <w:pPr>
+              <w:keepNext/>
+              <w:spacing w:line="240" w:lineRule="auto" w:before="0" w:after="0"/>
+              <w:ind w:firstLine="0"/>
+              <w:jc w:val="left"/>
+            </w:pPr>
+            <w:r>
+              <w:rPr>
+                <w:rFonts w:ascii="Times New Roman" w:hAnsi="Times New Roman" w:cs="Times New Roman" w:eastAsia="Times New Roman"/>
+                <w:b w:val="0"/>
+                <w:color w:val="000000"/>
+                <w:sz w:val="22"/>
+              </w:rPr>
+              <w:t>Trust beyond the circle of acquaintances</w:t>
+            </w:r>
+          </w:p>
+        </w:tc>
+        <w:tc>
+          <w:tcPr>
+            <w:tcW w:type="dxa" w:w="2665"/>
+          </w:tcPr>
+          <w:p>
+            <w:pPr>
+              <w:keepNext/>
+              <w:spacing w:line="240" w:lineRule="auto" w:before="0" w:after="0"/>
+              <w:ind w:firstLine="0"/>
+              <w:jc w:val="left"/>
+            </w:pPr>
+            <w:r>
+              <w:rPr>
+                <w:rFonts w:ascii="Times New Roman" w:hAnsi="Times New Roman" w:cs="Times New Roman" w:eastAsia="Times New Roman"/>
+                <w:b w:val="0"/>
+                <w:color w:val="000000"/>
+                <w:sz w:val="22"/>
+              </w:rPr>
+              <w:t>Accounts and listings are checked, including an automatic check of every new listing</w:t>
+            </w:r>
+          </w:p>
+        </w:tc>
+        <w:tc>
+          <w:tcPr>
+            <w:tcW w:type="dxa" w:w="2608"/>
+          </w:tcPr>
+          <w:p>
+            <w:pPr>
+              <w:keepNext/>
+              <w:spacing w:line="240" w:lineRule="auto" w:before="0" w:after="0"/>
+              <w:ind w:firstLine="0"/>
+              <w:jc w:val="left"/>
+            </w:pPr>
+            <w:r>
+              <w:rPr>
+                <w:rFonts w:ascii="Times New Roman" w:hAnsi="Times New Roman" w:cs="Times New Roman" w:eastAsia="Times New Roman"/>
+                <w:b w:val="0"/>
+                <w:color w:val="000000"/>
+                <w:sz w:val="22"/>
+              </w:rPr>
+              <w:t>Similar level of trust, adapted to small producers</w:t>
+            </w:r>
+          </w:p>
+        </w:tc>
+      </w:tr>
+      <w:tr>
+        <w:trPr>
+          <w:cantSplit w:val="true"/>
+        </w:trPr>
+        <w:tc>
+          <w:tcPr>
+            <w:tcW w:type="dxa" w:w="2041"/>
+          </w:tcPr>
+          <w:p>
+            <w:pPr>
+              <w:keepNext/>
+              <w:spacing w:line="240" w:lineRule="auto" w:before="0" w:after="0"/>
+              <w:ind w:firstLine="0"/>
+              <w:jc w:val="left"/>
+            </w:pPr>
+            <w:r>
+              <w:rPr>
+                <w:rFonts w:ascii="Times New Roman" w:hAnsi="Times New Roman" w:cs="Times New Roman" w:eastAsia="Times New Roman"/>
+                <w:b w:val="0"/>
+                <w:color w:val="000000"/>
+                <w:sz w:val="22"/>
+              </w:rPr>
+              <w:t>No fees, works in the browser of any phone</w:t>
+            </w:r>
+          </w:p>
+        </w:tc>
+        <w:tc>
+          <w:tcPr>
+            <w:tcW w:type="dxa" w:w="2324"/>
+          </w:tcPr>
+          <w:p>
+            <w:pPr>
+              <w:keepNext/>
+              <w:spacing w:line="240" w:lineRule="auto" w:before="0" w:after="0"/>
+              <w:ind w:firstLine="0"/>
+              <w:jc w:val="left"/>
+            </w:pPr>
+            <w:r>
+              <w:rPr>
+                <w:rFonts w:ascii="Times New Roman" w:hAnsi="Times New Roman" w:cs="Times New Roman" w:eastAsia="Times New Roman"/>
+                <w:b w:val="0"/>
+                <w:color w:val="000000"/>
+                <w:sz w:val="22"/>
+              </w:rPr>
+              <w:t>No extra costs, nothing to install</w:t>
+            </w:r>
+          </w:p>
+        </w:tc>
+        <w:tc>
+          <w:tcPr>
+            <w:tcW w:type="dxa" w:w="2665"/>
+          </w:tcPr>
+          <w:p>
+            <w:pPr>
+              <w:keepNext/>
+              <w:spacing w:line="240" w:lineRule="auto" w:before="0" w:after="0"/>
+              <w:ind w:firstLine="0"/>
+              <w:jc w:val="left"/>
+            </w:pPr>
+            <w:r>
+              <w:rPr>
+                <w:rFonts w:ascii="Times New Roman" w:hAnsi="Times New Roman" w:cs="Times New Roman" w:eastAsia="Times New Roman"/>
+                <w:b w:val="0"/>
+                <w:color w:val="000000"/>
+                <w:sz w:val="22"/>
+              </w:rPr>
+              <w:t>The same accessibility, with more structure</w:t>
+            </w:r>
+          </w:p>
+        </w:tc>
+        <w:tc>
+          <w:tcPr>
+            <w:tcW w:type="dxa" w:w="2608"/>
+          </w:tcPr>
+          <w:p>
+            <w:pPr>
+              <w:keepNext/>
+              <w:spacing w:line="240" w:lineRule="auto" w:before="0" w:after="0"/>
+              <w:ind w:firstLine="0"/>
+              <w:jc w:val="left"/>
+            </w:pPr>
+            <w:r>
+              <w:rPr>
+                <w:rFonts w:ascii="Times New Roman" w:hAnsi="Times New Roman" w:cs="Times New Roman" w:eastAsia="Times New Roman"/>
+                <w:b w:val="0"/>
+                <w:color w:val="000000"/>
+                <w:sz w:val="22"/>
+              </w:rPr>
+              <w:t>Not available in Moldova or paid</w:t>
+            </w:r>
+          </w:p>
+        </w:tc>
+      </w:tr>
+    </w:tbl>
+    <w:p>
+      <w:pPr>
+        <w:keepNext/>
+        <w:spacing w:after="0"/>
+      </w:pPr>
+    </w:p>
+    <w:p>
+      <w:pPr>
+        <w:pStyle w:val="BodyText2026"/>
+      </w:pPr>
+      <w:r>
+        <w:rPr>
+          <w:rFonts w:ascii="Times New Roman" w:hAnsi="Times New Roman" w:cs="Times New Roman" w:eastAsia="Times New Roman"/>
+          <w:color w:val="000000"/>
+          <w:sz w:val="24"/>
+        </w:rPr>
+        <w:t>None of these advantages is impossible to copy on its own. What makes the platform different is their combination and its focus on one specific job: wholesale trade in fresh produce between Moldovan farmers and the companies that buy from them. 999.md is too general to do this job well, Agromag.md sells in the opposite direction, and the international platforms are built for other markets and much larger companies. This focus is the main competitive advantage, and it also sets the priority for the launch: the UVP addresses producers first, because they bring the supply, while buyers are attracted by the number of real offers.</w:t>
+      </w:r>
+    </w:p>
+    <w:p>
+      <w:pPr>
+        <w:pStyle w:val="BodyText2026"/>
+      </w:pPr>
+      <w:r>
+        <w:rPr>
+          <w:rFonts w:ascii="Times New Roman" w:hAnsi="Times New Roman" w:cs="Times New Roman" w:eastAsia="Times New Roman"/>
+          <w:color w:val="000000"/>
+          <w:sz w:val="24"/>
+        </w:rPr>
+        <w:t>With the target audience, the key problems and the value proposition defined, the next step is to translate them into the technical specification and the requirements of the system, which are presented in subchapter 1.6.</w:t>
+      </w:r>
+    </w:p>
+    <w:p>
+      <w:pPr>
         <w:pStyle w:val="Heading1"/>
       </w:pPr>
-      <w:bookmarkStart w:id="107" w:name="_Toc900107"/>
+      <w:bookmarkStart w:id="108" w:name="_Toc900108"/>
       <w:r>
         <w:rPr>
           <w:rFonts w:ascii="Times New Roman" w:hAnsi="Times New Roman" w:cs="Times New Roman" w:eastAsia="Times New Roman"/>
@@ -8044,7 +9949,7 @@
         </w:rPr>
         <w:t>2 UML MODELLING OF THE SYSTEM</w:t>
       </w:r>
-      <w:bookmarkEnd w:id="107"/>
+      <w:bookmarkEnd w:id="108"/>
     </w:p>
     <w:p>
       <w:pPr>
@@ -8064,7 +9969,7 @@
       <w:pPr>
         <w:pStyle w:val="Heading1"/>
       </w:pPr>
-      <w:bookmarkStart w:id="108" w:name="_Toc900108"/>
+      <w:bookmarkStart w:id="109" w:name="_Toc900109"/>
       <w:r>
         <w:rPr>
           <w:rFonts w:ascii="Times New Roman" w:hAnsi="Times New Roman" w:cs="Times New Roman" w:eastAsia="Times New Roman"/>
@@ -8074,7 +9979,7 @@
         </w:rPr>
         <w:t>3 IMPLEMENTATION OF THE SYSTEM</w:t>
       </w:r>
-      <w:bookmarkEnd w:id="108"/>
+      <w:bookmarkEnd w:id="109"/>
     </w:p>
     <w:p>
       <w:pPr>
@@ -8094,7 +9999,7 @@
       <w:pPr>
         <w:pStyle w:val="Heading1"/>
       </w:pPr>
-      <w:bookmarkStart w:id="109" w:name="_Toc900109"/>
+      <w:bookmarkStart w:id="110" w:name="_Toc900110"/>
       <w:r>
         <w:rPr>
           <w:rFonts w:ascii="Times New Roman" w:hAnsi="Times New Roman" w:cs="Times New Roman" w:eastAsia="Times New Roman"/>
@@ -8104,7 +10009,7 @@
         </w:rPr>
         <w:t>CONCLUSIONS</w:t>
       </w:r>
-      <w:bookmarkEnd w:id="109"/>
+      <w:bookmarkEnd w:id="110"/>
     </w:p>
     <w:p>
       <w:pPr>
@@ -8124,7 +10029,7 @@
       <w:pPr>
         <w:pStyle w:val="Heading1"/>
       </w:pPr>
-      <w:bookmarkStart w:id="110" w:name="_Toc900110"/>
+      <w:bookmarkStart w:id="111" w:name="_Toc900111"/>
       <w:r>
         <w:rPr>
           <w:rFonts w:ascii="Times New Roman" w:hAnsi="Times New Roman" w:cs="Times New Roman" w:eastAsia="Times New Roman"/>
@@ -8134,7 +10039,7 @@
         </w:rPr>
         <w:t>REFERENCES</w:t>
       </w:r>
-      <w:bookmarkEnd w:id="110"/>
+      <w:bookmarkEnd w:id="111"/>
     </w:p>
     <w:p>
       <w:pPr>
@@ -8413,14 +10318,54 @@
         </w:rPr>
         <w:t>[14]</w:t>
         <w:tab/>
+        <w:t>P. Kotler and K. L. Keller, Marketing Management, 15th ed. Harlow, England: Pearson Education, 2016.</w:t>
+      </w:r>
+    </w:p>
+    <w:p>
+      <w:pPr>
+        <w:tabs>
+          <w:tab w:pos="567" w:val="left"/>
+        </w:tabs>
+        <w:spacing w:after="60"/>
+        <w:ind w:left="567" w:hanging="567"/>
+        <w:jc w:val="left"/>
+      </w:pPr>
+      <w:r>
+        <w:rPr>
+          <w:rFonts w:ascii="Times New Roman" w:hAnsi="Times New Roman" w:cs="Times New Roman" w:eastAsia="Times New Roman"/>
+          <w:color w:val="000000"/>
+          <w:sz w:val="24"/>
+        </w:rPr>
+        <w:t>[15]</w:t>
+        <w:tab/>
         <w:t>A. Cooper, The Inmates Are Running the Asylum. Indianapolis, IN, USA: Sams Publishing, 1999.</w:t>
       </w:r>
     </w:p>
     <w:p>
       <w:pPr>
+        <w:tabs>
+          <w:tab w:pos="567" w:val="left"/>
+        </w:tabs>
+        <w:spacing w:after="60"/>
+        <w:ind w:left="567" w:hanging="567"/>
+        <w:jc w:val="left"/>
+      </w:pPr>
+      <w:r>
+        <w:rPr>
+          <w:rFonts w:ascii="Times New Roman" w:hAnsi="Times New Roman" w:cs="Times New Roman" w:eastAsia="Times New Roman"/>
+          <w:color w:val="000000"/>
+          <w:sz w:val="24"/>
+        </w:rPr>
+        <w:t>[16]</w:t>
+        <w:tab/>
+        <w:t>A. Osterwalder, Y. Pigneur, G. Bernarda, and A. Smith, Value Proposition Design: How to Create Products and Services Customers Want. Hoboken, NJ, USA: Wiley, 2014.</w:t>
+      </w:r>
+    </w:p>
+    <w:p>
+      <w:pPr>
         <w:pStyle w:val="Heading1"/>
       </w:pPr>
-      <w:bookmarkStart w:id="111" w:name="_Toc900111"/>
+      <w:bookmarkStart w:id="112" w:name="_Toc900112"/>
       <w:r>
         <w:rPr>
           <w:rFonts w:ascii="Times New Roman" w:hAnsi="Times New Roman" w:cs="Times New Roman" w:eastAsia="Times New Roman"/>
@@ -8430,7 +10375,7 @@
         </w:rPr>
         <w:t>APPENDICES</w:t>
       </w:r>
-      <w:bookmarkEnd w:id="111"/>
+      <w:bookmarkEnd w:id="112"/>
     </w:p>
     <w:p>
       <w:pPr>
@@ -8439,7 +10384,7 @@
         <w:ind w:firstLine="0"/>
         <w:jc w:val="center"/>
       </w:pPr>
-      <w:bookmarkStart w:id="112" w:name="_Toc900112"/>
+      <w:bookmarkStart w:id="113" w:name="_Toc900113"/>
       <w:r>
         <w:rPr>
           <w:rFonts w:ascii="Times New Roman" w:hAnsi="Times New Roman" w:cs="Times New Roman" w:eastAsia="Times New Roman"/>
@@ -8449,7 +10394,7 @@
         </w:rPr>
         <w:t>APPENDIX A – Project proposal</w:t>
       </w:r>
-      <w:bookmarkEnd w:id="112"/>
+      <w:bookmarkEnd w:id="113"/>
     </w:p>
     <w:p>
       <w:pPr>
@@ -8757,7 +10702,7 @@
         <w:ind w:firstLine="0"/>
         <w:jc w:val="center"/>
       </w:pPr>
-      <w:bookmarkStart w:id="113" w:name="_Toc900113"/>
+      <w:bookmarkStart w:id="114" w:name="_Toc900114"/>
       <w:r>
         <w:rPr>
           <w:rFonts w:ascii="Times New Roman" w:hAnsi="Times New Roman" w:cs="Times New Roman" w:eastAsia="Times New Roman"/>
@@ -8767,7 +10712,7 @@
         </w:rPr>
         <w:t>APPENDIX B – Questionnaire and interview guide</w:t>
       </w:r>
-      <w:bookmarkEnd w:id="113"/>
+      <w:bookmarkEnd w:id="114"/>
     </w:p>
     <w:p>
       <w:pPr>

</xml_diff>

<commit_message>
docs: ISO/IEC 25010 non-functional requirements as a separate SRS section; SRS keeps the functional part
Co-Authored-By: Claude Opus 5.5 <noreply@anthropic.com>
Claude-Session: https://claude.ai/code/session_01RkP9vNtLWcsuApJJdu9eVr
</commit_message>
<xml_diff>
--- a/docs/thesis/PBL_Report_Obrijan_Filip_FAF232.docx
+++ b/docs/thesis/PBL_Report_Obrijan_Filip_FAF232.docx
@@ -1499,7 +1499,7 @@
                 <w:rFonts w:ascii="Times New Roman" w:hAnsi="Times New Roman" w:cs="Times New Roman"/>
                 <w:noProof/>
               </w:rPr>
-              <w:t xml:space="preserve">31</w:t>
+              <w:t xml:space="preserve">30</w:t>
             </w:r>
             <w:r>
               <w:rPr>
@@ -19038,7 +19038,6 @@
     <w:p>
       <w:pPr>
         <w:pStyle w:val="BodyText2026"/>
-        <w:keepNext/>
       </w:pPr>
       <w:r>
         <w:rPr>
@@ -19046,7 +19045,21 @@
           <w:color w:val="000000"/>
           <w:sz w:val="24"/>
         </w:rPr>
-        <w:t>The non-functional requirements describe how well the system must perform its functions. They were formulated in a measurable way, so that each of them can be checked, and are grouped into two tables. Table 1.19 covers performance, reliability, usability, portability and maintainability.</w:t>
+        <w:t>The non-functional requirements describe the quality of the system rather than its functions. They were classified according to the product quality model of ISO/IEC 25010:2023, which describes software quality through nine characteristics, each divided into subcharacteristics: functional suitability, performance efficiency, compatibility, interaction capability, reliability, security, maintainability, flexibility and safety [21]. Compared to the 2011 edition, usability was renamed interaction capability, portability was renamed flexibility, and safety was added.</w:t>
+      </w:r>
+    </w:p>
+    <w:p>
+      <w:pPr>
+        <w:pStyle w:val="BodyText2026"/>
+        <w:keepNext/>
+      </w:pPr>
+      <w:r>
+        <w:rPr>
+          <w:rFonts w:ascii="Times New Roman" w:hAnsi="Times New Roman" w:cs="Times New Roman" w:eastAsia="Times New Roman"/>
+          <w:color w:val="000000"/>
+          <w:sz w:val="24"/>
+        </w:rPr>
+        <w:t>For every requirement a measurable acceptance criterion was defined, together with the way it is checked: a load test, the automated API tests, monitoring of the public version or a short test with users. Table 1.19 contains the requirements for performance efficiency and reliability.</w:t>
       </w:r>
     </w:p>
     <w:p>
@@ -19062,7 +19075,7 @@
           <w:color w:val="000000"/>
           <w:sz w:val="24"/>
         </w:rPr>
-        <w:t>Table 1.19 – Non-functional requirements: quality of the system</w:t>
+        <w:t>Table 1.19 – Non-functional requirements: performance efficiency and reliability</w:t>
       </w:r>
     </w:p>
     <w:tbl>
@@ -19074,9 +19087,10 @@
         <w:tblLook w:firstColumn="1" w:firstRow="1" w:lastColumn="0" w:lastRow="0" w:noHBand="0" w:noVBand="1" w:val="04A0"/>
       </w:tblPr>
       <w:tblGrid>
-        <w:gridCol w:w="1020"/>
-        <w:gridCol w:w="1701"/>
-        <w:gridCol w:w="7484"/>
+        <w:gridCol w:w="1077"/>
+        <w:gridCol w:w="2381"/>
+        <w:gridCol w:w="2154"/>
+        <w:gridCol w:w="4592"/>
       </w:tblGrid>
       <w:tr>
         <w:trPr>
@@ -19084,7 +19098,7 @@
         </w:trPr>
         <w:tc>
           <w:tcPr>
-            <w:tcW w:type="dxa" w:w="1020"/>
+            <w:tcW w:type="dxa" w:w="1077"/>
             <w:shd w:val="clear" w:color="auto" w:fill="D9D9D9"/>
           </w:tcPr>
           <w:p>
@@ -19107,7 +19121,7 @@
         </w:tc>
         <w:tc>
           <w:tcPr>
-            <w:tcW w:type="dxa" w:w="1701"/>
+            <w:tcW w:type="dxa" w:w="2381"/>
             <w:shd w:val="clear" w:color="auto" w:fill="D9D9D9"/>
           </w:tcPr>
           <w:p>
@@ -19124,13 +19138,13 @@
                 <w:color w:val="000000"/>
                 <w:sz w:val="22"/>
               </w:rPr>
-              <w:t>Category</w:t>
-            </w:r>
-          </w:p>
-        </w:tc>
-        <w:tc>
-          <w:tcPr>
-            <w:tcW w:type="dxa" w:w="7483"/>
+              <w:t>Requirement</w:t>
+            </w:r>
+          </w:p>
+        </w:tc>
+        <w:tc>
+          <w:tcPr>
+            <w:tcW w:type="dxa" w:w="2154"/>
             <w:shd w:val="clear" w:color="auto" w:fill="D9D9D9"/>
           </w:tcPr>
           <w:p>
@@ -19147,7 +19161,30 @@
                 <w:color w:val="000000"/>
                 <w:sz w:val="22"/>
               </w:rPr>
-              <w:t>Requirement</w:t>
+              <w:t>ISO/IEC 25010 characteristic (subcharacteristic)</w:t>
+            </w:r>
+          </w:p>
+        </w:tc>
+        <w:tc>
+          <w:tcPr>
+            <w:tcW w:type="dxa" w:w="4592"/>
+            <w:shd w:val="clear" w:color="auto" w:fill="D9D9D9"/>
+          </w:tcPr>
+          <w:p>
+            <w:pPr>
+              <w:keepNext/>
+              <w:spacing w:line="240" w:lineRule="auto" w:before="0" w:after="0"/>
+              <w:ind w:firstLine="0"/>
+              <w:jc w:val="center"/>
+            </w:pPr>
+            <w:r>
+              <w:rPr>
+                <w:rFonts w:ascii="Times New Roman" w:hAnsi="Times New Roman" w:cs="Times New Roman" w:eastAsia="Times New Roman"/>
+                <w:b/>
+                <w:color w:val="000000"/>
+                <w:sz w:val="22"/>
+              </w:rPr>
+              <w:t>Measurable acceptance criterion</w:t>
             </w:r>
           </w:p>
         </w:tc>
@@ -19158,7 +19195,7 @@
         </w:trPr>
         <w:tc>
           <w:tcPr>
-            <w:tcW w:type="dxa" w:w="1020"/>
+            <w:tcW w:type="dxa" w:w="1077"/>
           </w:tcPr>
           <w:p>
             <w:pPr>
@@ -19180,45 +19217,67 @@
         </w:tc>
         <w:tc>
           <w:tcPr>
-            <w:tcW w:type="dxa" w:w="1701"/>
-          </w:tcPr>
-          <w:p>
-            <w:pPr>
-              <w:keepNext/>
-              <w:spacing w:line="240" w:lineRule="auto" w:before="0" w:after="0"/>
-              <w:ind w:firstLine="0"/>
-              <w:jc w:val="left"/>
-            </w:pPr>
-            <w:r>
-              <w:rPr>
-                <w:rFonts w:ascii="Times New Roman" w:hAnsi="Times New Roman" w:cs="Times New Roman" w:eastAsia="Times New Roman"/>
-                <w:b w:val="0"/>
-                <w:color w:val="000000"/>
-                <w:sz w:val="22"/>
-              </w:rPr>
-              <w:t>Performance</w:t>
-            </w:r>
-          </w:p>
-        </w:tc>
-        <w:tc>
-          <w:tcPr>
-            <w:tcW w:type="dxa" w:w="7483"/>
-          </w:tcPr>
-          <w:p>
-            <w:pPr>
-              <w:keepNext/>
-              <w:spacing w:line="240" w:lineRule="auto" w:before="0" w:after="0"/>
-              <w:ind w:firstLine="0"/>
-              <w:jc w:val="left"/>
-            </w:pPr>
-            <w:r>
-              <w:rPr>
-                <w:rFonts w:ascii="Times New Roman" w:hAnsi="Times New Roman" w:cs="Times New Roman" w:eastAsia="Times New Roman"/>
-                <w:b w:val="0"/>
-                <w:color w:val="000000"/>
-                <w:sz w:val="22"/>
-              </w:rPr>
-              <w:t>The catalogue and the usual operations respond in at most 2 seconds with up to 1,000 active listings</w:t>
+            <w:tcW w:type="dxa" w:w="2381"/>
+          </w:tcPr>
+          <w:p>
+            <w:pPr>
+              <w:keepNext/>
+              <w:spacing w:line="240" w:lineRule="auto" w:before="0" w:after="0"/>
+              <w:ind w:firstLine="0"/>
+              <w:jc w:val="left"/>
+            </w:pPr>
+            <w:r>
+              <w:rPr>
+                <w:rFonts w:ascii="Times New Roman" w:hAnsi="Times New Roman" w:cs="Times New Roman" w:eastAsia="Times New Roman"/>
+                <w:b w:val="0"/>
+                <w:color w:val="000000"/>
+                <w:sz w:val="22"/>
+              </w:rPr>
+              <w:t>The catalogue and the order operations respond quickly</w:t>
+            </w:r>
+          </w:p>
+        </w:tc>
+        <w:tc>
+          <w:tcPr>
+            <w:tcW w:type="dxa" w:w="2154"/>
+          </w:tcPr>
+          <w:p>
+            <w:pPr>
+              <w:keepNext/>
+              <w:spacing w:line="240" w:lineRule="auto" w:before="0" w:after="0"/>
+              <w:ind w:firstLine="0"/>
+              <w:jc w:val="left"/>
+            </w:pPr>
+            <w:r>
+              <w:rPr>
+                <w:rFonts w:ascii="Times New Roman" w:hAnsi="Times New Roman" w:cs="Times New Roman" w:eastAsia="Times New Roman"/>
+                <w:b w:val="0"/>
+                <w:color w:val="000000"/>
+                <w:sz w:val="22"/>
+              </w:rPr>
+              <w:t>Performance efficiency (time behaviour)</w:t>
+            </w:r>
+          </w:p>
+        </w:tc>
+        <w:tc>
+          <w:tcPr>
+            <w:tcW w:type="dxa" w:w="4592"/>
+          </w:tcPr>
+          <w:p>
+            <w:pPr>
+              <w:keepNext/>
+              <w:spacing w:line="240" w:lineRule="auto" w:before="0" w:after="0"/>
+              <w:ind w:firstLine="0"/>
+              <w:jc w:val="left"/>
+            </w:pPr>
+            <w:r>
+              <w:rPr>
+                <w:rFonts w:ascii="Times New Roman" w:hAnsi="Times New Roman" w:cs="Times New Roman" w:eastAsia="Times New Roman"/>
+                <w:b w:val="0"/>
+                <w:color w:val="000000"/>
+                <w:sz w:val="22"/>
+              </w:rPr>
+              <w:t>95% of the requests for the catalogue, placing an order and changing its status are answered in under 2 seconds, measured on 200 requests with 1,000 active listings</w:t>
             </w:r>
           </w:p>
         </w:tc>
@@ -19229,7 +19288,7 @@
         </w:trPr>
         <w:tc>
           <w:tcPr>
-            <w:tcW w:type="dxa" w:w="1020"/>
+            <w:tcW w:type="dxa" w:w="1077"/>
           </w:tcPr>
           <w:p>
             <w:pPr>
@@ -19251,45 +19310,67 @@
         </w:tc>
         <w:tc>
           <w:tcPr>
-            <w:tcW w:type="dxa" w:w="1701"/>
-          </w:tcPr>
-          <w:p>
-            <w:pPr>
-              <w:keepNext/>
-              <w:spacing w:line="240" w:lineRule="auto" w:before="0" w:after="0"/>
-              <w:ind w:firstLine="0"/>
-              <w:jc w:val="left"/>
-            </w:pPr>
-            <w:r>
-              <w:rPr>
-                <w:rFonts w:ascii="Times New Roman" w:hAnsi="Times New Roman" w:cs="Times New Roman" w:eastAsia="Times New Roman"/>
-                <w:b w:val="0"/>
-                <w:color w:val="000000"/>
-                <w:sz w:val="22"/>
-              </w:rPr>
-              <w:t>Data integrity</w:t>
-            </w:r>
-          </w:p>
-        </w:tc>
-        <w:tc>
-          <w:tcPr>
-            <w:tcW w:type="dxa" w:w="7483"/>
-          </w:tcPr>
-          <w:p>
-            <w:pPr>
-              <w:keepNext/>
-              <w:spacing w:line="240" w:lineRule="auto" w:before="0" w:after="0"/>
-              <w:ind w:firstLine="0"/>
-              <w:jc w:val="left"/>
-            </w:pPr>
-            <w:r>
-              <w:rPr>
-                <w:rFonts w:ascii="Times New Roman" w:hAnsi="Times New Roman" w:cs="Times New Roman" w:eastAsia="Times New Roman"/>
-                <w:b w:val="0"/>
-                <w:color w:val="000000"/>
-                <w:sz w:val="22"/>
-              </w:rPr>
-              <w:t>Simultaneous operations on the same listing never lead to selling more than the available stock</w:t>
+            <w:tcW w:type="dxa" w:w="2381"/>
+          </w:tcPr>
+          <w:p>
+            <w:pPr>
+              <w:keepNext/>
+              <w:spacing w:line="240" w:lineRule="auto" w:before="0" w:after="0"/>
+              <w:ind w:firstLine="0"/>
+              <w:jc w:val="left"/>
+            </w:pPr>
+            <w:r>
+              <w:rPr>
+                <w:rFonts w:ascii="Times New Roman" w:hAnsi="Times New Roman" w:cs="Times New Roman" w:eastAsia="Times New Roman"/>
+                <w:b w:val="0"/>
+                <w:color w:val="000000"/>
+                <w:sz w:val="22"/>
+              </w:rPr>
+              <w:t>The system serves many users at the same time</w:t>
+            </w:r>
+          </w:p>
+        </w:tc>
+        <w:tc>
+          <w:tcPr>
+            <w:tcW w:type="dxa" w:w="2154"/>
+          </w:tcPr>
+          <w:p>
+            <w:pPr>
+              <w:keepNext/>
+              <w:spacing w:line="240" w:lineRule="auto" w:before="0" w:after="0"/>
+              <w:ind w:firstLine="0"/>
+              <w:jc w:val="left"/>
+            </w:pPr>
+            <w:r>
+              <w:rPr>
+                <w:rFonts w:ascii="Times New Roman" w:hAnsi="Times New Roman" w:cs="Times New Roman" w:eastAsia="Times New Roman"/>
+                <w:b w:val="0"/>
+                <w:color w:val="000000"/>
+                <w:sz w:val="22"/>
+              </w:rPr>
+              <w:t>Performance efficiency (capacity)</w:t>
+            </w:r>
+          </w:p>
+        </w:tc>
+        <w:tc>
+          <w:tcPr>
+            <w:tcW w:type="dxa" w:w="4592"/>
+          </w:tcPr>
+          <w:p>
+            <w:pPr>
+              <w:keepNext/>
+              <w:spacing w:line="240" w:lineRule="auto" w:before="0" w:after="0"/>
+              <w:ind w:firstLine="0"/>
+              <w:jc w:val="left"/>
+            </w:pPr>
+            <w:r>
+              <w:rPr>
+                <w:rFonts w:ascii="Times New Roman" w:hAnsi="Times New Roman" w:cs="Times New Roman" w:eastAsia="Times New Roman"/>
+                <w:b w:val="0"/>
+                <w:color w:val="000000"/>
+                <w:sz w:val="22"/>
+              </w:rPr>
+              <w:t>With 50 simultaneous virtual users for 5 minutes, fewer than 1% of the requests fail and 95% are answered in under 3 seconds</w:t>
             </w:r>
           </w:p>
         </w:tc>
@@ -19300,7 +19381,7 @@
         </w:trPr>
         <w:tc>
           <w:tcPr>
-            <w:tcW w:type="dxa" w:w="1020"/>
+            <w:tcW w:type="dxa" w:w="1077"/>
           </w:tcPr>
           <w:p>
             <w:pPr>
@@ -19322,45 +19403,67 @@
         </w:tc>
         <w:tc>
           <w:tcPr>
-            <w:tcW w:type="dxa" w:w="1701"/>
-          </w:tcPr>
-          <w:p>
-            <w:pPr>
-              <w:keepNext/>
-              <w:spacing w:line="240" w:lineRule="auto" w:before="0" w:after="0"/>
-              <w:ind w:firstLine="0"/>
-              <w:jc w:val="left"/>
-            </w:pPr>
-            <w:r>
-              <w:rPr>
-                <w:rFonts w:ascii="Times New Roman" w:hAnsi="Times New Roman" w:cs="Times New Roman" w:eastAsia="Times New Roman"/>
-                <w:b w:val="0"/>
-                <w:color w:val="000000"/>
-                <w:sz w:val="22"/>
-              </w:rPr>
-              <w:t>Availability</w:t>
-            </w:r>
-          </w:p>
-        </w:tc>
-        <w:tc>
-          <w:tcPr>
-            <w:tcW w:type="dxa" w:w="7483"/>
-          </w:tcPr>
-          <w:p>
-            <w:pPr>
-              <w:keepNext/>
-              <w:spacing w:line="240" w:lineRule="auto" w:before="0" w:after="0"/>
-              <w:ind w:firstLine="0"/>
-              <w:jc w:val="left"/>
-            </w:pPr>
-            <w:r>
-              <w:rPr>
-                <w:rFonts w:ascii="Times New Roman" w:hAnsi="Times New Roman" w:cs="Times New Roman" w:eastAsia="Times New Roman"/>
-                <w:b w:val="0"/>
-                <w:color w:val="000000"/>
-                <w:sz w:val="22"/>
-              </w:rPr>
-              <w:t>The API exposes a health endpoint that is checked every 5 minutes by an external monitor, which also keeps the free server awake</w:t>
+            <w:tcW w:type="dxa" w:w="2381"/>
+          </w:tcPr>
+          <w:p>
+            <w:pPr>
+              <w:keepNext/>
+              <w:spacing w:line="240" w:lineRule="auto" w:before="0" w:after="0"/>
+              <w:ind w:firstLine="0"/>
+              <w:jc w:val="left"/>
+            </w:pPr>
+            <w:r>
+              <w:rPr>
+                <w:rFonts w:ascii="Times New Roman" w:hAnsi="Times New Roman" w:cs="Times New Roman" w:eastAsia="Times New Roman"/>
+                <w:b w:val="0"/>
+                <w:color w:val="000000"/>
+                <w:sz w:val="22"/>
+              </w:rPr>
+              <w:t>The public version of the platform is available</w:t>
+            </w:r>
+          </w:p>
+        </w:tc>
+        <w:tc>
+          <w:tcPr>
+            <w:tcW w:type="dxa" w:w="2154"/>
+          </w:tcPr>
+          <w:p>
+            <w:pPr>
+              <w:keepNext/>
+              <w:spacing w:line="240" w:lineRule="auto" w:before="0" w:after="0"/>
+              <w:ind w:firstLine="0"/>
+              <w:jc w:val="left"/>
+            </w:pPr>
+            <w:r>
+              <w:rPr>
+                <w:rFonts w:ascii="Times New Roman" w:hAnsi="Times New Roman" w:cs="Times New Roman" w:eastAsia="Times New Roman"/>
+                <w:b w:val="0"/>
+                <w:color w:val="000000"/>
+                <w:sz w:val="22"/>
+              </w:rPr>
+              <w:t>Reliability (availability)</w:t>
+            </w:r>
+          </w:p>
+        </w:tc>
+        <w:tc>
+          <w:tcPr>
+            <w:tcW w:type="dxa" w:w="4592"/>
+          </w:tcPr>
+          <w:p>
+            <w:pPr>
+              <w:keepNext/>
+              <w:spacing w:line="240" w:lineRule="auto" w:before="0" w:after="0"/>
+              <w:ind w:firstLine="0"/>
+              <w:jc w:val="left"/>
+            </w:pPr>
+            <w:r>
+              <w:rPr>
+                <w:rFonts w:ascii="Times New Roman" w:hAnsi="Times New Roman" w:cs="Times New Roman" w:eastAsia="Times New Roman"/>
+                <w:b w:val="0"/>
+                <w:color w:val="000000"/>
+                <w:sz w:val="22"/>
+              </w:rPr>
+              <w:t>Monthly availability of at least 99%, measured by an external monitor that calls the health endpoint every 5 minutes</w:t>
             </w:r>
           </w:p>
         </w:tc>
@@ -19371,7 +19474,7 @@
         </w:trPr>
         <w:tc>
           <w:tcPr>
-            <w:tcW w:type="dxa" w:w="1020"/>
+            <w:tcW w:type="dxa" w:w="1077"/>
           </w:tcPr>
           <w:p>
             <w:pPr>
@@ -19393,45 +19496,67 @@
         </w:tc>
         <w:tc>
           <w:tcPr>
-            <w:tcW w:type="dxa" w:w="1701"/>
-          </w:tcPr>
-          <w:p>
-            <w:pPr>
-              <w:keepNext/>
-              <w:spacing w:line="240" w:lineRule="auto" w:before="0" w:after="0"/>
-              <w:ind w:firstLine="0"/>
-              <w:jc w:val="left"/>
-            </w:pPr>
-            <w:r>
-              <w:rPr>
-                <w:rFonts w:ascii="Times New Roman" w:hAnsi="Times New Roman" w:cs="Times New Roman" w:eastAsia="Times New Roman"/>
-                <w:b w:val="0"/>
-                <w:color w:val="000000"/>
-                <w:sz w:val="22"/>
-              </w:rPr>
-              <w:t>Reliability</w:t>
-            </w:r>
-          </w:p>
-        </w:tc>
-        <w:tc>
-          <w:tcPr>
-            <w:tcW w:type="dxa" w:w="7483"/>
-          </w:tcPr>
-          <w:p>
-            <w:pPr>
-              <w:keepNext/>
-              <w:spacing w:line="240" w:lineRule="auto" w:before="0" w:after="0"/>
-              <w:ind w:firstLine="0"/>
-              <w:jc w:val="left"/>
-            </w:pPr>
-            <w:r>
-              <w:rPr>
-                <w:rFonts w:ascii="Times New Roman" w:hAnsi="Times New Roman" w:cs="Times New Roman" w:eastAsia="Times New Roman"/>
-                <w:b w:val="0"/>
-                <w:color w:val="000000"/>
-                <w:sz w:val="22"/>
-              </w:rPr>
-              <w:t>The database schema is updated automatically and repeatably at every start of the server; a failed update stops the start</w:t>
+            <w:tcW w:type="dxa" w:w="2381"/>
+          </w:tcPr>
+          <w:p>
+            <w:pPr>
+              <w:keepNext/>
+              <w:spacing w:line="240" w:lineRule="auto" w:before="0" w:after="0"/>
+              <w:ind w:firstLine="0"/>
+              <w:jc w:val="left"/>
+            </w:pPr>
+            <w:r>
+              <w:rPr>
+                <w:rFonts w:ascii="Times New Roman" w:hAnsi="Times New Roman" w:cs="Times New Roman" w:eastAsia="Times New Roman"/>
+                <w:b w:val="0"/>
+                <w:color w:val="000000"/>
+                <w:sz w:val="22"/>
+              </w:rPr>
+              <w:t>The stock never becomes inconsistent</w:t>
+            </w:r>
+          </w:p>
+        </w:tc>
+        <w:tc>
+          <w:tcPr>
+            <w:tcW w:type="dxa" w:w="2154"/>
+          </w:tcPr>
+          <w:p>
+            <w:pPr>
+              <w:keepNext/>
+              <w:spacing w:line="240" w:lineRule="auto" w:before="0" w:after="0"/>
+              <w:ind w:firstLine="0"/>
+              <w:jc w:val="left"/>
+            </w:pPr>
+            <w:r>
+              <w:rPr>
+                <w:rFonts w:ascii="Times New Roman" w:hAnsi="Times New Roman" w:cs="Times New Roman" w:eastAsia="Times New Roman"/>
+                <w:b w:val="0"/>
+                <w:color w:val="000000"/>
+                <w:sz w:val="22"/>
+              </w:rPr>
+              <w:t>Reliability (faultlessness)</w:t>
+            </w:r>
+          </w:p>
+        </w:tc>
+        <w:tc>
+          <w:tcPr>
+            <w:tcW w:type="dxa" w:w="4592"/>
+          </w:tcPr>
+          <w:p>
+            <w:pPr>
+              <w:keepNext/>
+              <w:spacing w:line="240" w:lineRule="auto" w:before="0" w:after="0"/>
+              <w:ind w:firstLine="0"/>
+              <w:jc w:val="left"/>
+            </w:pPr>
+            <w:r>
+              <w:rPr>
+                <w:rFonts w:ascii="Times New Roman" w:hAnsi="Times New Roman" w:cs="Times New Roman" w:eastAsia="Times New Roman"/>
+                <w:b w:val="0"/>
+                <w:color w:val="000000"/>
+                <w:sz w:val="22"/>
+              </w:rPr>
+              <w:t>In 100% of the runs of the test with two simultaneous acceptances, exactly one succeeds and the stock decreases once; the stock can never be negative</w:t>
             </w:r>
           </w:p>
         </w:tc>
@@ -19442,7 +19567,7 @@
         </w:trPr>
         <w:tc>
           <w:tcPr>
-            <w:tcW w:type="dxa" w:w="1020"/>
+            <w:tcW w:type="dxa" w:w="1077"/>
           </w:tcPr>
           <w:p>
             <w:pPr>
@@ -19464,258 +19589,67 @@
         </w:tc>
         <w:tc>
           <w:tcPr>
-            <w:tcW w:type="dxa" w:w="1701"/>
-          </w:tcPr>
-          <w:p>
-            <w:pPr>
-              <w:keepNext/>
-              <w:spacing w:line="240" w:lineRule="auto" w:before="0" w:after="0"/>
-              <w:ind w:firstLine="0"/>
-              <w:jc w:val="left"/>
-            </w:pPr>
-            <w:r>
-              <w:rPr>
-                <w:rFonts w:ascii="Times New Roman" w:hAnsi="Times New Roman" w:cs="Times New Roman" w:eastAsia="Times New Roman"/>
-                <w:b w:val="0"/>
-                <w:color w:val="000000"/>
-                <w:sz w:val="22"/>
-              </w:rPr>
-              <w:t>Usability</w:t>
-            </w:r>
-          </w:p>
-        </w:tc>
-        <w:tc>
-          <w:tcPr>
-            <w:tcW w:type="dxa" w:w="7483"/>
-          </w:tcPr>
-          <w:p>
-            <w:pPr>
-              <w:keepNext/>
-              <w:spacing w:line="240" w:lineRule="auto" w:before="0" w:after="0"/>
-              <w:ind w:firstLine="0"/>
-              <w:jc w:val="left"/>
-            </w:pPr>
-            <w:r>
-              <w:rPr>
-                <w:rFonts w:ascii="Times New Roman" w:hAnsi="Times New Roman" w:cs="Times New Roman" w:eastAsia="Times New Roman"/>
-                <w:b w:val="0"/>
-                <w:color w:val="000000"/>
-                <w:sz w:val="22"/>
-              </w:rPr>
-              <w:t>The interface is in Romanian and adapts to screens from 360 pixels wide; irreversible actions require a confirmation</w:t>
-            </w:r>
-          </w:p>
-        </w:tc>
-      </w:tr>
-      <w:tr>
-        <w:trPr>
-          <w:cantSplit w:val="true"/>
-        </w:trPr>
-        <w:tc>
-          <w:tcPr>
-            <w:tcW w:type="dxa" w:w="1020"/>
-          </w:tcPr>
-          <w:p>
-            <w:pPr>
-              <w:keepNext/>
-              <w:spacing w:line="240" w:lineRule="auto" w:before="0" w:after="0"/>
-              <w:ind w:firstLine="0"/>
-              <w:jc w:val="left"/>
-            </w:pPr>
-            <w:r>
-              <w:rPr>
-                <w:rFonts w:ascii="Times New Roman" w:hAnsi="Times New Roman" w:cs="Times New Roman" w:eastAsia="Times New Roman"/>
-                <w:b w:val="0"/>
-                <w:color w:val="000000"/>
-                <w:sz w:val="22"/>
-              </w:rPr>
-              <w:t>NFR-06</w:t>
-            </w:r>
-          </w:p>
-        </w:tc>
-        <w:tc>
-          <w:tcPr>
-            <w:tcW w:type="dxa" w:w="1701"/>
-          </w:tcPr>
-          <w:p>
-            <w:pPr>
-              <w:keepNext/>
-              <w:spacing w:line="240" w:lineRule="auto" w:before="0" w:after="0"/>
-              <w:ind w:firstLine="0"/>
-              <w:jc w:val="left"/>
-            </w:pPr>
-            <w:r>
-              <w:rPr>
-                <w:rFonts w:ascii="Times New Roman" w:hAnsi="Times New Roman" w:cs="Times New Roman" w:eastAsia="Times New Roman"/>
-                <w:b w:val="0"/>
-                <w:color w:val="000000"/>
-                <w:sz w:val="22"/>
-              </w:rPr>
-              <w:t>Portability</w:t>
-            </w:r>
-          </w:p>
-        </w:tc>
-        <w:tc>
-          <w:tcPr>
-            <w:tcW w:type="dxa" w:w="7483"/>
-          </w:tcPr>
-          <w:p>
-            <w:pPr>
-              <w:keepNext/>
-              <w:spacing w:line="240" w:lineRule="auto" w:before="0" w:after="0"/>
-              <w:ind w:firstLine="0"/>
-              <w:jc w:val="left"/>
-            </w:pPr>
-            <w:r>
-              <w:rPr>
-                <w:rFonts w:ascii="Times New Roman" w:hAnsi="Times New Roman" w:cs="Times New Roman" w:eastAsia="Times New Roman"/>
-                <w:b w:val="0"/>
-                <w:color w:val="000000"/>
-                <w:sz w:val="22"/>
-              </w:rPr>
-              <w:t>The client works in the last two versions of Chrome, Firefox, Safari and Edge, with nothing to install</w:t>
-            </w:r>
-          </w:p>
-        </w:tc>
-      </w:tr>
-      <w:tr>
-        <w:trPr>
-          <w:cantSplit w:val="true"/>
-        </w:trPr>
-        <w:tc>
-          <w:tcPr>
-            <w:tcW w:type="dxa" w:w="1020"/>
-          </w:tcPr>
-          <w:p>
-            <w:pPr>
-              <w:keepNext/>
-              <w:spacing w:line="240" w:lineRule="auto" w:before="0" w:after="0"/>
-              <w:ind w:firstLine="0"/>
-              <w:jc w:val="left"/>
-            </w:pPr>
-            <w:r>
-              <w:rPr>
-                <w:rFonts w:ascii="Times New Roman" w:hAnsi="Times New Roman" w:cs="Times New Roman" w:eastAsia="Times New Roman"/>
-                <w:b w:val="0"/>
-                <w:color w:val="000000"/>
-                <w:sz w:val="22"/>
-              </w:rPr>
-              <w:t>NFR-07</w:t>
-            </w:r>
-          </w:p>
-        </w:tc>
-        <w:tc>
-          <w:tcPr>
-            <w:tcW w:type="dxa" w:w="1701"/>
-          </w:tcPr>
-          <w:p>
-            <w:pPr>
-              <w:keepNext/>
-              <w:spacing w:line="240" w:lineRule="auto" w:before="0" w:after="0"/>
-              <w:ind w:firstLine="0"/>
-              <w:jc w:val="left"/>
-            </w:pPr>
-            <w:r>
-              <w:rPr>
-                <w:rFonts w:ascii="Times New Roman" w:hAnsi="Times New Roman" w:cs="Times New Roman" w:eastAsia="Times New Roman"/>
-                <w:b w:val="0"/>
-                <w:color w:val="000000"/>
-                <w:sz w:val="22"/>
-              </w:rPr>
-              <w:t>Maintainability</w:t>
-            </w:r>
-          </w:p>
-        </w:tc>
-        <w:tc>
-          <w:tcPr>
-            <w:tcW w:type="dxa" w:w="7483"/>
-          </w:tcPr>
-          <w:p>
-            <w:pPr>
-              <w:keepNext/>
-              <w:spacing w:line="240" w:lineRule="auto" w:before="0" w:after="0"/>
-              <w:ind w:firstLine="0"/>
-              <w:jc w:val="left"/>
-            </w:pPr>
-            <w:r>
-              <w:rPr>
-                <w:rFonts w:ascii="Times New Roman" w:hAnsi="Times New Roman" w:cs="Times New Roman" w:eastAsia="Times New Roman"/>
-                <w:b w:val="0"/>
-                <w:color w:val="000000"/>
-                <w:sz w:val="22"/>
-              </w:rPr>
-              <w:t>Client and server are written in TypeScript; the automated API tests run on every change pushed to the repository</w:t>
-            </w:r>
-          </w:p>
-        </w:tc>
-      </w:tr>
-      <w:tr>
-        <w:trPr>
-          <w:cantSplit w:val="true"/>
-        </w:trPr>
-        <w:tc>
-          <w:tcPr>
-            <w:tcW w:type="dxa" w:w="1020"/>
-          </w:tcPr>
-          <w:p>
-            <w:pPr>
-              <w:keepNext/>
-              <w:spacing w:line="240" w:lineRule="auto" w:before="0" w:after="0"/>
-              <w:ind w:firstLine="0"/>
-              <w:jc w:val="left"/>
-            </w:pPr>
-            <w:r>
-              <w:rPr>
-                <w:rFonts w:ascii="Times New Roman" w:hAnsi="Times New Roman" w:cs="Times New Roman" w:eastAsia="Times New Roman"/>
-                <w:b w:val="0"/>
-                <w:color w:val="000000"/>
-                <w:sz w:val="22"/>
-              </w:rPr>
-              <w:t>NFR-08</w:t>
-            </w:r>
-          </w:p>
-        </w:tc>
-        <w:tc>
-          <w:tcPr>
-            <w:tcW w:type="dxa" w:w="1701"/>
-          </w:tcPr>
-          <w:p>
-            <w:pPr>
-              <w:keepNext/>
-              <w:spacing w:line="240" w:lineRule="auto" w:before="0" w:after="0"/>
-              <w:ind w:firstLine="0"/>
-              <w:jc w:val="left"/>
-            </w:pPr>
-            <w:r>
-              <w:rPr>
-                <w:rFonts w:ascii="Times New Roman" w:hAnsi="Times New Roman" w:cs="Times New Roman" w:eastAsia="Times New Roman"/>
-                <w:b w:val="0"/>
-                <w:color w:val="000000"/>
-                <w:sz w:val="22"/>
-              </w:rPr>
-              <w:t>Storage</w:t>
-            </w:r>
-          </w:p>
-        </w:tc>
-        <w:tc>
-          <w:tcPr>
-            <w:tcW w:type="dxa" w:w="7483"/>
-          </w:tcPr>
-          <w:p>
-            <w:pPr>
-              <w:keepNext/>
-              <w:spacing w:line="240" w:lineRule="auto" w:before="0" w:after="0"/>
-              <w:ind w:firstLine="0"/>
-              <w:jc w:val="left"/>
-            </w:pPr>
-            <w:r>
-              <w:rPr>
-                <w:rFonts w:ascii="Times New Roman" w:hAnsi="Times New Roman" w:cs="Times New Roman" w:eastAsia="Times New Roman"/>
-                <w:b w:val="0"/>
-                <w:color w:val="000000"/>
-                <w:sz w:val="22"/>
-              </w:rPr>
-              <w:t>Listing photos up to 10 MB are converted to WebP and stored in the database, so they survive restarts of the server</w:t>
+            <w:tcW w:type="dxa" w:w="2381"/>
+          </w:tcPr>
+          <w:p>
+            <w:pPr>
+              <w:keepNext/>
+              <w:spacing w:line="240" w:lineRule="auto" w:before="0" w:after="0"/>
+              <w:ind w:firstLine="0"/>
+              <w:jc w:val="left"/>
+            </w:pPr>
+            <w:r>
+              <w:rPr>
+                <w:rFonts w:ascii="Times New Roman" w:hAnsi="Times New Roman" w:cs="Times New Roman" w:eastAsia="Times New Roman"/>
+                <w:b w:val="0"/>
+                <w:color w:val="000000"/>
+                <w:sz w:val="22"/>
+              </w:rPr>
+              <w:t>An outage of the AI service does not block the publication of listings</w:t>
+            </w:r>
+          </w:p>
+        </w:tc>
+        <w:tc>
+          <w:tcPr>
+            <w:tcW w:type="dxa" w:w="2154"/>
+          </w:tcPr>
+          <w:p>
+            <w:pPr>
+              <w:keepNext/>
+              <w:spacing w:line="240" w:lineRule="auto" w:before="0" w:after="0"/>
+              <w:ind w:firstLine="0"/>
+              <w:jc w:val="left"/>
+            </w:pPr>
+            <w:r>
+              <w:rPr>
+                <w:rFonts w:ascii="Times New Roman" w:hAnsi="Times New Roman" w:cs="Times New Roman" w:eastAsia="Times New Roman"/>
+                <w:b w:val="0"/>
+                <w:color w:val="000000"/>
+                <w:sz w:val="22"/>
+              </w:rPr>
+              <w:t>Reliability (fault tolerance, recoverability)</w:t>
+            </w:r>
+          </w:p>
+        </w:tc>
+        <w:tc>
+          <w:tcPr>
+            <w:tcW w:type="dxa" w:w="4592"/>
+          </w:tcPr>
+          <w:p>
+            <w:pPr>
+              <w:keepNext/>
+              <w:spacing w:line="240" w:lineRule="auto" w:before="0" w:after="0"/>
+              <w:ind w:firstLine="0"/>
+              <w:jc w:val="left"/>
+            </w:pPr>
+            <w:r>
+              <w:rPr>
+                <w:rFonts w:ascii="Times New Roman" w:hAnsi="Times New Roman" w:cs="Times New Roman" w:eastAsia="Times New Roman"/>
+                <w:b w:val="0"/>
+                <w:color w:val="000000"/>
+                <w:sz w:val="22"/>
+              </w:rPr>
+              <w:t>If the AI service does not answer within 45 seconds, the listing goes to manual moderation and is rechecked automatically every 15 minutes, up to 12 times; no listing is lost</w:t>
             </w:r>
           </w:p>
         </w:tc>
@@ -19737,7 +19671,7 @@
           <w:color w:val="000000"/>
           <w:sz w:val="24"/>
         </w:rPr>
-        <w:t>Several of these values are imposed by the free hosting plan. Requirement NFR-03, for example, exists because a free server is put to sleep after a period of inactivity, and the first request after that would otherwise take too long.</w:t>
+        <w:t>The values in Table 1.19 were chosen for the expected scale of the first year: a few hundred producers and buyers, most of them active in the harvest season. Requirement NFR-03 also takes into account that the server runs on a free hosting plan, which is put to sleep when nobody uses it; the external monitor keeps it awake.</w:t>
       </w:r>
     </w:p>
     <w:p>
@@ -19751,7 +19685,7 @@
           <w:color w:val="000000"/>
           <w:sz w:val="24"/>
         </w:rPr>
-        <w:t>The second group, in Table 1.20, deals with security and the protection of personal data. It is based on the most common risks of web applications described by OWASP [21] and on the national legislation.</w:t>
+        <w:t>Table 1.20 covers security, interaction capability, flexibility and maintainability. The security requirements follow the most common risks of web applications described by OWASP [22] and the national legislation on personal data [19].</w:t>
       </w:r>
     </w:p>
     <w:p>
@@ -19767,7 +19701,7 @@
           <w:color w:val="000000"/>
           <w:sz w:val="24"/>
         </w:rPr>
-        <w:t>Table 1.20 – Non-functional requirements: security and data protection</w:t>
+        <w:t>Table 1.20 – Non-functional requirements: security, interaction capability, flexibility and maintainability</w:t>
       </w:r>
     </w:p>
     <w:tbl>
@@ -19779,9 +19713,10 @@
         <w:tblLook w:firstColumn="1" w:firstRow="1" w:lastColumn="0" w:lastRow="0" w:noHBand="0" w:noVBand="1" w:val="04A0"/>
       </w:tblPr>
       <w:tblGrid>
-        <w:gridCol w:w="1020"/>
-        <w:gridCol w:w="1701"/>
-        <w:gridCol w:w="7484"/>
+        <w:gridCol w:w="1077"/>
+        <w:gridCol w:w="2381"/>
+        <w:gridCol w:w="2154"/>
+        <w:gridCol w:w="4592"/>
       </w:tblGrid>
       <w:tr>
         <w:trPr>
@@ -19789,7 +19724,7 @@
         </w:trPr>
         <w:tc>
           <w:tcPr>
-            <w:tcW w:type="dxa" w:w="1020"/>
+            <w:tcW w:type="dxa" w:w="1077"/>
             <w:shd w:val="clear" w:color="auto" w:fill="D9D9D9"/>
           </w:tcPr>
           <w:p>
@@ -19812,7 +19747,7 @@
         </w:tc>
         <w:tc>
           <w:tcPr>
-            <w:tcW w:type="dxa" w:w="1701"/>
+            <w:tcW w:type="dxa" w:w="2381"/>
             <w:shd w:val="clear" w:color="auto" w:fill="D9D9D9"/>
           </w:tcPr>
           <w:p>
@@ -19829,13 +19764,13 @@
                 <w:color w:val="000000"/>
                 <w:sz w:val="22"/>
               </w:rPr>
-              <w:t>Category</w:t>
-            </w:r>
-          </w:p>
-        </w:tc>
-        <w:tc>
-          <w:tcPr>
-            <w:tcW w:type="dxa" w:w="7483"/>
+              <w:t>Requirement</w:t>
+            </w:r>
+          </w:p>
+        </w:tc>
+        <w:tc>
+          <w:tcPr>
+            <w:tcW w:type="dxa" w:w="2154"/>
             <w:shd w:val="clear" w:color="auto" w:fill="D9D9D9"/>
           </w:tcPr>
           <w:p>
@@ -19852,7 +19787,30 @@
                 <w:color w:val="000000"/>
                 <w:sz w:val="22"/>
               </w:rPr>
-              <w:t>Requirement</w:t>
+              <w:t>ISO/IEC 25010 characteristic (subcharacteristic)</w:t>
+            </w:r>
+          </w:p>
+        </w:tc>
+        <w:tc>
+          <w:tcPr>
+            <w:tcW w:type="dxa" w:w="4592"/>
+            <w:shd w:val="clear" w:color="auto" w:fill="D9D9D9"/>
+          </w:tcPr>
+          <w:p>
+            <w:pPr>
+              <w:keepNext/>
+              <w:spacing w:line="240" w:lineRule="auto" w:before="0" w:after="0"/>
+              <w:ind w:firstLine="0"/>
+              <w:jc w:val="center"/>
+            </w:pPr>
+            <w:r>
+              <w:rPr>
+                <w:rFonts w:ascii="Times New Roman" w:hAnsi="Times New Roman" w:cs="Times New Roman" w:eastAsia="Times New Roman"/>
+                <w:b/>
+                <w:color w:val="000000"/>
+                <w:sz w:val="22"/>
+              </w:rPr>
+              <w:t>Measurable acceptance criterion</w:t>
             </w:r>
           </w:p>
         </w:tc>
@@ -19863,67 +19821,89 @@
         </w:trPr>
         <w:tc>
           <w:tcPr>
-            <w:tcW w:type="dxa" w:w="1020"/>
-          </w:tcPr>
-          <w:p>
-            <w:pPr>
-              <w:keepNext/>
-              <w:spacing w:line="240" w:lineRule="auto" w:before="0" w:after="0"/>
-              <w:ind w:firstLine="0"/>
-              <w:jc w:val="left"/>
-            </w:pPr>
-            <w:r>
-              <w:rPr>
-                <w:rFonts w:ascii="Times New Roman" w:hAnsi="Times New Roman" w:cs="Times New Roman" w:eastAsia="Times New Roman"/>
-                <w:b w:val="0"/>
-                <w:color w:val="000000"/>
-                <w:sz w:val="22"/>
-              </w:rPr>
-              <w:t>NFR-09</w:t>
-            </w:r>
-          </w:p>
-        </w:tc>
-        <w:tc>
-          <w:tcPr>
-            <w:tcW w:type="dxa" w:w="1701"/>
-          </w:tcPr>
-          <w:p>
-            <w:pPr>
-              <w:keepNext/>
-              <w:spacing w:line="240" w:lineRule="auto" w:before="0" w:after="0"/>
-              <w:ind w:firstLine="0"/>
-              <w:jc w:val="left"/>
-            </w:pPr>
-            <w:r>
-              <w:rPr>
-                <w:rFonts w:ascii="Times New Roman" w:hAnsi="Times New Roman" w:cs="Times New Roman" w:eastAsia="Times New Roman"/>
-                <w:b w:val="0"/>
-                <w:color w:val="000000"/>
-                <w:sz w:val="22"/>
-              </w:rPr>
-              <w:t>Authentication</w:t>
-            </w:r>
-          </w:p>
-        </w:tc>
-        <w:tc>
-          <w:tcPr>
-            <w:tcW w:type="dxa" w:w="7483"/>
-          </w:tcPr>
-          <w:p>
-            <w:pPr>
-              <w:keepNext/>
-              <w:spacing w:line="240" w:lineRule="auto" w:before="0" w:after="0"/>
-              <w:ind w:firstLine="0"/>
-              <w:jc w:val="left"/>
-            </w:pPr>
-            <w:r>
-              <w:rPr>
-                <w:rFonts w:ascii="Times New Roman" w:hAnsi="Times New Roman" w:cs="Times New Roman" w:eastAsia="Times New Roman"/>
-                <w:b w:val="0"/>
-                <w:color w:val="000000"/>
-                <w:sz w:val="22"/>
-              </w:rPr>
-              <w:t>Passwords have at least 8 characters and are stored only as bcrypt hashes; a session token is valid for 7 days</w:t>
+            <w:tcW w:type="dxa" w:w="1077"/>
+          </w:tcPr>
+          <w:p>
+            <w:pPr>
+              <w:keepNext/>
+              <w:spacing w:line="240" w:lineRule="auto" w:before="0" w:after="0"/>
+              <w:ind w:firstLine="0"/>
+              <w:jc w:val="left"/>
+            </w:pPr>
+            <w:r>
+              <w:rPr>
+                <w:rFonts w:ascii="Times New Roman" w:hAnsi="Times New Roman" w:cs="Times New Roman" w:eastAsia="Times New Roman"/>
+                <w:b w:val="0"/>
+                <w:color w:val="000000"/>
+                <w:sz w:val="22"/>
+              </w:rPr>
+              <w:t>NFR-06</w:t>
+            </w:r>
+          </w:p>
+        </w:tc>
+        <w:tc>
+          <w:tcPr>
+            <w:tcW w:type="dxa" w:w="2381"/>
+          </w:tcPr>
+          <w:p>
+            <w:pPr>
+              <w:keepNext/>
+              <w:spacing w:line="240" w:lineRule="auto" w:before="0" w:after="0"/>
+              <w:ind w:firstLine="0"/>
+              <w:jc w:val="left"/>
+            </w:pPr>
+            <w:r>
+              <w:rPr>
+                <w:rFonts w:ascii="Times New Roman" w:hAnsi="Times New Roman" w:cs="Times New Roman" w:eastAsia="Times New Roman"/>
+                <w:b w:val="0"/>
+                <w:color w:val="000000"/>
+                <w:sz w:val="22"/>
+              </w:rPr>
+              <w:t>Passwords and codes cannot be read or guessed</w:t>
+            </w:r>
+          </w:p>
+        </w:tc>
+        <w:tc>
+          <w:tcPr>
+            <w:tcW w:type="dxa" w:w="2154"/>
+          </w:tcPr>
+          <w:p>
+            <w:pPr>
+              <w:keepNext/>
+              <w:spacing w:line="240" w:lineRule="auto" w:before="0" w:after="0"/>
+              <w:ind w:firstLine="0"/>
+              <w:jc w:val="left"/>
+            </w:pPr>
+            <w:r>
+              <w:rPr>
+                <w:rFonts w:ascii="Times New Roman" w:hAnsi="Times New Roman" w:cs="Times New Roman" w:eastAsia="Times New Roman"/>
+                <w:b w:val="0"/>
+                <w:color w:val="000000"/>
+                <w:sz w:val="22"/>
+              </w:rPr>
+              <w:t>Security (authenticity, confidentiality)</w:t>
+            </w:r>
+          </w:p>
+        </w:tc>
+        <w:tc>
+          <w:tcPr>
+            <w:tcW w:type="dxa" w:w="4592"/>
+          </w:tcPr>
+          <w:p>
+            <w:pPr>
+              <w:keepNext/>
+              <w:spacing w:line="240" w:lineRule="auto" w:before="0" w:after="0"/>
+              <w:ind w:firstLine="0"/>
+              <w:jc w:val="left"/>
+            </w:pPr>
+            <w:r>
+              <w:rPr>
+                <w:rFonts w:ascii="Times New Roman" w:hAnsi="Times New Roman" w:cs="Times New Roman" w:eastAsia="Times New Roman"/>
+                <w:b w:val="0"/>
+                <w:color w:val="000000"/>
+                <w:sz w:val="22"/>
+              </w:rPr>
+              <w:t>The database contains 0 passwords or codes in clear text (bcrypt and SHA-256 only); codes expire after 15 minutes, the 6th wrong attempt is refused; all traffic uses HTTPS</w:t>
             </w:r>
           </w:p>
         </w:tc>
@@ -19934,67 +19914,89 @@
         </w:trPr>
         <w:tc>
           <w:tcPr>
-            <w:tcW w:type="dxa" w:w="1020"/>
-          </w:tcPr>
-          <w:p>
-            <w:pPr>
-              <w:keepNext/>
-              <w:spacing w:line="240" w:lineRule="auto" w:before="0" w:after="0"/>
-              <w:ind w:firstLine="0"/>
-              <w:jc w:val="left"/>
-            </w:pPr>
-            <w:r>
-              <w:rPr>
-                <w:rFonts w:ascii="Times New Roman" w:hAnsi="Times New Roman" w:cs="Times New Roman" w:eastAsia="Times New Roman"/>
-                <w:b w:val="0"/>
-                <w:color w:val="000000"/>
-                <w:sz w:val="22"/>
-              </w:rPr>
-              <w:t>NFR-10</w:t>
-            </w:r>
-          </w:p>
-        </w:tc>
-        <w:tc>
-          <w:tcPr>
-            <w:tcW w:type="dxa" w:w="1701"/>
-          </w:tcPr>
-          <w:p>
-            <w:pPr>
-              <w:keepNext/>
-              <w:spacing w:line="240" w:lineRule="auto" w:before="0" w:after="0"/>
-              <w:ind w:firstLine="0"/>
-              <w:jc w:val="left"/>
-            </w:pPr>
-            <w:r>
-              <w:rPr>
-                <w:rFonts w:ascii="Times New Roman" w:hAnsi="Times New Roman" w:cs="Times New Roman" w:eastAsia="Times New Roman"/>
-                <w:b w:val="0"/>
-                <w:color w:val="000000"/>
-                <w:sz w:val="22"/>
-              </w:rPr>
-              <w:t>Verification codes</w:t>
-            </w:r>
-          </w:p>
-        </w:tc>
-        <w:tc>
-          <w:tcPr>
-            <w:tcW w:type="dxa" w:w="7483"/>
-          </w:tcPr>
-          <w:p>
-            <w:pPr>
-              <w:keepNext/>
-              <w:spacing w:line="240" w:lineRule="auto" w:before="0" w:after="0"/>
-              <w:ind w:firstLine="0"/>
-              <w:jc w:val="left"/>
-            </w:pPr>
-            <w:r>
-              <w:rPr>
-                <w:rFonts w:ascii="Times New Roman" w:hAnsi="Times New Roman" w:cs="Times New Roman" w:eastAsia="Times New Roman"/>
-                <w:b w:val="0"/>
-                <w:color w:val="000000"/>
-                <w:sz w:val="22"/>
-              </w:rPr>
-              <w:t>E-mail and password reset codes are stored as SHA-256 hashes, expire after 15 minutes and allow at most 5 attempts</w:t>
+            <w:tcW w:type="dxa" w:w="1077"/>
+          </w:tcPr>
+          <w:p>
+            <w:pPr>
+              <w:keepNext/>
+              <w:spacing w:line="240" w:lineRule="auto" w:before="0" w:after="0"/>
+              <w:ind w:firstLine="0"/>
+              <w:jc w:val="left"/>
+            </w:pPr>
+            <w:r>
+              <w:rPr>
+                <w:rFonts w:ascii="Times New Roman" w:hAnsi="Times New Roman" w:cs="Times New Roman" w:eastAsia="Times New Roman"/>
+                <w:b w:val="0"/>
+                <w:color w:val="000000"/>
+                <w:sz w:val="22"/>
+              </w:rPr>
+              <w:t>NFR-07</w:t>
+            </w:r>
+          </w:p>
+        </w:tc>
+        <w:tc>
+          <w:tcPr>
+            <w:tcW w:type="dxa" w:w="2381"/>
+          </w:tcPr>
+          <w:p>
+            <w:pPr>
+              <w:keepNext/>
+              <w:spacing w:line="240" w:lineRule="auto" w:before="0" w:after="0"/>
+              <w:ind w:firstLine="0"/>
+              <w:jc w:val="left"/>
+            </w:pPr>
+            <w:r>
+              <w:rPr>
+                <w:rFonts w:ascii="Times New Roman" w:hAnsi="Times New Roman" w:cs="Times New Roman" w:eastAsia="Times New Roman"/>
+                <w:b w:val="0"/>
+                <w:color w:val="000000"/>
+                <w:sz w:val="22"/>
+              </w:rPr>
+              <w:t>The system resists repeated attempts and abuse</w:t>
+            </w:r>
+          </w:p>
+        </w:tc>
+        <w:tc>
+          <w:tcPr>
+            <w:tcW w:type="dxa" w:w="2154"/>
+          </w:tcPr>
+          <w:p>
+            <w:pPr>
+              <w:keepNext/>
+              <w:spacing w:line="240" w:lineRule="auto" w:before="0" w:after="0"/>
+              <w:ind w:firstLine="0"/>
+              <w:jc w:val="left"/>
+            </w:pPr>
+            <w:r>
+              <w:rPr>
+                <w:rFonts w:ascii="Times New Roman" w:hAnsi="Times New Roman" w:cs="Times New Roman" w:eastAsia="Times New Roman"/>
+                <w:b w:val="0"/>
+                <w:color w:val="000000"/>
+                <w:sz w:val="22"/>
+              </w:rPr>
+              <w:t>Security (resistance)</w:t>
+            </w:r>
+          </w:p>
+        </w:tc>
+        <w:tc>
+          <w:tcPr>
+            <w:tcW w:type="dxa" w:w="4592"/>
+          </w:tcPr>
+          <w:p>
+            <w:pPr>
+              <w:keepNext/>
+              <w:spacing w:line="240" w:lineRule="auto" w:before="0" w:after="0"/>
+              <w:ind w:firstLine="0"/>
+              <w:jc w:val="left"/>
+            </w:pPr>
+            <w:r>
+              <w:rPr>
+                <w:rFonts w:ascii="Times New Roman" w:hAnsi="Times New Roman" w:cs="Times New Roman" w:eastAsia="Times New Roman"/>
+                <w:b w:val="0"/>
+                <w:color w:val="000000"/>
+                <w:sz w:val="22"/>
+              </w:rPr>
+              <w:t>The 21st sign-in attempt and the 6th e-mail request from the same address within 15 minutes receive HTTP 429</w:t>
             </w:r>
           </w:p>
         </w:tc>
@@ -20005,67 +20007,89 @@
         </w:trPr>
         <w:tc>
           <w:tcPr>
-            <w:tcW w:type="dxa" w:w="1020"/>
-          </w:tcPr>
-          <w:p>
-            <w:pPr>
-              <w:keepNext/>
-              <w:spacing w:line="240" w:lineRule="auto" w:before="0" w:after="0"/>
-              <w:ind w:firstLine="0"/>
-              <w:jc w:val="left"/>
-            </w:pPr>
-            <w:r>
-              <w:rPr>
-                <w:rFonts w:ascii="Times New Roman" w:hAnsi="Times New Roman" w:cs="Times New Roman" w:eastAsia="Times New Roman"/>
-                <w:b w:val="0"/>
-                <w:color w:val="000000"/>
-                <w:sz w:val="22"/>
-              </w:rPr>
-              <w:t>NFR-11</w:t>
-            </w:r>
-          </w:p>
-        </w:tc>
-        <w:tc>
-          <w:tcPr>
-            <w:tcW w:type="dxa" w:w="1701"/>
-          </w:tcPr>
-          <w:p>
-            <w:pPr>
-              <w:keepNext/>
-              <w:spacing w:line="240" w:lineRule="auto" w:before="0" w:after="0"/>
-              <w:ind w:firstLine="0"/>
-              <w:jc w:val="left"/>
-            </w:pPr>
-            <w:r>
-              <w:rPr>
-                <w:rFonts w:ascii="Times New Roman" w:hAnsi="Times New Roman" w:cs="Times New Roman" w:eastAsia="Times New Roman"/>
-                <w:b w:val="0"/>
-                <w:color w:val="000000"/>
-                <w:sz w:val="22"/>
-              </w:rPr>
-              <w:t>Abuse protection</w:t>
-            </w:r>
-          </w:p>
-        </w:tc>
-        <w:tc>
-          <w:tcPr>
-            <w:tcW w:type="dxa" w:w="7483"/>
-          </w:tcPr>
-          <w:p>
-            <w:pPr>
-              <w:keepNext/>
-              <w:spacing w:line="240" w:lineRule="auto" w:before="0" w:after="0"/>
-              <w:ind w:firstLine="0"/>
-              <w:jc w:val="left"/>
-            </w:pPr>
-            <w:r>
-              <w:rPr>
-                <w:rFonts w:ascii="Times New Roman" w:hAnsi="Times New Roman" w:cs="Times New Roman" w:eastAsia="Times New Roman"/>
-                <w:b w:val="0"/>
-                <w:color w:val="000000"/>
-                <w:sz w:val="22"/>
-              </w:rPr>
-              <w:t>At most 20 sign-in attempts and 5 e-mail sending requests are accepted from one address in 15 minutes</w:t>
+            <w:tcW w:type="dxa" w:w="1077"/>
+          </w:tcPr>
+          <w:p>
+            <w:pPr>
+              <w:keepNext/>
+              <w:spacing w:line="240" w:lineRule="auto" w:before="0" w:after="0"/>
+              <w:ind w:firstLine="0"/>
+              <w:jc w:val="left"/>
+            </w:pPr>
+            <w:r>
+              <w:rPr>
+                <w:rFonts w:ascii="Times New Roman" w:hAnsi="Times New Roman" w:cs="Times New Roman" w:eastAsia="Times New Roman"/>
+                <w:b w:val="0"/>
+                <w:color w:val="000000"/>
+                <w:sz w:val="22"/>
+              </w:rPr>
+              <w:t>NFR-08</w:t>
+            </w:r>
+          </w:p>
+        </w:tc>
+        <w:tc>
+          <w:tcPr>
+            <w:tcW w:type="dxa" w:w="2381"/>
+          </w:tcPr>
+          <w:p>
+            <w:pPr>
+              <w:keepNext/>
+              <w:spacing w:line="240" w:lineRule="auto" w:before="0" w:after="0"/>
+              <w:ind w:firstLine="0"/>
+              <w:jc w:val="left"/>
+            </w:pPr>
+            <w:r>
+              <w:rPr>
+                <w:rFonts w:ascii="Times New Roman" w:hAnsi="Times New Roman" w:cs="Times New Roman" w:eastAsia="Times New Roman"/>
+                <w:b w:val="0"/>
+                <w:color w:val="000000"/>
+                <w:sz w:val="22"/>
+              </w:rPr>
+              <w:t>Each user reaches only the data and actions of their role</w:t>
+            </w:r>
+          </w:p>
+        </w:tc>
+        <w:tc>
+          <w:tcPr>
+            <w:tcW w:type="dxa" w:w="2154"/>
+          </w:tcPr>
+          <w:p>
+            <w:pPr>
+              <w:keepNext/>
+              <w:spacing w:line="240" w:lineRule="auto" w:before="0" w:after="0"/>
+              <w:ind w:firstLine="0"/>
+              <w:jc w:val="left"/>
+            </w:pPr>
+            <w:r>
+              <w:rPr>
+                <w:rFonts w:ascii="Times New Roman" w:hAnsi="Times New Roman" w:cs="Times New Roman" w:eastAsia="Times New Roman"/>
+                <w:b w:val="0"/>
+                <w:color w:val="000000"/>
+                <w:sz w:val="22"/>
+              </w:rPr>
+              <w:t>Security (confidentiality, integrity)</w:t>
+            </w:r>
+          </w:p>
+        </w:tc>
+        <w:tc>
+          <w:tcPr>
+            <w:tcW w:type="dxa" w:w="4592"/>
+          </w:tcPr>
+          <w:p>
+            <w:pPr>
+              <w:keepNext/>
+              <w:spacing w:line="240" w:lineRule="auto" w:before="0" w:after="0"/>
+              <w:ind w:firstLine="0"/>
+              <w:jc w:val="left"/>
+            </w:pPr>
+            <w:r>
+              <w:rPr>
+                <w:rFonts w:ascii="Times New Roman" w:hAnsi="Times New Roman" w:cs="Times New Roman" w:eastAsia="Times New Roman"/>
+                <w:b w:val="0"/>
+                <w:color w:val="000000"/>
+                <w:sz w:val="22"/>
+              </w:rPr>
+              <w:t>100% of the protected requests return 401 without a token and 403 for a wrong role or a blocked account; only name, e-mail, phone and region are stored as personal data</w:t>
             </w:r>
           </w:p>
         </w:tc>
@@ -20076,67 +20100,89 @@
         </w:trPr>
         <w:tc>
           <w:tcPr>
-            <w:tcW w:type="dxa" w:w="1020"/>
-          </w:tcPr>
-          <w:p>
-            <w:pPr>
-              <w:keepNext/>
-              <w:spacing w:line="240" w:lineRule="auto" w:before="0" w:after="0"/>
-              <w:ind w:firstLine="0"/>
-              <w:jc w:val="left"/>
-            </w:pPr>
-            <w:r>
-              <w:rPr>
-                <w:rFonts w:ascii="Times New Roman" w:hAnsi="Times New Roman" w:cs="Times New Roman" w:eastAsia="Times New Roman"/>
-                <w:b w:val="0"/>
-                <w:color w:val="000000"/>
-                <w:sz w:val="22"/>
-              </w:rPr>
-              <w:t>NFR-12</w:t>
-            </w:r>
-          </w:p>
-        </w:tc>
-        <w:tc>
-          <w:tcPr>
-            <w:tcW w:type="dxa" w:w="1701"/>
-          </w:tcPr>
-          <w:p>
-            <w:pPr>
-              <w:keepNext/>
-              <w:spacing w:line="240" w:lineRule="auto" w:before="0" w:after="0"/>
-              <w:ind w:firstLine="0"/>
-              <w:jc w:val="left"/>
-            </w:pPr>
-            <w:r>
-              <w:rPr>
-                <w:rFonts w:ascii="Times New Roman" w:hAnsi="Times New Roman" w:cs="Times New Roman" w:eastAsia="Times New Roman"/>
-                <w:b w:val="0"/>
-                <w:color w:val="000000"/>
-                <w:sz w:val="22"/>
-              </w:rPr>
-              <w:t>Access control</w:t>
-            </w:r>
-          </w:p>
-        </w:tc>
-        <w:tc>
-          <w:tcPr>
-            <w:tcW w:type="dxa" w:w="7483"/>
-          </w:tcPr>
-          <w:p>
-            <w:pPr>
-              <w:keepNext/>
-              <w:spacing w:line="240" w:lineRule="auto" w:before="0" w:after="0"/>
-              <w:ind w:firstLine="0"/>
-              <w:jc w:val="left"/>
-            </w:pPr>
-            <w:r>
-              <w:rPr>
-                <w:rFonts w:ascii="Times New Roman" w:hAnsi="Times New Roman" w:cs="Times New Roman" w:eastAsia="Times New Roman"/>
-                <w:b w:val="0"/>
-                <w:color w:val="000000"/>
-                <w:sz w:val="22"/>
-              </w:rPr>
-              <w:t>Every protected request is checked on the server against the role and status of the user; a blocked account loses access immediately</w:t>
+            <w:tcW w:type="dxa" w:w="1077"/>
+          </w:tcPr>
+          <w:p>
+            <w:pPr>
+              <w:keepNext/>
+              <w:spacing w:line="240" w:lineRule="auto" w:before="0" w:after="0"/>
+              <w:ind w:firstLine="0"/>
+              <w:jc w:val="left"/>
+            </w:pPr>
+            <w:r>
+              <w:rPr>
+                <w:rFonts w:ascii="Times New Roman" w:hAnsi="Times New Roman" w:cs="Times New Roman" w:eastAsia="Times New Roman"/>
+                <w:b w:val="0"/>
+                <w:color w:val="000000"/>
+                <w:sz w:val="22"/>
+              </w:rPr>
+              <w:t>NFR-09</w:t>
+            </w:r>
+          </w:p>
+        </w:tc>
+        <w:tc>
+          <w:tcPr>
+            <w:tcW w:type="dxa" w:w="2381"/>
+          </w:tcPr>
+          <w:p>
+            <w:pPr>
+              <w:keepNext/>
+              <w:spacing w:line="240" w:lineRule="auto" w:before="0" w:after="0"/>
+              <w:ind w:firstLine="0"/>
+              <w:jc w:val="left"/>
+            </w:pPr>
+            <w:r>
+              <w:rPr>
+                <w:rFonts w:ascii="Times New Roman" w:hAnsi="Times New Roman" w:cs="Times New Roman" w:eastAsia="Times New Roman"/>
+                <w:b w:val="0"/>
+                <w:color w:val="000000"/>
+                <w:sz w:val="22"/>
+              </w:rPr>
+              <w:t>Frequent operations are fast to perform</w:t>
+            </w:r>
+          </w:p>
+        </w:tc>
+        <w:tc>
+          <w:tcPr>
+            <w:tcW w:type="dxa" w:w="2154"/>
+          </w:tcPr>
+          <w:p>
+            <w:pPr>
+              <w:keepNext/>
+              <w:spacing w:line="240" w:lineRule="auto" w:before="0" w:after="0"/>
+              <w:ind w:firstLine="0"/>
+              <w:jc w:val="left"/>
+            </w:pPr>
+            <w:r>
+              <w:rPr>
+                <w:rFonts w:ascii="Times New Roman" w:hAnsi="Times New Roman" w:cs="Times New Roman" w:eastAsia="Times New Roman"/>
+                <w:b w:val="0"/>
+                <w:color w:val="000000"/>
+                <w:sz w:val="22"/>
+              </w:rPr>
+              <w:t>Interaction capability (operability, learnability)</w:t>
+            </w:r>
+          </w:p>
+        </w:tc>
+        <w:tc>
+          <w:tcPr>
+            <w:tcW w:type="dxa" w:w="4592"/>
+          </w:tcPr>
+          <w:p>
+            <w:pPr>
+              <w:keepNext/>
+              <w:spacing w:line="240" w:lineRule="auto" w:before="0" w:after="0"/>
+              <w:ind w:firstLine="0"/>
+              <w:jc w:val="left"/>
+            </w:pPr>
+            <w:r>
+              <w:rPr>
+                <w:rFonts w:ascii="Times New Roman" w:hAnsi="Times New Roman" w:cs="Times New Roman" w:eastAsia="Times New Roman"/>
+                <w:b w:val="0"/>
+                <w:color w:val="000000"/>
+                <w:sz w:val="22"/>
+              </w:rPr>
+              <w:t>In a test with 3 new users, each publishes a first listing in at most 3 minutes and places an order in at most 5 actions from the catalogue, without help</w:t>
             </w:r>
           </w:p>
         </w:tc>
@@ -20147,67 +20193,89 @@
         </w:trPr>
         <w:tc>
           <w:tcPr>
-            <w:tcW w:type="dxa" w:w="1020"/>
-          </w:tcPr>
-          <w:p>
-            <w:pPr>
-              <w:keepNext/>
-              <w:spacing w:line="240" w:lineRule="auto" w:before="0" w:after="0"/>
-              <w:ind w:firstLine="0"/>
-              <w:jc w:val="left"/>
-            </w:pPr>
-            <w:r>
-              <w:rPr>
-                <w:rFonts w:ascii="Times New Roman" w:hAnsi="Times New Roman" w:cs="Times New Roman" w:eastAsia="Times New Roman"/>
-                <w:b w:val="0"/>
-                <w:color w:val="000000"/>
-                <w:sz w:val="22"/>
-              </w:rPr>
-              <w:t>NFR-13</w:t>
-            </w:r>
-          </w:p>
-        </w:tc>
-        <w:tc>
-          <w:tcPr>
-            <w:tcW w:type="dxa" w:w="1701"/>
-          </w:tcPr>
-          <w:p>
-            <w:pPr>
-              <w:keepNext/>
-              <w:spacing w:line="240" w:lineRule="auto" w:before="0" w:after="0"/>
-              <w:ind w:firstLine="0"/>
-              <w:jc w:val="left"/>
-            </w:pPr>
-            <w:r>
-              <w:rPr>
-                <w:rFonts w:ascii="Times New Roman" w:hAnsi="Times New Roman" w:cs="Times New Roman" w:eastAsia="Times New Roman"/>
-                <w:b w:val="0"/>
-                <w:color w:val="000000"/>
-                <w:sz w:val="22"/>
-              </w:rPr>
-              <w:t>Input validation</w:t>
-            </w:r>
-          </w:p>
-        </w:tc>
-        <w:tc>
-          <w:tcPr>
-            <w:tcW w:type="dxa" w:w="7483"/>
-          </w:tcPr>
-          <w:p>
-            <w:pPr>
-              <w:keepNext/>
-              <w:spacing w:line="240" w:lineRule="auto" w:before="0" w:after="0"/>
-              <w:ind w:firstLine="0"/>
-              <w:jc w:val="left"/>
-            </w:pPr>
-            <w:r>
-              <w:rPr>
-                <w:rFonts w:ascii="Times New Roman" w:hAnsi="Times New Roman" w:cs="Times New Roman" w:eastAsia="Times New Roman"/>
-                <w:b w:val="0"/>
-                <w:color w:val="000000"/>
-                <w:sz w:val="22"/>
-              </w:rPr>
-              <w:t>All input data are validated on the server, SQL queries are parameterised, and security HTTP headers are set</w:t>
+            <w:tcW w:type="dxa" w:w="1077"/>
+          </w:tcPr>
+          <w:p>
+            <w:pPr>
+              <w:keepNext/>
+              <w:spacing w:line="240" w:lineRule="auto" w:before="0" w:after="0"/>
+              <w:ind w:firstLine="0"/>
+              <w:jc w:val="left"/>
+            </w:pPr>
+            <w:r>
+              <w:rPr>
+                <w:rFonts w:ascii="Times New Roman" w:hAnsi="Times New Roman" w:cs="Times New Roman" w:eastAsia="Times New Roman"/>
+                <w:b w:val="0"/>
+                <w:color w:val="000000"/>
+                <w:sz w:val="22"/>
+              </w:rPr>
+              <w:t>NFR-10</w:t>
+            </w:r>
+          </w:p>
+        </w:tc>
+        <w:tc>
+          <w:tcPr>
+            <w:tcW w:type="dxa" w:w="2381"/>
+          </w:tcPr>
+          <w:p>
+            <w:pPr>
+              <w:keepNext/>
+              <w:spacing w:line="240" w:lineRule="auto" w:before="0" w:after="0"/>
+              <w:ind w:firstLine="0"/>
+              <w:jc w:val="left"/>
+            </w:pPr>
+            <w:r>
+              <w:rPr>
+                <w:rFonts w:ascii="Times New Roman" w:hAnsi="Times New Roman" w:cs="Times New Roman" w:eastAsia="Times New Roman"/>
+                <w:b w:val="0"/>
+                <w:color w:val="000000"/>
+                <w:sz w:val="22"/>
+              </w:rPr>
+              <w:t>The platform works on the devices of the target users</w:t>
+            </w:r>
+          </w:p>
+        </w:tc>
+        <w:tc>
+          <w:tcPr>
+            <w:tcW w:type="dxa" w:w="2154"/>
+          </w:tcPr>
+          <w:p>
+            <w:pPr>
+              <w:keepNext/>
+              <w:spacing w:line="240" w:lineRule="auto" w:before="0" w:after="0"/>
+              <w:ind w:firstLine="0"/>
+              <w:jc w:val="left"/>
+            </w:pPr>
+            <w:r>
+              <w:rPr>
+                <w:rFonts w:ascii="Times New Roman" w:hAnsi="Times New Roman" w:cs="Times New Roman" w:eastAsia="Times New Roman"/>
+                <w:b w:val="0"/>
+                <w:color w:val="000000"/>
+                <w:sz w:val="22"/>
+              </w:rPr>
+              <w:t>Flexibility (adaptability)</w:t>
+            </w:r>
+          </w:p>
+        </w:tc>
+        <w:tc>
+          <w:tcPr>
+            <w:tcW w:type="dxa" w:w="4592"/>
+          </w:tcPr>
+          <w:p>
+            <w:pPr>
+              <w:keepNext/>
+              <w:spacing w:line="240" w:lineRule="auto" w:before="0" w:after="0"/>
+              <w:ind w:firstLine="0"/>
+              <w:jc w:val="left"/>
+            </w:pPr>
+            <w:r>
+              <w:rPr>
+                <w:rFonts w:ascii="Times New Roman" w:hAnsi="Times New Roman" w:cs="Times New Roman" w:eastAsia="Times New Roman"/>
+                <w:b w:val="0"/>
+                <w:color w:val="000000"/>
+                <w:sz w:val="22"/>
+              </w:rPr>
+              <w:t>The flows F1–F3 run without errors in the last two versions of Chrome, Firefox, Safari and Edge and on screens from 360 pixels wide, without horizontal scrolling</w:t>
             </w:r>
           </w:p>
         </w:tc>
@@ -20218,138 +20286,89 @@
         </w:trPr>
         <w:tc>
           <w:tcPr>
-            <w:tcW w:type="dxa" w:w="1020"/>
-          </w:tcPr>
-          <w:p>
-            <w:pPr>
-              <w:keepNext/>
-              <w:spacing w:line="240" w:lineRule="auto" w:before="0" w:after="0"/>
-              <w:ind w:firstLine="0"/>
-              <w:jc w:val="left"/>
-            </w:pPr>
-            <w:r>
-              <w:rPr>
-                <w:rFonts w:ascii="Times New Roman" w:hAnsi="Times New Roman" w:cs="Times New Roman" w:eastAsia="Times New Roman"/>
-                <w:b w:val="0"/>
-                <w:color w:val="000000"/>
-                <w:sz w:val="22"/>
-              </w:rPr>
-              <w:t>NFR-14</w:t>
-            </w:r>
-          </w:p>
-        </w:tc>
-        <w:tc>
-          <w:tcPr>
-            <w:tcW w:type="dxa" w:w="1701"/>
-          </w:tcPr>
-          <w:p>
-            <w:pPr>
-              <w:keepNext/>
-              <w:spacing w:line="240" w:lineRule="auto" w:before="0" w:after="0"/>
-              <w:ind w:firstLine="0"/>
-              <w:jc w:val="left"/>
-            </w:pPr>
-            <w:r>
-              <w:rPr>
-                <w:rFonts w:ascii="Times New Roman" w:hAnsi="Times New Roman" w:cs="Times New Roman" w:eastAsia="Times New Roman"/>
-                <w:b w:val="0"/>
-                <w:color w:val="000000"/>
-                <w:sz w:val="22"/>
-              </w:rPr>
-              <w:t>Transport</w:t>
-            </w:r>
-          </w:p>
-        </w:tc>
-        <w:tc>
-          <w:tcPr>
-            <w:tcW w:type="dxa" w:w="7483"/>
-          </w:tcPr>
-          <w:p>
-            <w:pPr>
-              <w:keepNext/>
-              <w:spacing w:line="240" w:lineRule="auto" w:before="0" w:after="0"/>
-              <w:ind w:firstLine="0"/>
-              <w:jc w:val="left"/>
-            </w:pPr>
-            <w:r>
-              <w:rPr>
-                <w:rFonts w:ascii="Times New Roman" w:hAnsi="Times New Roman" w:cs="Times New Roman" w:eastAsia="Times New Roman"/>
-                <w:b w:val="0"/>
-                <w:color w:val="000000"/>
-                <w:sz w:val="22"/>
-              </w:rPr>
-              <w:t>All communication between the browser, the server and the external services uses HTTPS</w:t>
-            </w:r>
-          </w:p>
-        </w:tc>
-      </w:tr>
-      <w:tr>
-        <w:trPr>
-          <w:cantSplit w:val="true"/>
-        </w:trPr>
-        <w:tc>
-          <w:tcPr>
-            <w:tcW w:type="dxa" w:w="1020"/>
-          </w:tcPr>
-          <w:p>
-            <w:pPr>
-              <w:keepNext/>
-              <w:spacing w:line="240" w:lineRule="auto" w:before="0" w:after="0"/>
-              <w:ind w:firstLine="0"/>
-              <w:jc w:val="left"/>
-            </w:pPr>
-            <w:r>
-              <w:rPr>
-                <w:rFonts w:ascii="Times New Roman" w:hAnsi="Times New Roman" w:cs="Times New Roman" w:eastAsia="Times New Roman"/>
-                <w:b w:val="0"/>
-                <w:color w:val="000000"/>
-                <w:sz w:val="22"/>
-              </w:rPr>
-              <w:t>NFR-15</w:t>
-            </w:r>
-          </w:p>
-        </w:tc>
-        <w:tc>
-          <w:tcPr>
-            <w:tcW w:type="dxa" w:w="1701"/>
-          </w:tcPr>
-          <w:p>
-            <w:pPr>
-              <w:keepNext/>
-              <w:spacing w:line="240" w:lineRule="auto" w:before="0" w:after="0"/>
-              <w:ind w:firstLine="0"/>
-              <w:jc w:val="left"/>
-            </w:pPr>
-            <w:r>
-              <w:rPr>
-                <w:rFonts w:ascii="Times New Roman" w:hAnsi="Times New Roman" w:cs="Times New Roman" w:eastAsia="Times New Roman"/>
-                <w:b w:val="0"/>
-                <w:color w:val="000000"/>
-                <w:sz w:val="22"/>
-              </w:rPr>
-              <w:t>Personal data</w:t>
-            </w:r>
-          </w:p>
-        </w:tc>
-        <w:tc>
-          <w:tcPr>
-            <w:tcW w:type="dxa" w:w="7483"/>
-          </w:tcPr>
-          <w:p>
-            <w:pPr>
-              <w:keepNext/>
-              <w:spacing w:line="240" w:lineRule="auto" w:before="0" w:after="0"/>
-              <w:ind w:firstLine="0"/>
-              <w:jc w:val="left"/>
-            </w:pPr>
-            <w:r>
-              <w:rPr>
-                <w:rFonts w:ascii="Times New Roman" w:hAnsi="Times New Roman" w:cs="Times New Roman" w:eastAsia="Times New Roman"/>
-                <w:b w:val="0"/>
-                <w:color w:val="000000"/>
-                <w:sz w:val="22"/>
-              </w:rPr>
-              <w:t>Only the data needed for trading are collected (name, e-mail, phone, region), in line with Law No. 195/2024 [19]</w:t>
+            <w:tcW w:type="dxa" w:w="1077"/>
+          </w:tcPr>
+          <w:p>
+            <w:pPr>
+              <w:keepNext/>
+              <w:spacing w:line="240" w:lineRule="auto" w:before="0" w:after="0"/>
+              <w:ind w:firstLine="0"/>
+              <w:jc w:val="left"/>
+            </w:pPr>
+            <w:r>
+              <w:rPr>
+                <w:rFonts w:ascii="Times New Roman" w:hAnsi="Times New Roman" w:cs="Times New Roman" w:eastAsia="Times New Roman"/>
+                <w:b w:val="0"/>
+                <w:color w:val="000000"/>
+                <w:sz w:val="22"/>
+              </w:rPr>
+              <w:t>NFR-11</w:t>
+            </w:r>
+          </w:p>
+        </w:tc>
+        <w:tc>
+          <w:tcPr>
+            <w:tcW w:type="dxa" w:w="2381"/>
+          </w:tcPr>
+          <w:p>
+            <w:pPr>
+              <w:keepNext/>
+              <w:spacing w:line="240" w:lineRule="auto" w:before="0" w:after="0"/>
+              <w:ind w:firstLine="0"/>
+              <w:jc w:val="left"/>
+            </w:pPr>
+            <w:r>
+              <w:rPr>
+                <w:rFonts w:ascii="Times New Roman" w:hAnsi="Times New Roman" w:cs="Times New Roman" w:eastAsia="Times New Roman"/>
+                <w:b w:val="0"/>
+                <w:color w:val="000000"/>
+                <w:sz w:val="22"/>
+              </w:rPr>
+              <w:t>Changes can be verified quickly</w:t>
+            </w:r>
+          </w:p>
+        </w:tc>
+        <w:tc>
+          <w:tcPr>
+            <w:tcW w:type="dxa" w:w="2154"/>
+          </w:tcPr>
+          <w:p>
+            <w:pPr>
+              <w:keepNext/>
+              <w:spacing w:line="240" w:lineRule="auto" w:before="0" w:after="0"/>
+              <w:ind w:firstLine="0"/>
+              <w:jc w:val="left"/>
+            </w:pPr>
+            <w:r>
+              <w:rPr>
+                <w:rFonts w:ascii="Times New Roman" w:hAnsi="Times New Roman" w:cs="Times New Roman" w:eastAsia="Times New Roman"/>
+                <w:b w:val="0"/>
+                <w:color w:val="000000"/>
+                <w:sz w:val="22"/>
+              </w:rPr>
+              <w:t>Maintainability (testability)</w:t>
+            </w:r>
+          </w:p>
+        </w:tc>
+        <w:tc>
+          <w:tcPr>
+            <w:tcW w:type="dxa" w:w="4592"/>
+          </w:tcPr>
+          <w:p>
+            <w:pPr>
+              <w:keepNext/>
+              <w:spacing w:line="240" w:lineRule="auto" w:before="0" w:after="0"/>
+              <w:ind w:firstLine="0"/>
+              <w:jc w:val="left"/>
+            </w:pPr>
+            <w:r>
+              <w:rPr>
+                <w:rFonts w:ascii="Times New Roman" w:hAnsi="Times New Roman" w:cs="Times New Roman" w:eastAsia="Times New Roman"/>
+                <w:b w:val="0"/>
+                <w:color w:val="000000"/>
+                <w:sz w:val="22"/>
+              </w:rPr>
+              <w:t>Every mandatory functional requirement is covered by at least one automated test; the 19 API tests run on every push and finish in under 5 minutes</w:t>
             </w:r>
           </w:p>
         </w:tc>
@@ -20371,7 +20390,20 @@
           <w:color w:val="000000"/>
           <w:sz w:val="24"/>
         </w:rPr>
-        <w:t>The system is considered acceptable when all of the following criteria are met:</w:t>
+        <w:t>Six of the nine characteristics of ISO/IEC 25010 are therefore covered by at least one requirement. Functional suitability is covered by the functional requirements and the user stories, while compatibility and safety are not critical for a web platform that does not exchange data with other business systems and cannot cause physical harm.</w:t>
+      </w:r>
+    </w:p>
+    <w:p>
+      <w:pPr>
+        <w:pStyle w:val="BodyText2026"/>
+      </w:pPr>
+      <w:r>
+        <w:rPr>
+          <w:rFonts w:ascii="Times New Roman" w:hAnsi="Times New Roman" w:cs="Times New Roman" w:eastAsia="Times New Roman"/>
+          <w:color w:val="000000"/>
+          <w:sz w:val="24"/>
+        </w:rPr>
+        <w:t>Taken together with the functional requirements, these criteria define when the system is acceptable:</w:t>
       </w:r>
     </w:p>
     <w:p>
@@ -20443,7 +20475,7 @@
           <w:color w:val="000000"/>
           <w:sz w:val="24"/>
         </w:rPr>
-        <w:t>the measurable non-functional requirements are verified and their results reported in Chapter 3.</w:t>
+        <w:t>the acceptance criteria of NFR-01 to NFR-11 are verified and their results reported in Chapter 3.</w:t>
       </w:r>
     </w:p>
     <w:p>
@@ -20456,7 +20488,7 @@
           <w:color w:val="000000"/>
           <w:sz w:val="24"/>
         </w:rPr>
-        <w:t>With these criteria the specification is complete. It translates the findings of the field analysis into 22 functional and 15 non-functional requirements, all traceable to use cases and tests, and it is the starting point for the UML modelling of the system in Chapter 2.</w:t>
+        <w:t>With these criteria the specification is complete. It translates the findings of the field analysis into 22 functional and 11 non-functional requirements, all traceable to use cases and tests, and it is the starting point for the UML modelling of the system in Chapter 2.</w:t>
       </w:r>
     </w:p>
     <w:p>
@@ -20981,6 +21013,26 @@
           <w:sz w:val="24"/>
         </w:rPr>
         <w:t>[21]</w:t>
+        <w:tab/>
+        <w:t>ISO/IEC 25010:2023, Systems and software engineering – Systems and software Quality Requirements and Evaluation (SQuaRE) – Product quality model. Geneva, Switzerland: ISO, 2023.</w:t>
+      </w:r>
+    </w:p>
+    <w:p>
+      <w:pPr>
+        <w:tabs>
+          <w:tab w:pos="567" w:val="left"/>
+        </w:tabs>
+        <w:spacing w:after="60"/>
+        <w:ind w:left="567" w:hanging="567"/>
+        <w:jc w:val="left"/>
+      </w:pPr>
+      <w:r>
+        <w:rPr>
+          <w:rFonts w:ascii="Times New Roman" w:hAnsi="Times New Roman" w:cs="Times New Roman" w:eastAsia="Times New Roman"/>
+          <w:color w:val="000000"/>
+          <w:sz w:val="24"/>
+        </w:rPr>
+        <w:t>[22]</w:t>
         <w:tab/>
         <w:t>OWASP Foundation, "OWASP Top 10:2021 – The ten most critical web application security risks." [Online]. Available: https://owasp.org/Top10/ (accessed Oct. 12, 2026).</w:t>
       </w:r>

</xml_diff>